<commit_message>
Refresh Chapter 0 clinical framework figure
</commit_message>
<xml_diff>
--- a/public/chapter-0/Chapter0_Introduction_ROP_pret_a_publier.docx
+++ b/public/chapter-0/Chapter0_Introduction_ROP_pret_a_publier.docx
@@ -108,21 +108,7 @@
         <w:rPr>
           <w:lang w:val="fr-FR"/>
         </w:rPr>
-        <w:t xml:space="preserve">Une lecture simple des relations </w:t>
-      </w:r>
-      <w:proofErr w:type="spellStart"/>
-      <w:r>
-        <w:rPr>
-          <w:lang w:val="fr-FR"/>
-        </w:rPr>
-        <w:t>viscéro</w:t>
-      </w:r>
-      <w:proofErr w:type="spellEnd"/>
-      <w:r>
-        <w:rPr>
-          <w:lang w:val="fr-FR"/>
-        </w:rPr>
-        <w:t>-somatiques : comment un viscère peut influencer le système locomoteur et, inversement, comment une contrainte somatique peut retentir sur la fonction viscérale.</w:t>
+        <w:t>Une lecture simple des relations viscéro-somatiques : comment un viscère peut influencer le système locomoteur et, inversement, comment une contrainte somatique peut retentir sur la fonction viscérale.</w:t>
       </w:r>
     </w:p>
     <w:p>
@@ -317,21 +303,7 @@
         <w:rPr>
           <w:lang w:val="fr-FR"/>
         </w:rPr>
-        <w:t xml:space="preserve">Le premier niveau concerne le système nerveux central. Il rassemble les structures qui participent à l’intégration des informations sensorielles et viscérales, à l’organisation des réponses adaptatives, à la modulation de la douleur, aux réponses émotionnelles, aux fonctions </w:t>
-      </w:r>
-      <w:proofErr w:type="spellStart"/>
-      <w:r>
-        <w:rPr>
-          <w:lang w:val="fr-FR"/>
-        </w:rPr>
-        <w:t>neuro-endocrines</w:t>
-      </w:r>
-      <w:proofErr w:type="spellEnd"/>
-      <w:r>
-        <w:rPr>
-          <w:lang w:val="fr-FR"/>
-        </w:rPr>
-        <w:t>, à la vigilance, au sommeil, à la récupération et à la coordination des réponses autonomes.</w:t>
+        <w:t>Le premier niveau concerne le système nerveux central. Il rassemble les structures qui participent à l’intégration des informations sensorielles et viscérales, à l’organisation des réponses adaptatives, à la modulation de la douleur, aux réponses émotionnelles, aux fonctions neuro-endocrines, à la vigilance, au sommeil, à la récupération et à la coordination des réponses autonomes.</w:t>
       </w:r>
     </w:p>
     <w:p>
@@ -340,13 +312,8 @@
         <w:spacing w:after="40"/>
       </w:pPr>
       <w:r>
-        <w:t xml:space="preserve">Tronc </w:t>
-      </w:r>
-      <w:proofErr w:type="spellStart"/>
-      <w:r>
-        <w:t>cérébral</w:t>
-      </w:r>
-      <w:proofErr w:type="spellEnd"/>
+        <w:t>Tronc cérébral</w:t>
+      </w:r>
     </w:p>
     <w:p>
       <w:pPr>
@@ -447,19 +414,9 @@
         <w:pStyle w:val="ListBullet"/>
         <w:spacing w:after="40"/>
       </w:pPr>
-      <w:proofErr w:type="spellStart"/>
-      <w:r>
-        <w:t>Voies</w:t>
-      </w:r>
-      <w:proofErr w:type="spellEnd"/>
-      <w:r>
-        <w:t xml:space="preserve"> </w:t>
-      </w:r>
-      <w:proofErr w:type="spellStart"/>
-      <w:r>
-        <w:t>sympathiques</w:t>
-      </w:r>
-      <w:proofErr w:type="spellEnd"/>
+      <w:r>
+        <w:t>Voies sympathiques</w:t>
+      </w:r>
     </w:p>
     <w:p>
       <w:pPr>
@@ -578,27 +535,9 @@
         <w:pStyle w:val="ListBullet"/>
         <w:spacing w:after="40"/>
       </w:pPr>
-      <w:proofErr w:type="spellStart"/>
-      <w:r>
-        <w:t>Cavités</w:t>
-      </w:r>
-      <w:proofErr w:type="spellEnd"/>
-      <w:r>
-        <w:t xml:space="preserve"> </w:t>
-      </w:r>
-      <w:proofErr w:type="spellStart"/>
-      <w:r>
-        <w:t>abdominale</w:t>
-      </w:r>
-      <w:proofErr w:type="spellEnd"/>
-      <w:r>
-        <w:t xml:space="preserve"> et </w:t>
-      </w:r>
-      <w:proofErr w:type="spellStart"/>
-      <w:r>
-        <w:t>pelvienne</w:t>
-      </w:r>
-      <w:proofErr w:type="spellEnd"/>
+      <w:r>
+        <w:t>Cavités abdominale et pelvienne</w:t>
+      </w:r>
     </w:p>
     <w:p>
       <w:pPr>
@@ -709,19 +648,9 @@
         <w:pStyle w:val="ListBullet"/>
         <w:spacing w:after="40"/>
       </w:pPr>
-      <w:proofErr w:type="spellStart"/>
-      <w:r>
-        <w:t>Estomac</w:t>
-      </w:r>
-      <w:proofErr w:type="spellEnd"/>
-      <w:r>
-        <w:t xml:space="preserve"> et </w:t>
-      </w:r>
-      <w:proofErr w:type="spellStart"/>
-      <w:r>
-        <w:t>duodénum</w:t>
-      </w:r>
-      <w:proofErr w:type="spellEnd"/>
+      <w:r>
+        <w:t>Estomac et duodénum</w:t>
+      </w:r>
     </w:p>
     <w:p>
       <w:pPr>
@@ -808,10 +737,10 @@
           <w:noProof/>
         </w:rPr>
         <w:drawing>
-          <wp:inline distT="0" distB="0" distL="0" distR="0" wp14:anchorId="6B28BA0D" wp14:editId="743CCB61">
+          <wp:inline distT="0" distB="0" distL="0" distR="0" wp14:anchorId="22C58F26" wp14:editId="5838DE80">
             <wp:extent cx="6332220" cy="3562985"/>
             <wp:effectExtent l="0" t="0" r="0" b="0"/>
-            <wp:docPr id="1898633670" name="Picture 1"/>
+            <wp:docPr id="463086105" name="Picture 1"/>
             <wp:cNvGraphicFramePr>
               <a:graphicFrameLocks xmlns:a="http://schemas.openxmlformats.org/drawingml/2006/main" noChangeAspect="1"/>
             </wp:cNvGraphicFramePr>
@@ -892,6 +821,13 @@
         </w:rPr>
       </w:pPr>
     </w:p>
+    <w:p>
+      <w:pPr>
+        <w:rPr>
+          <w:lang w:val="fr-FR"/>
+        </w:rPr>
+      </w:pPr>
+    </w:p>
     <w:tbl>
       <w:tblPr>
         <w:tblW w:w="0" w:type="auto"/>
@@ -930,7 +866,6 @@
                 <w:sz w:val="22"/>
                 <w:lang w:val="fr-FR"/>
               </w:rPr>
-              <w:lastRenderedPageBreak/>
               <w:t>Comprendre la régulation centrale, suivre les voies neuro-végétatives, examiner les interfaces régionales, puis cibler l’expression viscérale ou fonctionnelle du trouble.</w:t>
             </w:r>
           </w:p>
@@ -966,29 +901,8 @@
         </w:rPr>
         <w:t xml:space="preserve">Les quatre niveaux ne constituent pas quatre étapes obligatoires à appliquer de manière identique à tous les patients. </w:t>
       </w:r>
-      <w:proofErr w:type="spellStart"/>
-      <w:r>
-        <w:t>Ils</w:t>
-      </w:r>
-      <w:proofErr w:type="spellEnd"/>
-      <w:r>
-        <w:t xml:space="preserve"> </w:t>
-      </w:r>
-      <w:proofErr w:type="spellStart"/>
-      <w:r>
-        <w:t>organisent</w:t>
-      </w:r>
-      <w:proofErr w:type="spellEnd"/>
-      <w:r>
-        <w:t xml:space="preserve"> le </w:t>
-      </w:r>
-      <w:proofErr w:type="spellStart"/>
-      <w:r>
-        <w:t>raisonnement</w:t>
-      </w:r>
-      <w:proofErr w:type="spellEnd"/>
-      <w:r>
-        <w:t xml:space="preserve"> clinique :</w:t>
+      <w:r>
+        <w:t>Ils organisent le raisonnement clinique :</w:t>
       </w:r>
     </w:p>
     <w:p>
@@ -1090,21 +1004,7 @@
         <w:rPr>
           <w:lang w:val="fr-FR"/>
         </w:rPr>
-        <w:t xml:space="preserve">Les chapitres consacrés au mécanisme du stress et à la théorie </w:t>
-      </w:r>
-      <w:proofErr w:type="spellStart"/>
-      <w:r>
-        <w:rPr>
-          <w:lang w:val="fr-FR"/>
-        </w:rPr>
-        <w:t>polyvagale</w:t>
-      </w:r>
-      <w:proofErr w:type="spellEnd"/>
-      <w:r>
-        <w:rPr>
-          <w:lang w:val="fr-FR"/>
-        </w:rPr>
-        <w:t xml:space="preserve"> ne constituent pas un cinquième niveau clinique. Ils expliquent comment les quatre niveaux interagissent dans le temps.</w:t>
+        <w:t>Les chapitres consacrés au mécanisme du stress et à la théorie polyvagale ne constituent pas un cinquième niveau clinique. Ils expliquent comment les quatre niveaux interagissent dans le temps.</w:t>
       </w:r>
     </w:p>
     <w:p>
@@ -1125,16 +1025,9 @@
         <w:pStyle w:val="ListBullet"/>
         <w:spacing w:after="40"/>
       </w:pPr>
-      <w:proofErr w:type="spellStart"/>
-      <w:proofErr w:type="gramStart"/>
-      <w:r>
-        <w:t>persiste</w:t>
-      </w:r>
-      <w:proofErr w:type="spellEnd"/>
-      <w:r>
-        <w:t xml:space="preserve"> ;</w:t>
-      </w:r>
-      <w:proofErr w:type="gramEnd"/>
+      <w:r>
+        <w:t>persiste ;</w:t>
+      </w:r>
     </w:p>
     <w:p>
       <w:pPr>
@@ -1171,19 +1064,11 @@
           <w:lang w:val="fr-FR"/>
         </w:rPr>
       </w:pPr>
-      <w:proofErr w:type="gramStart"/>
-      <w:r>
-        <w:rPr>
-          <w:lang w:val="fr-FR"/>
-        </w:rPr>
-        <w:t>dépasse</w:t>
-      </w:r>
-      <w:proofErr w:type="gramEnd"/>
-      <w:r>
-        <w:rPr>
-          <w:lang w:val="fr-FR"/>
-        </w:rPr>
-        <w:t xml:space="preserve"> les capacités de récupération du patient.</w:t>
+      <w:r>
+        <w:rPr>
+          <w:lang w:val="fr-FR"/>
+        </w:rPr>
+        <w:t>dépasse les capacités de récupération du patient.</w:t>
       </w:r>
     </w:p>
     <w:p>
@@ -1209,21 +1094,7 @@
         <w:rPr>
           <w:lang w:val="fr-FR"/>
         </w:rPr>
-        <w:t xml:space="preserve">Le chapitre consacré à la théorie </w:t>
-      </w:r>
-      <w:proofErr w:type="spellStart"/>
-      <w:r>
-        <w:rPr>
-          <w:lang w:val="fr-FR"/>
-        </w:rPr>
-        <w:t>polyvagale</w:t>
-      </w:r>
-      <w:proofErr w:type="spellEnd"/>
-      <w:r>
-        <w:rPr>
-          <w:lang w:val="fr-FR"/>
-        </w:rPr>
-        <w:t xml:space="preserve"> propose une lecture complémentaire des états autonomes et des réponses de mobilisation, de protection ou d’engagement relationnel. Ces chapitres décrivent donc la dynamique qui relie les centres de régulation, les voies autonomes, les tensions régionales et les manifestations viscérales.</w:t>
+        <w:t>Le chapitre consacré à la théorie polyvagale propose une lecture complémentaire des états autonomes et des réponses de mobilisation, de protection ou d’engagement relationnel. Ces chapitres décrivent donc la dynamique qui relie les centres de régulation, les voies autonomes, les tensions régionales et les manifestations viscérales.</w:t>
       </w:r>
     </w:p>
     <w:tbl>
@@ -1289,7 +1160,6 @@
         <w:rPr>
           <w:lang w:val="fr-FR"/>
         </w:rPr>
-        <w:lastRenderedPageBreak/>
         <w:t>Comment lire l’organisation du livre</w:t>
       </w:r>
     </w:p>
@@ -1371,21 +1241,7 @@
         <w:rPr>
           <w:lang w:val="fr-FR"/>
         </w:rPr>
-        <w:t xml:space="preserve">Les chapitres sur le stress et la théorie </w:t>
-      </w:r>
-      <w:proofErr w:type="spellStart"/>
-      <w:r>
-        <w:rPr>
-          <w:lang w:val="fr-FR"/>
-        </w:rPr>
-        <w:t>polyvagale</w:t>
-      </w:r>
-      <w:proofErr w:type="spellEnd"/>
-      <w:r>
-        <w:rPr>
-          <w:lang w:val="fr-FR"/>
-        </w:rPr>
-        <w:t xml:space="preserve"> expliquent les mécanismes dynamiques qui relient les quatre niveaux.</w:t>
+        <w:t>Les chapitres sur le stress et la théorie polyvagale expliquent les mécanismes dynamiques qui relient les quatre niveaux.</w:t>
       </w:r>
     </w:p>
     <w:p>
@@ -1543,23 +1399,7 @@
         <w:t xml:space="preserve">L’observation clinique ne possède pas, à elle seule, la rigueur d’un protocole expérimental. </w:t>
       </w:r>
       <w:r>
-        <w:t xml:space="preserve">Elle conserve </w:t>
-      </w:r>
-      <w:proofErr w:type="spellStart"/>
-      <w:r>
-        <w:t>néanmoins</w:t>
-      </w:r>
-      <w:proofErr w:type="spellEnd"/>
-      <w:r>
-        <w:t xml:space="preserve"> </w:t>
-      </w:r>
-      <w:proofErr w:type="spellStart"/>
-      <w:r>
-        <w:t>une</w:t>
-      </w:r>
-      <w:proofErr w:type="spellEnd"/>
-      <w:r>
-        <w:t xml:space="preserve"> valeur lorsqu’elle est :</w:t>
+        <w:t>Elle conserve néanmoins une valeur lorsqu’elle est :</w:t>
       </w:r>
     </w:p>
     <w:p>
@@ -1588,19 +1428,11 @@
           <w:lang w:val="fr-FR"/>
         </w:rPr>
       </w:pPr>
-      <w:proofErr w:type="gramStart"/>
-      <w:r>
-        <w:rPr>
-          <w:lang w:val="fr-FR"/>
-        </w:rPr>
-        <w:t>confrontée</w:t>
-      </w:r>
-      <w:proofErr w:type="gramEnd"/>
-      <w:r>
-        <w:rPr>
-          <w:lang w:val="fr-FR"/>
-        </w:rPr>
-        <w:t xml:space="preserve"> à l’évolution réelle du patient ;</w:t>
+      <w:r>
+        <w:rPr>
+          <w:lang w:val="fr-FR"/>
+        </w:rPr>
+        <w:t>confrontée à l’évolution réelle du patient ;</w:t>
       </w:r>
     </w:p>
     <w:p>
@@ -1611,19 +1443,12 @@
           <w:lang w:val="fr-FR"/>
         </w:rPr>
       </w:pPr>
-      <w:proofErr w:type="gramStart"/>
-      <w:r>
-        <w:rPr>
-          <w:lang w:val="fr-FR"/>
-        </w:rPr>
-        <w:t>mise</w:t>
-      </w:r>
-      <w:proofErr w:type="gramEnd"/>
-      <w:r>
-        <w:rPr>
-          <w:lang w:val="fr-FR"/>
-        </w:rPr>
-        <w:t xml:space="preserve"> en relation avec les données médicales disponibles ;</w:t>
+      <w:r>
+        <w:rPr>
+          <w:lang w:val="fr-FR"/>
+        </w:rPr>
+        <w:lastRenderedPageBreak/>
+        <w:t>mise en relation avec les données médicales disponibles ;</w:t>
       </w:r>
     </w:p>
     <w:p>
@@ -1631,26 +1456,20 @@
         <w:pStyle w:val="ListBullet"/>
         <w:spacing w:after="40"/>
       </w:pPr>
-      <w:proofErr w:type="spellStart"/>
-      <w:r>
-        <w:t>réévaluée</w:t>
-      </w:r>
-      <w:proofErr w:type="spellEnd"/>
-      <w:r>
-        <w:t xml:space="preserve"> dans le temps.</w:t>
-      </w:r>
-    </w:p>
-    <w:p>
-      <w:pPr>
-        <w:rPr>
-          <w:lang w:val="fr-FR"/>
-        </w:rPr>
-      </w:pPr>
-      <w:r>
-        <w:rPr>
-          <w:lang w:val="fr-FR"/>
-        </w:rPr>
-        <w:lastRenderedPageBreak/>
+      <w:r>
+        <w:t>réévaluée dans le temps.</w:t>
+      </w:r>
+    </w:p>
+    <w:p>
+      <w:pPr>
+        <w:rPr>
+          <w:lang w:val="fr-FR"/>
+        </w:rPr>
+      </w:pPr>
+      <w:r>
+        <w:rPr>
+          <w:lang w:val="fr-FR"/>
+        </w:rPr>
         <w:t>Ce livre privilégie donc quatre exigences :</w:t>
       </w:r>
     </w:p>
@@ -1660,26 +1479,8 @@
         <w:spacing w:after="40"/>
       </w:pPr>
       <w:r>
-        <w:t xml:space="preserve">la </w:t>
-      </w:r>
-      <w:proofErr w:type="spellStart"/>
-      <w:r>
-        <w:t>cohérence</w:t>
-      </w:r>
-      <w:proofErr w:type="spellEnd"/>
-      <w:r>
-        <w:t xml:space="preserve"> </w:t>
-      </w:r>
-      <w:proofErr w:type="spellStart"/>
-      <w:proofErr w:type="gramStart"/>
-      <w:r>
-        <w:t>anatomique</w:t>
-      </w:r>
-      <w:proofErr w:type="spellEnd"/>
-      <w:r>
-        <w:t xml:space="preserve"> ;</w:t>
-      </w:r>
-      <w:proofErr w:type="gramEnd"/>
+        <w:t>la cohérence anatomique ;</w:t>
+      </w:r>
     </w:p>
     <w:p>
       <w:pPr>
@@ -1698,19 +1499,11 @@
           <w:lang w:val="fr-FR"/>
         </w:rPr>
       </w:pPr>
-      <w:proofErr w:type="gramStart"/>
-      <w:r>
-        <w:rPr>
-          <w:lang w:val="fr-FR"/>
-        </w:rPr>
-        <w:t>la</w:t>
-      </w:r>
-      <w:proofErr w:type="gramEnd"/>
-      <w:r>
-        <w:rPr>
-          <w:lang w:val="fr-FR"/>
-        </w:rPr>
-        <w:t xml:space="preserve"> confrontation au réel par l’anamnèse, l’imagerie et les données médicales ou chirurgicales ;</w:t>
+      <w:r>
+        <w:rPr>
+          <w:lang w:val="fr-FR"/>
+        </w:rPr>
+        <w:t>la confrontation au réel par l’anamnèse, l’imagerie et les données médicales ou chirurgicales ;</w:t>
       </w:r>
     </w:p>
     <w:p>
@@ -1721,19 +1514,11 @@
           <w:lang w:val="fr-FR"/>
         </w:rPr>
       </w:pPr>
-      <w:proofErr w:type="gramStart"/>
-      <w:r>
-        <w:rPr>
-          <w:lang w:val="fr-FR"/>
-        </w:rPr>
-        <w:t>la</w:t>
-      </w:r>
-      <w:proofErr w:type="gramEnd"/>
-      <w:r>
-        <w:rPr>
-          <w:lang w:val="fr-FR"/>
-        </w:rPr>
-        <w:t xml:space="preserve"> documentation structurée de la pratique et de l’évolution du patient.</w:t>
+      <w:r>
+        <w:rPr>
+          <w:lang w:val="fr-FR"/>
+        </w:rPr>
+        <w:t>la documentation structurée de la pratique et de l’évolution du patient.</w:t>
       </w:r>
     </w:p>
     <w:tbl>
@@ -1766,7 +1551,6 @@
                 <w:lang w:val="fr-FR"/>
               </w:rPr>
             </w:pPr>
-            <w:proofErr w:type="spellStart"/>
             <w:r>
               <w:rPr>
                 <w:b/>
@@ -1774,17 +1558,7 @@
                 <w:sz w:val="23"/>
                 <w:lang w:val="fr-FR"/>
               </w:rPr>
-              <w:t>SuiviPatient</w:t>
-            </w:r>
-            <w:proofErr w:type="spellEnd"/>
-            <w:r>
-              <w:rPr>
-                <w:b/>
-                <w:color w:val="C6922E"/>
-                <w:sz w:val="23"/>
-                <w:lang w:val="fr-FR"/>
-              </w:rPr>
-              <w:t xml:space="preserve"> — De l’observation clinique à une communauté de données</w:t>
+              <w:t>SuiviPatient — De l’observation clinique à une communauté de données</w:t>
             </w:r>
             <w:r>
               <w:rPr>
@@ -1799,21 +1573,7 @@
               <w:rPr>
                 <w:lang w:val="fr-FR"/>
               </w:rPr>
-              <w:t xml:space="preserve">Pour prolonger cette exigence au-delà du livre, nous mettons gratuitement à disposition des praticiens certifiés ROP l’application </w:t>
-            </w:r>
-            <w:proofErr w:type="spellStart"/>
-            <w:r>
-              <w:rPr>
-                <w:lang w:val="fr-FR"/>
-              </w:rPr>
-              <w:t>SuiviPatient</w:t>
-            </w:r>
-            <w:proofErr w:type="spellEnd"/>
-            <w:r>
-              <w:rPr>
-                <w:lang w:val="fr-FR"/>
-              </w:rPr>
-              <w:t>. Cet outil permet de documenter de manière structurée le motif principal de consultation, les éléments de l’anamnèse, les niveaux et zones travaillés, le protocole réellement suivi, les réactions observées pendant et après la séance, ainsi que l’évolution de la douleur, du sommeil, de la fatigue, du transit, de la mobilité ou des capacités fonctionnelles.</w:t>
+              <w:t>Pour prolonger cette exigence au-delà du livre, nous mettons gratuitement à disposition des praticiens certifiés ROP l’application SuiviPatient. Cet outil permet de documenter de manière structurée le motif principal de consultation, les éléments de l’anamnèse, les niveaux et zones travaillés, le protocole réellement suivi, les réactions observées pendant et après la séance, ainsi que l’évolution de la douleur, du sommeil, de la fatigue, du transit, de la mobilité ou des capacités fonctionnelles.</w:t>
             </w:r>
             <w:r>
               <w:rPr>
@@ -1826,21 +1586,7 @@
                 <w:lang w:val="fr-FR"/>
               </w:rPr>
               <w:br/>
-              <w:t xml:space="preserve">L’objectif n’est pas de transformer chaque séance en protocole expérimental ni de tirer des conclusions causales à partir de simples observations. Il est de rendre la pratique plus traçable, plus comparable et plus facilement réévaluable. Grâce à </w:t>
-            </w:r>
-            <w:proofErr w:type="spellStart"/>
-            <w:r>
-              <w:rPr>
-                <w:lang w:val="fr-FR"/>
-              </w:rPr>
-              <w:t>SuiviPatient</w:t>
-            </w:r>
-            <w:proofErr w:type="spellEnd"/>
-            <w:r>
-              <w:rPr>
-                <w:lang w:val="fr-FR"/>
-              </w:rPr>
-              <w:t>, chaque praticien enrichit sa propre expérience et contribue à une dynamique collective : mieux identifier les protocoles pertinents, les adaptations nécessaires, les réponses immédiates ou différées, les facteurs associés à la récupération et les limites de la méthode.</w:t>
+              <w:t>L’objectif n’est pas de transformer chaque séance en protocole expérimental ni de tirer des conclusions causales à partir de simples observations. Il est de rendre la pratique plus traçable, plus comparable et plus facilement réévaluable. Grâce à SuiviPatient, chaque praticien enrichit sa propre expérience et contribue à une dynamique collective : mieux identifier les protocoles pertinents, les adaptations nécessaires, les réponses immédiates ou différées, les facteurs associés à la récupération et les limites de la méthode.</w:t>
             </w:r>
             <w:r>
               <w:rPr>
@@ -1853,21 +1599,7 @@
                 <w:lang w:val="fr-FR"/>
               </w:rPr>
               <w:br/>
-              <w:t xml:space="preserve">Cette démarche respecte le consentement du patient, la confidentialité des informations et les règles applicables à la protection des données. Les lecteurs qui souhaitent se former, être certifiés ROP, rejoindre la communauté des praticiens ou utiliser gratuitement </w:t>
-            </w:r>
-            <w:proofErr w:type="spellStart"/>
-            <w:r>
-              <w:rPr>
-                <w:lang w:val="fr-FR"/>
-              </w:rPr>
-              <w:t>SuiviPatient</w:t>
-            </w:r>
-            <w:proofErr w:type="spellEnd"/>
-            <w:r>
-              <w:rPr>
-                <w:lang w:val="fr-FR"/>
-              </w:rPr>
-              <w:t xml:space="preserve"> dans leur pratique sont invités à nous contacter.</w:t>
+              <w:t>Cette démarche respecte le consentement du patient, la confidentialité des informations et les règles applicables à la protection des données. Les lecteurs qui souhaitent se former, être certifiés ROP, rejoindre la communauté des praticiens ou utiliser gratuitement SuiviPatient dans leur pratique sont invités à nous contacter.</w:t>
             </w:r>
             <w:r>
               <w:rPr>
@@ -2038,19 +1770,11 @@
           <w:lang w:val="fr-FR"/>
         </w:rPr>
       </w:pPr>
-      <w:proofErr w:type="gramStart"/>
-      <w:r>
-        <w:rPr>
-          <w:lang w:val="fr-FR"/>
-        </w:rPr>
-        <w:t>dorsalement</w:t>
-      </w:r>
-      <w:proofErr w:type="gramEnd"/>
-      <w:r>
-        <w:rPr>
-          <w:lang w:val="fr-FR"/>
-        </w:rPr>
-        <w:t>, à la place de « postérieurement » lorsque l’orientation corporelle le justifie ;</w:t>
+      <w:r>
+        <w:rPr>
+          <w:lang w:val="fr-FR"/>
+        </w:rPr>
+        <w:t>dorsalement, à la place de « postérieurement » lorsque l’orientation corporelle le justifie ;</w:t>
       </w:r>
     </w:p>
     <w:p>
@@ -2061,19 +1785,11 @@
           <w:lang w:val="fr-FR"/>
         </w:rPr>
       </w:pPr>
-      <w:proofErr w:type="gramStart"/>
-      <w:r>
-        <w:rPr>
-          <w:lang w:val="fr-FR"/>
-        </w:rPr>
-        <w:t>ventralement</w:t>
-      </w:r>
-      <w:proofErr w:type="gramEnd"/>
-      <w:r>
-        <w:rPr>
-          <w:lang w:val="fr-FR"/>
-        </w:rPr>
-        <w:t>, à la place de « antérieurement » ;</w:t>
+      <w:r>
+        <w:rPr>
+          <w:lang w:val="fr-FR"/>
+        </w:rPr>
+        <w:t>ventralement, à la place de « antérieurement » ;</w:t>
       </w:r>
     </w:p>
     <w:p>
@@ -2084,19 +1800,11 @@
           <w:lang w:val="fr-FR"/>
         </w:rPr>
       </w:pPr>
-      <w:proofErr w:type="gramStart"/>
-      <w:r>
-        <w:rPr>
-          <w:lang w:val="fr-FR"/>
-        </w:rPr>
-        <w:t>latéralement</w:t>
-      </w:r>
-      <w:proofErr w:type="gramEnd"/>
-      <w:r>
-        <w:rPr>
-          <w:lang w:val="fr-FR"/>
-        </w:rPr>
-        <w:t>, à la place de « extérieurement » ;</w:t>
+      <w:r>
+        <w:rPr>
+          <w:lang w:val="fr-FR"/>
+        </w:rPr>
+        <w:t>latéralement, à la place de « extérieurement » ;</w:t>
       </w:r>
     </w:p>
     <w:p>
@@ -2107,19 +1815,11 @@
           <w:lang w:val="fr-FR"/>
         </w:rPr>
       </w:pPr>
-      <w:proofErr w:type="gramStart"/>
-      <w:r>
-        <w:rPr>
-          <w:lang w:val="fr-FR"/>
-        </w:rPr>
-        <w:t>médialement</w:t>
-      </w:r>
-      <w:proofErr w:type="gramEnd"/>
-      <w:r>
-        <w:rPr>
-          <w:lang w:val="fr-FR"/>
-        </w:rPr>
-        <w:t>, à la place de « intérieurement » ;</w:t>
+      <w:r>
+        <w:rPr>
+          <w:lang w:val="fr-FR"/>
+        </w:rPr>
+        <w:t>médialement, à la place de « intérieurement » ;</w:t>
       </w:r>
     </w:p>
     <w:p>
@@ -2130,21 +1830,11 @@
           <w:lang w:val="fr-FR"/>
         </w:rPr>
       </w:pPr>
-      <w:proofErr w:type="spellStart"/>
-      <w:proofErr w:type="gramStart"/>
-      <w:r>
-        <w:rPr>
-          <w:lang w:val="fr-FR"/>
-        </w:rPr>
-        <w:t>céphaliquement</w:t>
-      </w:r>
-      <w:proofErr w:type="spellEnd"/>
-      <w:proofErr w:type="gramEnd"/>
-      <w:r>
-        <w:rPr>
-          <w:lang w:val="fr-FR"/>
-        </w:rPr>
-        <w:t>, à la place de « vers le haut » ;</w:t>
+      <w:r>
+        <w:rPr>
+          <w:lang w:val="fr-FR"/>
+        </w:rPr>
+        <w:t>céphaliquement, à la place de « vers le haut » ;</w:t>
       </w:r>
     </w:p>
     <w:p>
@@ -2155,19 +1845,11 @@
           <w:lang w:val="fr-FR"/>
         </w:rPr>
       </w:pPr>
-      <w:proofErr w:type="gramStart"/>
-      <w:r>
-        <w:rPr>
-          <w:lang w:val="fr-FR"/>
-        </w:rPr>
-        <w:t>caudalement</w:t>
-      </w:r>
-      <w:proofErr w:type="gramEnd"/>
-      <w:r>
-        <w:rPr>
-          <w:lang w:val="fr-FR"/>
-        </w:rPr>
-        <w:t>, à la place de « vers le bas » ;</w:t>
+      <w:r>
+        <w:rPr>
+          <w:lang w:val="fr-FR"/>
+        </w:rPr>
+        <w:t>caudalement, à la place de « vers le bas » ;</w:t>
       </w:r>
     </w:p>
     <w:p>
@@ -2178,19 +1860,11 @@
           <w:lang w:val="fr-FR"/>
         </w:rPr>
       </w:pPr>
-      <w:proofErr w:type="gramStart"/>
-      <w:r>
-        <w:rPr>
-          <w:lang w:val="fr-FR"/>
-        </w:rPr>
-        <w:t>frontalement</w:t>
-      </w:r>
-      <w:proofErr w:type="gramEnd"/>
-      <w:r>
-        <w:rPr>
-          <w:lang w:val="fr-FR"/>
-        </w:rPr>
-        <w:t>, pour décrire une orientation dans le plan frontal ;</w:t>
+      <w:r>
+        <w:rPr>
+          <w:lang w:val="fr-FR"/>
+        </w:rPr>
+        <w:t>frontalement, pour décrire une orientation dans le plan frontal ;</w:t>
       </w:r>
     </w:p>
     <w:p>
@@ -2201,19 +1875,11 @@
           <w:lang w:val="fr-FR"/>
         </w:rPr>
       </w:pPr>
-      <w:proofErr w:type="gramStart"/>
-      <w:r>
-        <w:rPr>
-          <w:lang w:val="fr-FR"/>
-        </w:rPr>
-        <w:t>sagittalement</w:t>
-      </w:r>
-      <w:proofErr w:type="gramEnd"/>
-      <w:r>
-        <w:rPr>
-          <w:lang w:val="fr-FR"/>
-        </w:rPr>
-        <w:t>, pour décrire une orientation dans le plan sagittal.</w:t>
+      <w:r>
+        <w:rPr>
+          <w:lang w:val="fr-FR"/>
+        </w:rPr>
+        <w:t>sagittalement, pour décrire une orientation dans le plan sagittal.</w:t>
       </w:r>
     </w:p>
     <w:p>
@@ -2485,21 +2151,7 @@
         <w:rPr>
           <w:lang w:val="fr-FR"/>
         </w:rPr>
-        <w:t xml:space="preserve">Relations </w:t>
-      </w:r>
-      <w:proofErr w:type="spellStart"/>
-      <w:r>
-        <w:rPr>
-          <w:lang w:val="fr-FR"/>
-        </w:rPr>
-        <w:t>viscéro</w:t>
-      </w:r>
-      <w:proofErr w:type="spellEnd"/>
-      <w:r>
-        <w:rPr>
-          <w:lang w:val="fr-FR"/>
-        </w:rPr>
-        <w:t>-somatiques</w:t>
+        <w:t>Relations viscéro-somatiques</w:t>
       </w:r>
     </w:p>
     <w:p>
@@ -2526,21 +2178,7 @@
         <w:rPr>
           <w:lang w:val="fr-FR"/>
         </w:rPr>
-        <w:t xml:space="preserve">Relations </w:t>
-      </w:r>
-      <w:proofErr w:type="spellStart"/>
-      <w:r>
-        <w:rPr>
-          <w:lang w:val="fr-FR"/>
-        </w:rPr>
-        <w:t>viscéro</w:t>
-      </w:r>
-      <w:proofErr w:type="spellEnd"/>
-      <w:r>
-        <w:rPr>
-          <w:lang w:val="fr-FR"/>
-        </w:rPr>
-        <w:t>-émotionnelles</w:t>
+        <w:t>Relations viscéro-émotionnelles</w:t>
       </w:r>
     </w:p>
     <w:p>
@@ -2662,19 +2300,11 @@
           <w:lang w:val="fr-FR"/>
         </w:rPr>
       </w:pPr>
-      <w:proofErr w:type="gramStart"/>
-      <w:r>
-        <w:rPr>
-          <w:lang w:val="fr-FR"/>
-        </w:rPr>
-        <w:t>sommeil</w:t>
-      </w:r>
-      <w:proofErr w:type="gramEnd"/>
-      <w:r>
-        <w:rPr>
-          <w:lang w:val="fr-FR"/>
-        </w:rPr>
-        <w:t>, transit, fatigue, mobilité, activité ou fonction viscérale.</w:t>
+      <w:r>
+        <w:rPr>
+          <w:lang w:val="fr-FR"/>
+        </w:rPr>
+        <w:t>sommeil, transit, fatigue, mobilité, activité ou fonction viscérale.</w:t>
       </w:r>
     </w:p>
     <w:p>
@@ -2758,19 +2388,9 @@
         <w:pStyle w:val="ListBullet"/>
         <w:spacing w:after="40"/>
       </w:pPr>
-      <w:proofErr w:type="spellStart"/>
-      <w:r>
-        <w:t>symptôme</w:t>
-      </w:r>
-      <w:proofErr w:type="spellEnd"/>
-      <w:r>
-        <w:t xml:space="preserve"> </w:t>
-      </w:r>
-      <w:proofErr w:type="gramStart"/>
-      <w:r>
-        <w:t>principal ;</w:t>
-      </w:r>
-      <w:proofErr w:type="gramEnd"/>
+      <w:r>
+        <w:t>symptôme principal ;</w:t>
+      </w:r>
     </w:p>
     <w:p>
       <w:pPr>
@@ -2834,19 +2454,11 @@
           <w:lang w:val="fr-FR"/>
         </w:rPr>
       </w:pPr>
-      <w:proofErr w:type="gramStart"/>
-      <w:r>
-        <w:rPr>
-          <w:lang w:val="fr-FR"/>
-        </w:rPr>
-        <w:t>durée</w:t>
-      </w:r>
-      <w:proofErr w:type="gramEnd"/>
-      <w:r>
-        <w:rPr>
-          <w:lang w:val="fr-FR"/>
-        </w:rPr>
-        <w:t xml:space="preserve"> et cinétique de la récupération.</w:t>
+      <w:r>
+        <w:rPr>
+          <w:lang w:val="fr-FR"/>
+        </w:rPr>
+        <w:t>durée et cinétique de la récupération.</w:t>
       </w:r>
     </w:p>
     <w:p>
@@ -2885,15 +2497,7 @@
         <w:t xml:space="preserve">Ce troisième volume ne présente pas seulement une nouvelle série de cartographies viscérales. </w:t>
       </w:r>
       <w:r>
-        <w:t xml:space="preserve">Il propose </w:t>
-      </w:r>
-      <w:proofErr w:type="spellStart"/>
-      <w:r>
-        <w:t>une</w:t>
-      </w:r>
-      <w:proofErr w:type="spellEnd"/>
-      <w:r>
-        <w:t xml:space="preserve"> lecture clinique organisée selon quatre niveaux :</w:t>
+        <w:t>Il propose une lecture clinique organisée selon quatre niveaux :</w:t>
       </w:r>
     </w:p>
     <w:p>
@@ -2904,19 +2508,11 @@
           <w:lang w:val="fr-FR"/>
         </w:rPr>
       </w:pPr>
-      <w:proofErr w:type="gramStart"/>
-      <w:r>
-        <w:rPr>
-          <w:lang w:val="fr-FR"/>
-        </w:rPr>
-        <w:t>le</w:t>
-      </w:r>
-      <w:proofErr w:type="gramEnd"/>
-      <w:r>
-        <w:rPr>
-          <w:lang w:val="fr-FR"/>
-        </w:rPr>
-        <w:t xml:space="preserve"> système nerveux central, premier niveau de régulation ;</w:t>
+      <w:r>
+        <w:rPr>
+          <w:lang w:val="fr-FR"/>
+        </w:rPr>
+        <w:t>le système nerveux central, premier niveau de régulation ;</w:t>
       </w:r>
     </w:p>
     <w:p>
@@ -2927,19 +2523,11 @@
           <w:lang w:val="fr-FR"/>
         </w:rPr>
       </w:pPr>
-      <w:proofErr w:type="gramStart"/>
-      <w:r>
-        <w:rPr>
-          <w:lang w:val="fr-FR"/>
-        </w:rPr>
-        <w:t>le</w:t>
-      </w:r>
-      <w:proofErr w:type="gramEnd"/>
-      <w:r>
-        <w:rPr>
-          <w:lang w:val="fr-FR"/>
-        </w:rPr>
-        <w:t xml:space="preserve"> système nerveux autonome, deuxième niveau de transmission et de modulation ;</w:t>
+      <w:r>
+        <w:rPr>
+          <w:lang w:val="fr-FR"/>
+        </w:rPr>
+        <w:t>le système nerveux autonome, deuxième niveau de transmission et de modulation ;</w:t>
       </w:r>
     </w:p>
     <w:p>
@@ -2950,19 +2538,11 @@
           <w:lang w:val="fr-FR"/>
         </w:rPr>
       </w:pPr>
-      <w:proofErr w:type="gramStart"/>
-      <w:r>
-        <w:rPr>
-          <w:lang w:val="fr-FR"/>
-        </w:rPr>
-        <w:t>les</w:t>
-      </w:r>
-      <w:proofErr w:type="gramEnd"/>
-      <w:r>
-        <w:rPr>
-          <w:lang w:val="fr-FR"/>
-        </w:rPr>
-        <w:t xml:space="preserve"> cavités et interfaces loco-régionales, troisième niveau ;</w:t>
+      <w:r>
+        <w:rPr>
+          <w:lang w:val="fr-FR"/>
+        </w:rPr>
+        <w:t>les cavités et interfaces loco-régionales, troisième niveau ;</w:t>
       </w:r>
     </w:p>
     <w:p>
@@ -2973,19 +2553,11 @@
           <w:lang w:val="fr-FR"/>
         </w:rPr>
       </w:pPr>
-      <w:proofErr w:type="gramStart"/>
-      <w:r>
-        <w:rPr>
-          <w:lang w:val="fr-FR"/>
-        </w:rPr>
-        <w:t>l’organe</w:t>
-      </w:r>
-      <w:proofErr w:type="gramEnd"/>
-      <w:r>
-        <w:rPr>
-          <w:lang w:val="fr-FR"/>
-        </w:rPr>
-        <w:t xml:space="preserve"> ou la fonction ciblés, quatrième niveau.</w:t>
+      <w:r>
+        <w:rPr>
+          <w:lang w:val="fr-FR"/>
+        </w:rPr>
+        <w:t>l’organe ou la fonction ciblés, quatrième niveau.</w:t>
       </w:r>
     </w:p>
     <w:p>
@@ -3109,21 +2681,12 @@
       <w:pStyle w:val="Footer"/>
       <w:jc w:val="center"/>
     </w:pPr>
-    <w:proofErr w:type="spellStart"/>
     <w:r>
       <w:rPr>
         <w:color w:val="6F8F89"/>
         <w:sz w:val="16"/>
       </w:rPr>
-      <w:t>Chapitre</w:t>
-    </w:r>
-    <w:proofErr w:type="spellEnd"/>
-    <w:r>
-      <w:rPr>
-        <w:color w:val="6F8F89"/>
-        <w:sz w:val="16"/>
-      </w:rPr>
-      <w:t xml:space="preserve"> 0 — Introduction | Réflexothérapie occipito-podale</w:t>
+      <w:t>Chapitre 0 — Introduction | Réflexothérapie occipito-podale</w:t>
     </w:r>
   </w:p>
 </w:ftr>

</xml_diff>

<commit_message>
Refresh Chapter 5 Rework and Chapter 0
</commit_message>
<xml_diff>
--- a/public/chapter-0/Chapter0_Introduction_ROP_pret_a_publier.docx
+++ b/public/chapter-0/Chapter0_Introduction_ROP_pret_a_publier.docx
@@ -108,7 +108,21 @@
         <w:rPr>
           <w:lang w:val="fr-FR"/>
         </w:rPr>
-        <w:t>Une lecture simple des relations viscéro-somatiques : comment un viscère peut influencer le système locomoteur et, inversement, comment une contrainte somatique peut retentir sur la fonction viscérale.</w:t>
+        <w:t xml:space="preserve">Une lecture simple des relations </w:t>
+      </w:r>
+      <w:proofErr w:type="spellStart"/>
+      <w:r>
+        <w:rPr>
+          <w:lang w:val="fr-FR"/>
+        </w:rPr>
+        <w:t>viscéro</w:t>
+      </w:r>
+      <w:proofErr w:type="spellEnd"/>
+      <w:r>
+        <w:rPr>
+          <w:lang w:val="fr-FR"/>
+        </w:rPr>
+        <w:t>-somatiques : comment un viscère peut influencer le système locomoteur et, inversement, comment une contrainte somatique peut retentir sur la fonction viscérale.</w:t>
       </w:r>
     </w:p>
     <w:p>
@@ -280,6 +294,88 @@
     </w:p>
     <w:p>
       <w:pPr>
+        <w:rPr>
+          <w:lang w:val="fr-FR"/>
+        </w:rPr>
+      </w:pPr>
+    </w:p>
+    <w:p>
+      <w:pPr>
+        <w:rPr>
+          <w:lang w:val="fr-FR"/>
+        </w:rPr>
+      </w:pPr>
+      <w:r>
+        <w:rPr>
+          <w:noProof/>
+        </w:rPr>
+        <w:lastRenderedPageBreak/>
+        <w:drawing>
+          <wp:inline distT="0" distB="0" distL="0" distR="0" wp14:anchorId="3A30A48B" wp14:editId="1F944CDD">
+            <wp:extent cx="6332220" cy="3562985"/>
+            <wp:effectExtent l="0" t="0" r="0" b="0"/>
+            <wp:docPr id="2049073173" name="Picture 1"/>
+            <wp:cNvGraphicFramePr>
+              <a:graphicFrameLocks xmlns:a="http://schemas.openxmlformats.org/drawingml/2006/main" noChangeAspect="1"/>
+            </wp:cNvGraphicFramePr>
+            <a:graphic xmlns:a="http://schemas.openxmlformats.org/drawingml/2006/main">
+              <a:graphicData uri="http://schemas.openxmlformats.org/drawingml/2006/picture">
+                <pic:pic xmlns:pic="http://schemas.openxmlformats.org/drawingml/2006/picture">
+                  <pic:nvPicPr>
+                    <pic:cNvPr id="0" name="Picture 1"/>
+                    <pic:cNvPicPr>
+                      <a:picLocks noChangeAspect="1" noChangeArrowheads="1"/>
+                    </pic:cNvPicPr>
+                  </pic:nvPicPr>
+                  <pic:blipFill>
+                    <a:blip r:embed="rId8">
+                      <a:extLst>
+                        <a:ext uri="{28A0092B-C50C-407E-A947-70E740481C1C}">
+                          <a14:useLocalDpi xmlns:a14="http://schemas.microsoft.com/office/drawing/2010/main" val="0"/>
+                        </a:ext>
+                      </a:extLst>
+                    </a:blip>
+                    <a:srcRect/>
+                    <a:stretch>
+                      <a:fillRect/>
+                    </a:stretch>
+                  </pic:blipFill>
+                  <pic:spPr bwMode="auto">
+                    <a:xfrm>
+                      <a:off x="0" y="0"/>
+                      <a:ext cx="6332220" cy="3562985"/>
+                    </a:xfrm>
+                    <a:prstGeom prst="rect">
+                      <a:avLst/>
+                    </a:prstGeom>
+                    <a:noFill/>
+                    <a:ln>
+                      <a:noFill/>
+                    </a:ln>
+                  </pic:spPr>
+                </pic:pic>
+              </a:graphicData>
+            </a:graphic>
+          </wp:inline>
+        </w:drawing>
+      </w:r>
+    </w:p>
+    <w:p>
+      <w:pPr>
+        <w:rPr>
+          <w:lang w:val="fr-FR"/>
+        </w:rPr>
+      </w:pPr>
+    </w:p>
+    <w:p>
+      <w:pPr>
+        <w:rPr>
+          <w:lang w:val="fr-FR"/>
+        </w:rPr>
+      </w:pPr>
+    </w:p>
+    <w:p>
+      <w:pPr>
         <w:pStyle w:val="Heading2"/>
         <w:rPr>
           <w:lang w:val="fr-FR"/>
@@ -289,7 +385,6 @@
         <w:rPr>
           <w:lang w:val="fr-FR"/>
         </w:rPr>
-        <w:lastRenderedPageBreak/>
         <w:t>Niveau 1 — Régulation centrale</w:t>
       </w:r>
     </w:p>
@@ -303,7 +398,21 @@
         <w:rPr>
           <w:lang w:val="fr-FR"/>
         </w:rPr>
-        <w:t>Le premier niveau concerne le système nerveux central. Il rassemble les structures qui participent à l’intégration des informations sensorielles et viscérales, à l’organisation des réponses adaptatives, à la modulation de la douleur, aux réponses émotionnelles, aux fonctions neuro-endocrines, à la vigilance, au sommeil, à la récupération et à la coordination des réponses autonomes.</w:t>
+        <w:t xml:space="preserve">Le premier niveau concerne le système nerveux central. Il rassemble les structures qui participent à l’intégration des informations sensorielles et viscérales, à l’organisation des réponses adaptatives, à la modulation de la douleur, aux réponses émotionnelles, aux fonctions </w:t>
+      </w:r>
+      <w:proofErr w:type="spellStart"/>
+      <w:r>
+        <w:rPr>
+          <w:lang w:val="fr-FR"/>
+        </w:rPr>
+        <w:t>neuro-endocrines</w:t>
+      </w:r>
+      <w:proofErr w:type="spellEnd"/>
+      <w:r>
+        <w:rPr>
+          <w:lang w:val="fr-FR"/>
+        </w:rPr>
+        <w:t>, à la vigilance, au sommeil, à la récupération et à la coordination des réponses autonomes.</w:t>
       </w:r>
     </w:p>
     <w:p>
@@ -312,26 +421,35 @@
         <w:spacing w:after="40"/>
       </w:pPr>
       <w:r>
-        <w:t>Tronc cérébral</w:t>
-      </w:r>
+        <w:t xml:space="preserve">Tronc </w:t>
+      </w:r>
+      <w:proofErr w:type="spellStart"/>
+      <w:r>
+        <w:t>cérébral</w:t>
+      </w:r>
+      <w:proofErr w:type="spellEnd"/>
     </w:p>
     <w:p>
       <w:pPr>
         <w:pStyle w:val="ListBullet"/>
         <w:spacing w:after="40"/>
       </w:pPr>
+      <w:proofErr w:type="spellStart"/>
       <w:r>
         <w:t>Cervelet</w:t>
       </w:r>
+      <w:proofErr w:type="spellEnd"/>
     </w:p>
     <w:p>
       <w:pPr>
         <w:pStyle w:val="ListBullet"/>
         <w:spacing w:after="40"/>
       </w:pPr>
+      <w:proofErr w:type="spellStart"/>
       <w:r>
         <w:t>Diencéphale</w:t>
       </w:r>
+      <w:proofErr w:type="spellEnd"/>
     </w:p>
     <w:p>
       <w:pPr>
@@ -339,17 +457,32 @@
         <w:spacing w:after="40"/>
       </w:pPr>
       <w:r>
-        <w:t>Système limbique</w:t>
-      </w:r>
+        <w:t xml:space="preserve">Système </w:t>
+      </w:r>
+      <w:proofErr w:type="spellStart"/>
+      <w:r>
+        <w:t>limbique</w:t>
+      </w:r>
+      <w:proofErr w:type="spellEnd"/>
     </w:p>
     <w:p>
       <w:pPr>
         <w:pStyle w:val="ListBullet"/>
         <w:spacing w:after="40"/>
       </w:pPr>
-      <w:r>
-        <w:t>Noyaux gris centraux</w:t>
-      </w:r>
+      <w:proofErr w:type="spellStart"/>
+      <w:r>
+        <w:t>Noyaux</w:t>
+      </w:r>
+      <w:proofErr w:type="spellEnd"/>
+      <w:r>
+        <w:t xml:space="preserve"> gris </w:t>
+      </w:r>
+      <w:proofErr w:type="spellStart"/>
+      <w:r>
+        <w:t>centraux</w:t>
+      </w:r>
+      <w:proofErr w:type="spellEnd"/>
     </w:p>
     <w:p>
       <w:pPr>
@@ -357,8 +490,13 @@
         <w:spacing w:after="40"/>
       </w:pPr>
       <w:r>
-        <w:t>Membranes intracrâniennes</w:t>
-      </w:r>
+        <w:t xml:space="preserve">Membranes </w:t>
+      </w:r>
+      <w:proofErr w:type="spellStart"/>
+      <w:r>
+        <w:t>intracrâniennes</w:t>
+      </w:r>
+      <w:proofErr w:type="spellEnd"/>
     </w:p>
     <w:p>
       <w:pPr>
@@ -366,8 +504,13 @@
         <w:spacing w:after="40"/>
       </w:pPr>
       <w:r>
-        <w:t>Environnement neuro-méningé et neurovasculaire</w:t>
-      </w:r>
+        <w:t xml:space="preserve">Environnement neuro-méningé et </w:t>
+      </w:r>
+      <w:proofErr w:type="spellStart"/>
+      <w:r>
+        <w:t>neurovasculaire</w:t>
+      </w:r>
+      <w:proofErr w:type="spellEnd"/>
     </w:p>
     <w:p>
       <w:pPr>
@@ -414,18 +557,38 @@
         <w:pStyle w:val="ListBullet"/>
         <w:spacing w:after="40"/>
       </w:pPr>
-      <w:r>
-        <w:t>Voies sympathiques</w:t>
-      </w:r>
+      <w:proofErr w:type="spellStart"/>
+      <w:r>
+        <w:t>Voies</w:t>
+      </w:r>
+      <w:proofErr w:type="spellEnd"/>
+      <w:r>
+        <w:t xml:space="preserve"> </w:t>
+      </w:r>
+      <w:proofErr w:type="spellStart"/>
+      <w:r>
+        <w:t>sympathiques</w:t>
+      </w:r>
+      <w:proofErr w:type="spellEnd"/>
     </w:p>
     <w:p>
       <w:pPr>
         <w:pStyle w:val="ListBullet"/>
         <w:spacing w:after="40"/>
       </w:pPr>
-      <w:r>
-        <w:t>Voies parasympathiques</w:t>
-      </w:r>
+      <w:proofErr w:type="spellStart"/>
+      <w:r>
+        <w:t>Voies</w:t>
+      </w:r>
+      <w:proofErr w:type="spellEnd"/>
+      <w:r>
+        <w:t xml:space="preserve"> </w:t>
+      </w:r>
+      <w:proofErr w:type="spellStart"/>
+      <w:r>
+        <w:t>parasympathiques</w:t>
+      </w:r>
+      <w:proofErr w:type="spellEnd"/>
     </w:p>
     <w:p>
       <w:pPr>
@@ -433,6 +596,7 @@
         <w:spacing w:after="40"/>
       </w:pPr>
       <w:r>
+        <w:lastRenderedPageBreak/>
         <w:t>Nerf vague</w:t>
       </w:r>
     </w:p>
@@ -441,8 +605,13 @@
         <w:pStyle w:val="ListBullet"/>
         <w:spacing w:after="40"/>
       </w:pPr>
-      <w:r>
-        <w:t>Parasympathique sacré</w:t>
+      <w:proofErr w:type="spellStart"/>
+      <w:r>
+        <w:t>Parasympathique</w:t>
+      </w:r>
+      <w:proofErr w:type="spellEnd"/>
+      <w:r>
+        <w:t xml:space="preserve"> sacré</w:t>
       </w:r>
     </w:p>
     <w:p>
@@ -450,9 +619,19 @@
         <w:pStyle w:val="ListBullet"/>
         <w:spacing w:after="40"/>
       </w:pPr>
-      <w:r>
-        <w:t>Chaînes ganglionnaires</w:t>
-      </w:r>
+      <w:proofErr w:type="spellStart"/>
+      <w:r>
+        <w:t>Chaînes</w:t>
+      </w:r>
+      <w:proofErr w:type="spellEnd"/>
+      <w:r>
+        <w:t xml:space="preserve"> </w:t>
+      </w:r>
+      <w:proofErr w:type="spellStart"/>
+      <w:r>
+        <w:t>ganglionnaires</w:t>
+      </w:r>
+      <w:proofErr w:type="spellEnd"/>
     </w:p>
     <w:p>
       <w:pPr>
@@ -460,8 +639,13 @@
         <w:spacing w:after="40"/>
       </w:pPr>
       <w:r>
-        <w:t>Nerfs splanchniques</w:t>
-      </w:r>
+        <w:t xml:space="preserve">Nerfs </w:t>
+      </w:r>
+      <w:proofErr w:type="spellStart"/>
+      <w:r>
+        <w:t>splanchniques</w:t>
+      </w:r>
+      <w:proofErr w:type="spellEnd"/>
     </w:p>
     <w:p>
       <w:pPr>
@@ -469,7 +653,15 @@
         <w:spacing w:after="40"/>
       </w:pPr>
       <w:r>
-        <w:t>Plexus prévertébraux et préviscéraux</w:t>
+        <w:t xml:space="preserve">Plexus </w:t>
+      </w:r>
+      <w:proofErr w:type="spellStart"/>
+      <w:r>
+        <w:t>prévertébraux</w:t>
+      </w:r>
+      <w:proofErr w:type="spellEnd"/>
+      <w:r>
+        <w:t xml:space="preserve"> et préviscéraux</w:t>
       </w:r>
     </w:p>
     <w:p>
@@ -478,8 +670,13 @@
         <w:spacing w:after="40"/>
       </w:pPr>
       <w:r>
-        <w:t>Plexus pelviens</w:t>
-      </w:r>
+        <w:t xml:space="preserve">Plexus </w:t>
+      </w:r>
+      <w:proofErr w:type="spellStart"/>
+      <w:r>
+        <w:t>pelviens</w:t>
+      </w:r>
+      <w:proofErr w:type="spellEnd"/>
     </w:p>
     <w:p>
       <w:pPr>
@@ -487,8 +684,21 @@
         <w:spacing w:after="40"/>
       </w:pPr>
       <w:r>
-        <w:t>Système nerveux entérique</w:t>
-      </w:r>
+        <w:t xml:space="preserve">Système </w:t>
+      </w:r>
+      <w:proofErr w:type="spellStart"/>
+      <w:r>
+        <w:t>nerveux</w:t>
+      </w:r>
+      <w:proofErr w:type="spellEnd"/>
+      <w:r>
+        <w:t xml:space="preserve"> </w:t>
+      </w:r>
+      <w:proofErr w:type="spellStart"/>
+      <w:r>
+        <w:t>entérique</w:t>
+      </w:r>
+      <w:proofErr w:type="spellEnd"/>
     </w:p>
     <w:p>
       <w:pPr>
@@ -535,27 +745,49 @@
         <w:pStyle w:val="ListBullet"/>
         <w:spacing w:after="40"/>
       </w:pPr>
-      <w:r>
-        <w:t>Cavités abdominale et pelvienne</w:t>
-      </w:r>
+      <w:proofErr w:type="spellStart"/>
+      <w:r>
+        <w:t>Cavités</w:t>
+      </w:r>
+      <w:proofErr w:type="spellEnd"/>
+      <w:r>
+        <w:t xml:space="preserve"> </w:t>
+      </w:r>
+      <w:proofErr w:type="spellStart"/>
+      <w:r>
+        <w:t>abdominale</w:t>
+      </w:r>
+      <w:proofErr w:type="spellEnd"/>
+      <w:r>
+        <w:t xml:space="preserve"> et </w:t>
+      </w:r>
+      <w:proofErr w:type="spellStart"/>
+      <w:r>
+        <w:t>pelvienne</w:t>
+      </w:r>
+      <w:proofErr w:type="spellEnd"/>
     </w:p>
     <w:p>
       <w:pPr>
         <w:pStyle w:val="ListBullet"/>
         <w:spacing w:after="40"/>
       </w:pPr>
+      <w:proofErr w:type="spellStart"/>
       <w:r>
         <w:t>Diaphragme</w:t>
       </w:r>
+      <w:proofErr w:type="spellEnd"/>
     </w:p>
     <w:p>
       <w:pPr>
         <w:pStyle w:val="ListBullet"/>
         <w:spacing w:after="40"/>
       </w:pPr>
+      <w:proofErr w:type="spellStart"/>
       <w:r>
         <w:t>Péritoine</w:t>
       </w:r>
+      <w:proofErr w:type="spellEnd"/>
     </w:p>
     <w:p>
       <w:pPr>
@@ -571,9 +803,19 @@
         <w:pStyle w:val="ListBullet"/>
         <w:spacing w:after="40"/>
       </w:pPr>
-      <w:r>
-        <w:t>Mésos et ligaments viscéraux</w:t>
-      </w:r>
+      <w:proofErr w:type="spellStart"/>
+      <w:r>
+        <w:t>Mésos</w:t>
+      </w:r>
+      <w:proofErr w:type="spellEnd"/>
+      <w:r>
+        <w:t xml:space="preserve"> et ligaments </w:t>
+      </w:r>
+      <w:proofErr w:type="spellStart"/>
+      <w:r>
+        <w:t>viscéraux</w:t>
+      </w:r>
+      <w:proofErr w:type="spellEnd"/>
     </w:p>
     <w:p>
       <w:pPr>
@@ -581,8 +823,21 @@
         <w:spacing w:after="40"/>
       </w:pPr>
       <w:r>
-        <w:t>Muscles et charnières vertébrales</w:t>
-      </w:r>
+        <w:t xml:space="preserve">Muscles et </w:t>
+      </w:r>
+      <w:proofErr w:type="spellStart"/>
+      <w:r>
+        <w:t>charnières</w:t>
+      </w:r>
+      <w:proofErr w:type="spellEnd"/>
+      <w:r>
+        <w:t xml:space="preserve"> </w:t>
+      </w:r>
+      <w:proofErr w:type="spellStart"/>
+      <w:r>
+        <w:t>vertébrales</w:t>
+      </w:r>
+      <w:proofErr w:type="spellEnd"/>
     </w:p>
     <w:p>
       <w:pPr>
@@ -590,8 +845,13 @@
         <w:spacing w:after="40"/>
       </w:pPr>
       <w:r>
-        <w:t>Passages neurovasculaires</w:t>
-      </w:r>
+        <w:t xml:space="preserve">Passages </w:t>
+      </w:r>
+      <w:proofErr w:type="spellStart"/>
+      <w:r>
+        <w:t>neurovasculaires</w:t>
+      </w:r>
+      <w:proofErr w:type="spellEnd"/>
     </w:p>
     <w:p>
       <w:pPr>
@@ -599,9 +859,13 @@
         <w:spacing w:after="40"/>
       </w:pPr>
       <w:r>
-        <w:lastRenderedPageBreak/>
-        <w:t>Plexus régionaux</w:t>
-      </w:r>
+        <w:t xml:space="preserve">Plexus </w:t>
+      </w:r>
+      <w:proofErr w:type="spellStart"/>
+      <w:r>
+        <w:t>régionaux</w:t>
+      </w:r>
+      <w:proofErr w:type="spellEnd"/>
     </w:p>
     <w:p>
       <w:pPr>
@@ -648,9 +912,19 @@
         <w:pStyle w:val="ListBullet"/>
         <w:spacing w:after="40"/>
       </w:pPr>
-      <w:r>
-        <w:t>Estomac et duodénum</w:t>
-      </w:r>
+      <w:proofErr w:type="spellStart"/>
+      <w:r>
+        <w:t>Estomac</w:t>
+      </w:r>
+      <w:proofErr w:type="spellEnd"/>
+      <w:r>
+        <w:t xml:space="preserve"> et </w:t>
+      </w:r>
+      <w:proofErr w:type="spellStart"/>
+      <w:r>
+        <w:t>duodénum</w:t>
+      </w:r>
+      <w:proofErr w:type="spellEnd"/>
     </w:p>
     <w:p>
       <w:pPr>
@@ -658,16 +932,34 @@
         <w:spacing w:after="40"/>
       </w:pPr>
       <w:r>
-        <w:t>Foie et voies biliaires</w:t>
-      </w:r>
+        <w:t xml:space="preserve">Foie et </w:t>
+      </w:r>
+      <w:proofErr w:type="spellStart"/>
+      <w:r>
+        <w:t>voies</w:t>
+      </w:r>
+      <w:proofErr w:type="spellEnd"/>
+      <w:r>
+        <w:t xml:space="preserve"> </w:t>
+      </w:r>
+      <w:proofErr w:type="spellStart"/>
+      <w:r>
+        <w:t>biliaires</w:t>
+      </w:r>
+      <w:proofErr w:type="spellEnd"/>
     </w:p>
     <w:p>
       <w:pPr>
         <w:pStyle w:val="ListBullet"/>
         <w:spacing w:after="40"/>
       </w:pPr>
-      <w:r>
-        <w:t>Pancréas et rate</w:t>
+      <w:proofErr w:type="spellStart"/>
+      <w:r>
+        <w:t>Pancréas</w:t>
+      </w:r>
+      <w:proofErr w:type="spellEnd"/>
+      <w:r>
+        <w:t xml:space="preserve"> et rate</w:t>
       </w:r>
     </w:p>
     <w:p>
@@ -675,8 +967,29 @@
         <w:pStyle w:val="ListBullet"/>
         <w:spacing w:after="40"/>
       </w:pPr>
-      <w:r>
-        <w:t>Intestin grêle, côlon et rectum</w:t>
+      <w:proofErr w:type="spellStart"/>
+      <w:r>
+        <w:t>Intestin</w:t>
+      </w:r>
+      <w:proofErr w:type="spellEnd"/>
+      <w:r>
+        <w:t xml:space="preserve"> </w:t>
+      </w:r>
+      <w:proofErr w:type="spellStart"/>
+      <w:r>
+        <w:t>grêle</w:t>
+      </w:r>
+      <w:proofErr w:type="spellEnd"/>
+      <w:r>
+        <w:t xml:space="preserve">, </w:t>
+      </w:r>
+      <w:proofErr w:type="spellStart"/>
+      <w:r>
+        <w:t>côlon</w:t>
+      </w:r>
+      <w:proofErr w:type="spellEnd"/>
+      <w:r>
+        <w:t xml:space="preserve"> et rectum</w:t>
       </w:r>
     </w:p>
     <w:p>
@@ -685,17 +998,32 @@
         <w:spacing w:after="40"/>
       </w:pPr>
       <w:r>
-        <w:t>Reins et vessie</w:t>
-      </w:r>
+        <w:t xml:space="preserve">Reins et </w:t>
+      </w:r>
+      <w:proofErr w:type="spellStart"/>
+      <w:r>
+        <w:t>vessie</w:t>
+      </w:r>
+      <w:proofErr w:type="spellEnd"/>
     </w:p>
     <w:p>
       <w:pPr>
         <w:pStyle w:val="ListBullet"/>
         <w:spacing w:after="40"/>
       </w:pPr>
-      <w:r>
-        <w:t>Organes génitaux</w:t>
-      </w:r>
+      <w:proofErr w:type="spellStart"/>
+      <w:r>
+        <w:t>Organes</w:t>
+      </w:r>
+      <w:proofErr w:type="spellEnd"/>
+      <w:r>
+        <w:t xml:space="preserve"> </w:t>
+      </w:r>
+      <w:proofErr w:type="spellStart"/>
+      <w:r>
+        <w:t>génitaux</w:t>
+      </w:r>
+      <w:proofErr w:type="spellEnd"/>
     </w:p>
     <w:p>
       <w:pPr>
@@ -703,8 +1031,13 @@
         <w:spacing w:after="40"/>
       </w:pPr>
       <w:r>
-        <w:t>Système érectile</w:t>
-      </w:r>
+        <w:t xml:space="preserve">Système </w:t>
+      </w:r>
+      <w:proofErr w:type="spellStart"/>
+      <w:r>
+        <w:t>érectile</w:t>
+      </w:r>
+      <w:proofErr w:type="spellEnd"/>
     </w:p>
     <w:p>
       <w:pPr>
@@ -736,6 +1069,7 @@
         <w:rPr>
           <w:noProof/>
         </w:rPr>
+        <w:lastRenderedPageBreak/>
         <w:drawing>
           <wp:inline distT="0" distB="0" distL="0" distR="0" wp14:anchorId="22C58F26" wp14:editId="5838DE80">
             <wp:extent cx="6332220" cy="3562985"/>
@@ -754,7 +1088,7 @@
                     </pic:cNvPicPr>
                   </pic:nvPicPr>
                   <pic:blipFill>
-                    <a:blip r:embed="rId8">
+                    <a:blip r:embed="rId9">
                       <a:extLst>
                         <a:ext uri="{28A0092B-C50C-407E-A947-70E740481C1C}">
                           <a14:useLocalDpi xmlns:a14="http://schemas.microsoft.com/office/drawing/2010/main" val="0"/>
@@ -901,17 +1235,53 @@
         </w:rPr>
         <w:t xml:space="preserve">Les quatre niveaux ne constituent pas quatre étapes obligatoires à appliquer de manière identique à tous les patients. </w:t>
       </w:r>
-      <w:r>
-        <w:t>Ils organisent le raisonnement clinique :</w:t>
-      </w:r>
+      <w:proofErr w:type="spellStart"/>
+      <w:r>
+        <w:t>Ils</w:t>
+      </w:r>
+      <w:proofErr w:type="spellEnd"/>
+      <w:r>
+        <w:t xml:space="preserve"> </w:t>
+      </w:r>
+      <w:proofErr w:type="spellStart"/>
+      <w:r>
+        <w:t>organisent</w:t>
+      </w:r>
+      <w:proofErr w:type="spellEnd"/>
+      <w:r>
+        <w:t xml:space="preserve"> le </w:t>
+      </w:r>
+      <w:proofErr w:type="spellStart"/>
+      <w:r>
+        <w:t>raisonnement</w:t>
+      </w:r>
+      <w:proofErr w:type="spellEnd"/>
+      <w:r>
+        <w:t xml:space="preserve"> </w:t>
+      </w:r>
+      <w:proofErr w:type="spellStart"/>
+      <w:proofErr w:type="gramStart"/>
+      <w:r>
+        <w:t>clinique</w:t>
+      </w:r>
+      <w:proofErr w:type="spellEnd"/>
+      <w:r>
+        <w:t xml:space="preserve"> :</w:t>
+      </w:r>
+      <w:proofErr w:type="gramEnd"/>
     </w:p>
     <w:p>
       <w:pPr>
         <w:pStyle w:val="ListNumber"/>
         <w:spacing w:after="40"/>
       </w:pPr>
-      <w:r>
-        <w:t>Régulation centrale.</w:t>
+      <w:proofErr w:type="spellStart"/>
+      <w:r>
+        <w:t>Régulation</w:t>
+      </w:r>
+      <w:proofErr w:type="spellEnd"/>
+      <w:r>
+        <w:t xml:space="preserve"> centrale.</w:t>
       </w:r>
     </w:p>
     <w:p>
@@ -919,8 +1289,21 @@
         <w:pStyle w:val="ListNumber"/>
         <w:spacing w:after="40"/>
       </w:pPr>
-      <w:r>
-        <w:t>Régulation neuro-végétative.</w:t>
+      <w:proofErr w:type="spellStart"/>
+      <w:r>
+        <w:t>Régulation</w:t>
+      </w:r>
+      <w:proofErr w:type="spellEnd"/>
+      <w:r>
+        <w:t xml:space="preserve"> neuro-</w:t>
+      </w:r>
+      <w:proofErr w:type="spellStart"/>
+      <w:r>
+        <w:t>végétative</w:t>
+      </w:r>
+      <w:proofErr w:type="spellEnd"/>
+      <w:r>
+        <w:t>.</w:t>
       </w:r>
     </w:p>
     <w:p>
@@ -929,7 +1312,15 @@
         <w:spacing w:after="40"/>
       </w:pPr>
       <w:r>
-        <w:t>Interfaces loco-régionales.</w:t>
+        <w:t>Interfaces loco-</w:t>
+      </w:r>
+      <w:proofErr w:type="spellStart"/>
+      <w:r>
+        <w:t>régionales</w:t>
+      </w:r>
+      <w:proofErr w:type="spellEnd"/>
+      <w:r>
+        <w:t>.</w:t>
       </w:r>
     </w:p>
     <w:p>
@@ -937,8 +1328,29 @@
         <w:pStyle w:val="ListNumber"/>
         <w:spacing w:after="40"/>
       </w:pPr>
-      <w:r>
-        <w:t>Cible viscérale spécifique.</w:t>
+      <w:proofErr w:type="spellStart"/>
+      <w:r>
+        <w:t>Cible</w:t>
+      </w:r>
+      <w:proofErr w:type="spellEnd"/>
+      <w:r>
+        <w:t xml:space="preserve"> </w:t>
+      </w:r>
+      <w:proofErr w:type="spellStart"/>
+      <w:r>
+        <w:t>viscérale</w:t>
+      </w:r>
+      <w:proofErr w:type="spellEnd"/>
+      <w:r>
+        <w:t xml:space="preserve"> </w:t>
+      </w:r>
+      <w:proofErr w:type="spellStart"/>
+      <w:r>
+        <w:t>spécifique</w:t>
+      </w:r>
+      <w:proofErr w:type="spellEnd"/>
+      <w:r>
+        <w:t>.</w:t>
       </w:r>
     </w:p>
     <w:p>
@@ -977,6 +1389,7 @@
         <w:rPr>
           <w:lang w:val="fr-FR"/>
         </w:rPr>
+        <w:lastRenderedPageBreak/>
         <w:t>Le modèle en quatre niveaux doit donc rester une grille de lecture et de hiérarchisation, et non une séquence automatique. Le mouvement clinique peut également être compris dans les deux sens : du central vers le viscéral et du viscéral vers les centres d’intégration.</w:t>
       </w:r>
     </w:p>
@@ -1004,7 +1417,21 @@
         <w:rPr>
           <w:lang w:val="fr-FR"/>
         </w:rPr>
-        <w:t>Les chapitres consacrés au mécanisme du stress et à la théorie polyvagale ne constituent pas un cinquième niveau clinique. Ils expliquent comment les quatre niveaux interagissent dans le temps.</w:t>
+        <w:t xml:space="preserve">Les chapitres consacrés au mécanisme du stress et à la théorie </w:t>
+      </w:r>
+      <w:proofErr w:type="spellStart"/>
+      <w:r>
+        <w:rPr>
+          <w:lang w:val="fr-FR"/>
+        </w:rPr>
+        <w:t>polyvagale</w:t>
+      </w:r>
+      <w:proofErr w:type="spellEnd"/>
+      <w:r>
+        <w:rPr>
+          <w:lang w:val="fr-FR"/>
+        </w:rPr>
+        <w:t xml:space="preserve"> ne constituent pas un cinquième niveau clinique. Ils expliquent comment les quatre niveaux interagissent dans le temps.</w:t>
       </w:r>
     </w:p>
     <w:p>
@@ -1025,9 +1452,16 @@
         <w:pStyle w:val="ListBullet"/>
         <w:spacing w:after="40"/>
       </w:pPr>
-      <w:r>
-        <w:t>persiste ;</w:t>
-      </w:r>
+      <w:proofErr w:type="spellStart"/>
+      <w:proofErr w:type="gramStart"/>
+      <w:r>
+        <w:t>persiste</w:t>
+      </w:r>
+      <w:proofErr w:type="spellEnd"/>
+      <w:r>
+        <w:t xml:space="preserve"> ;</w:t>
+      </w:r>
+      <w:proofErr w:type="gramEnd"/>
     </w:p>
     <w:p>
       <w:pPr>
@@ -1035,8 +1469,18 @@
         <w:spacing w:after="40"/>
       </w:pPr>
       <w:r>
-        <w:t>se répète ;</w:t>
-      </w:r>
+        <w:t xml:space="preserve">se </w:t>
+      </w:r>
+      <w:proofErr w:type="spellStart"/>
+      <w:proofErr w:type="gramStart"/>
+      <w:r>
+        <w:t>répète</w:t>
+      </w:r>
+      <w:proofErr w:type="spellEnd"/>
+      <w:r>
+        <w:t xml:space="preserve"> ;</w:t>
+      </w:r>
+      <w:proofErr w:type="gramEnd"/>
     </w:p>
     <w:p>
       <w:pPr>
@@ -1044,8 +1488,18 @@
         <w:spacing w:after="40"/>
       </w:pPr>
       <w:r>
-        <w:t>reste disproportionnée ;</w:t>
-      </w:r>
+        <w:t xml:space="preserve">reste </w:t>
+      </w:r>
+      <w:proofErr w:type="spellStart"/>
+      <w:proofErr w:type="gramStart"/>
+      <w:r>
+        <w:t>disproportionnée</w:t>
+      </w:r>
+      <w:proofErr w:type="spellEnd"/>
+      <w:r>
+        <w:t xml:space="preserve"> ;</w:t>
+      </w:r>
+      <w:proofErr w:type="gramEnd"/>
     </w:p>
     <w:p>
       <w:pPr>
@@ -1053,8 +1507,21 @@
         <w:spacing w:after="40"/>
       </w:pPr>
       <w:r>
-        <w:t>ne se clôt pas ;</w:t>
-      </w:r>
+        <w:t xml:space="preserve">ne se </w:t>
+      </w:r>
+      <w:proofErr w:type="spellStart"/>
+      <w:r>
+        <w:t>clôt</w:t>
+      </w:r>
+      <w:proofErr w:type="spellEnd"/>
+      <w:r>
+        <w:t xml:space="preserve"> </w:t>
+      </w:r>
+      <w:proofErr w:type="gramStart"/>
+      <w:r>
+        <w:t>pas ;</w:t>
+      </w:r>
+      <w:proofErr w:type="gramEnd"/>
     </w:p>
     <w:p>
       <w:pPr>
@@ -1064,11 +1531,19 @@
           <w:lang w:val="fr-FR"/>
         </w:rPr>
       </w:pPr>
-      <w:r>
-        <w:rPr>
-          <w:lang w:val="fr-FR"/>
-        </w:rPr>
-        <w:t>dépasse les capacités de récupération du patient.</w:t>
+      <w:proofErr w:type="gramStart"/>
+      <w:r>
+        <w:rPr>
+          <w:lang w:val="fr-FR"/>
+        </w:rPr>
+        <w:t>dépasse</w:t>
+      </w:r>
+      <w:proofErr w:type="gramEnd"/>
+      <w:r>
+        <w:rPr>
+          <w:lang w:val="fr-FR"/>
+        </w:rPr>
+        <w:t xml:space="preserve"> les capacités de récupération du patient.</w:t>
       </w:r>
     </w:p>
     <w:p>
@@ -1094,7 +1569,21 @@
         <w:rPr>
           <w:lang w:val="fr-FR"/>
         </w:rPr>
-        <w:t>Le chapitre consacré à la théorie polyvagale propose une lecture complémentaire des états autonomes et des réponses de mobilisation, de protection ou d’engagement relationnel. Ces chapitres décrivent donc la dynamique qui relie les centres de régulation, les voies autonomes, les tensions régionales et les manifestations viscérales.</w:t>
+        <w:t xml:space="preserve">Le chapitre consacré à la théorie </w:t>
+      </w:r>
+      <w:proofErr w:type="spellStart"/>
+      <w:r>
+        <w:rPr>
+          <w:lang w:val="fr-FR"/>
+        </w:rPr>
+        <w:t>polyvagale</w:t>
+      </w:r>
+      <w:proofErr w:type="spellEnd"/>
+      <w:r>
+        <w:rPr>
+          <w:lang w:val="fr-FR"/>
+        </w:rPr>
+        <w:t xml:space="preserve"> propose une lecture complémentaire des états autonomes et des réponses de mobilisation, de protection ou d’engagement relationnel. Ces chapitres décrivent donc la dynamique qui relie les centres de régulation, les voies autonomes, les tensions régionales et les manifestations viscérales.</w:t>
       </w:r>
     </w:p>
     <w:tbl>
@@ -1241,7 +1730,21 @@
         <w:rPr>
           <w:lang w:val="fr-FR"/>
         </w:rPr>
-        <w:t>Les chapitres sur le stress et la théorie polyvagale expliquent les mécanismes dynamiques qui relient les quatre niveaux.</w:t>
+        <w:t xml:space="preserve">Les chapitres sur le stress et la théorie </w:t>
+      </w:r>
+      <w:proofErr w:type="spellStart"/>
+      <w:r>
+        <w:rPr>
+          <w:lang w:val="fr-FR"/>
+        </w:rPr>
+        <w:t>polyvagale</w:t>
+      </w:r>
+      <w:proofErr w:type="spellEnd"/>
+      <w:r>
+        <w:rPr>
+          <w:lang w:val="fr-FR"/>
+        </w:rPr>
+        <w:t xml:space="preserve"> expliquent les mécanismes dynamiques qui relient les quatre niveaux.</w:t>
       </w:r>
     </w:p>
     <w:p>
@@ -1282,6 +1785,7 @@
         <w:rPr>
           <w:lang w:val="fr-FR"/>
         </w:rPr>
+        <w:lastRenderedPageBreak/>
         <w:t>Partie V — Uro-génital et pelvien</w:t>
       </w:r>
     </w:p>
@@ -1399,8 +1903,45 @@
         <w:t xml:space="preserve">L’observation clinique ne possède pas, à elle seule, la rigueur d’un protocole expérimental. </w:t>
       </w:r>
       <w:r>
-        <w:t>Elle conserve néanmoins une valeur lorsqu’elle est :</w:t>
-      </w:r>
+        <w:t xml:space="preserve">Elle conserve </w:t>
+      </w:r>
+      <w:proofErr w:type="spellStart"/>
+      <w:r>
+        <w:t>néanmoins</w:t>
+      </w:r>
+      <w:proofErr w:type="spellEnd"/>
+      <w:r>
+        <w:t xml:space="preserve"> </w:t>
+      </w:r>
+      <w:proofErr w:type="spellStart"/>
+      <w:r>
+        <w:t>une</w:t>
+      </w:r>
+      <w:proofErr w:type="spellEnd"/>
+      <w:r>
+        <w:t xml:space="preserve"> </w:t>
+      </w:r>
+      <w:proofErr w:type="spellStart"/>
+      <w:r>
+        <w:t>valeur</w:t>
+      </w:r>
+      <w:proofErr w:type="spellEnd"/>
+      <w:r>
+        <w:t xml:space="preserve"> </w:t>
+      </w:r>
+      <w:proofErr w:type="spellStart"/>
+      <w:r>
+        <w:t>lorsqu’elle</w:t>
+      </w:r>
+      <w:proofErr w:type="spellEnd"/>
+      <w:r>
+        <w:t xml:space="preserve"> </w:t>
+      </w:r>
+      <w:proofErr w:type="gramStart"/>
+      <w:r>
+        <w:t>est :</w:t>
+      </w:r>
+      <w:proofErr w:type="gramEnd"/>
     </w:p>
     <w:p>
       <w:pPr>
@@ -1408,17 +1949,42 @@
         <w:spacing w:after="40"/>
       </w:pPr>
       <w:r>
-        <w:t>conduite avec méthode ;</w:t>
-      </w:r>
+        <w:t xml:space="preserve">conduite avec </w:t>
+      </w:r>
+      <w:proofErr w:type="spellStart"/>
+      <w:proofErr w:type="gramStart"/>
+      <w:r>
+        <w:t>méthode</w:t>
+      </w:r>
+      <w:proofErr w:type="spellEnd"/>
+      <w:r>
+        <w:t xml:space="preserve"> ;</w:t>
+      </w:r>
+      <w:proofErr w:type="gramEnd"/>
     </w:p>
     <w:p>
       <w:pPr>
         <w:pStyle w:val="ListBullet"/>
         <w:spacing w:after="40"/>
       </w:pPr>
-      <w:r>
-        <w:t>décrite avec précision ;</w:t>
-      </w:r>
+      <w:proofErr w:type="spellStart"/>
+      <w:r>
+        <w:t>décrite</w:t>
+      </w:r>
+      <w:proofErr w:type="spellEnd"/>
+      <w:r>
+        <w:t xml:space="preserve"> avec </w:t>
+      </w:r>
+      <w:proofErr w:type="spellStart"/>
+      <w:proofErr w:type="gramStart"/>
+      <w:r>
+        <w:t>précision</w:t>
+      </w:r>
+      <w:proofErr w:type="spellEnd"/>
+      <w:r>
+        <w:t xml:space="preserve"> ;</w:t>
+      </w:r>
+      <w:proofErr w:type="gramEnd"/>
     </w:p>
     <w:p>
       <w:pPr>
@@ -1428,11 +1994,19 @@
           <w:lang w:val="fr-FR"/>
         </w:rPr>
       </w:pPr>
-      <w:r>
-        <w:rPr>
-          <w:lang w:val="fr-FR"/>
-        </w:rPr>
-        <w:t>confrontée à l’évolution réelle du patient ;</w:t>
+      <w:proofErr w:type="gramStart"/>
+      <w:r>
+        <w:rPr>
+          <w:lang w:val="fr-FR"/>
+        </w:rPr>
+        <w:t>confrontée</w:t>
+      </w:r>
+      <w:proofErr w:type="gramEnd"/>
+      <w:r>
+        <w:rPr>
+          <w:lang w:val="fr-FR"/>
+        </w:rPr>
+        <w:t xml:space="preserve"> à l’évolution réelle du patient ;</w:t>
       </w:r>
     </w:p>
     <w:p>
@@ -1443,12 +2017,19 @@
           <w:lang w:val="fr-FR"/>
         </w:rPr>
       </w:pPr>
-      <w:r>
-        <w:rPr>
-          <w:lang w:val="fr-FR"/>
-        </w:rPr>
-        <w:lastRenderedPageBreak/>
-        <w:t>mise en relation avec les données médicales disponibles ;</w:t>
+      <w:proofErr w:type="gramStart"/>
+      <w:r>
+        <w:rPr>
+          <w:lang w:val="fr-FR"/>
+        </w:rPr>
+        <w:t>mise</w:t>
+      </w:r>
+      <w:proofErr w:type="gramEnd"/>
+      <w:r>
+        <w:rPr>
+          <w:lang w:val="fr-FR"/>
+        </w:rPr>
+        <w:t xml:space="preserve"> en relation avec les données médicales disponibles ;</w:t>
       </w:r>
     </w:p>
     <w:p>
@@ -1456,8 +2037,13 @@
         <w:pStyle w:val="ListBullet"/>
         <w:spacing w:after="40"/>
       </w:pPr>
-      <w:r>
-        <w:t>réévaluée dans le temps.</w:t>
+      <w:proofErr w:type="spellStart"/>
+      <w:r>
+        <w:t>réévaluée</w:t>
+      </w:r>
+      <w:proofErr w:type="spellEnd"/>
+      <w:r>
+        <w:t xml:space="preserve"> dans le temps.</w:t>
       </w:r>
     </w:p>
     <w:p>
@@ -1479,8 +2065,26 @@
         <w:spacing w:after="40"/>
       </w:pPr>
       <w:r>
-        <w:t>la cohérence anatomique ;</w:t>
-      </w:r>
+        <w:t xml:space="preserve">la </w:t>
+      </w:r>
+      <w:proofErr w:type="spellStart"/>
+      <w:r>
+        <w:t>cohérence</w:t>
+      </w:r>
+      <w:proofErr w:type="spellEnd"/>
+      <w:r>
+        <w:t xml:space="preserve"> </w:t>
+      </w:r>
+      <w:proofErr w:type="spellStart"/>
+      <w:proofErr w:type="gramStart"/>
+      <w:r>
+        <w:t>anatomique</w:t>
+      </w:r>
+      <w:proofErr w:type="spellEnd"/>
+      <w:r>
+        <w:t xml:space="preserve"> ;</w:t>
+      </w:r>
+      <w:proofErr w:type="gramEnd"/>
     </w:p>
     <w:p>
       <w:pPr>
@@ -1488,8 +2092,26 @@
         <w:spacing w:after="40"/>
       </w:pPr>
       <w:r>
-        <w:t>la reproductibilité des repères ;</w:t>
-      </w:r>
+        <w:t xml:space="preserve">la </w:t>
+      </w:r>
+      <w:proofErr w:type="spellStart"/>
+      <w:r>
+        <w:t>reproductibilité</w:t>
+      </w:r>
+      <w:proofErr w:type="spellEnd"/>
+      <w:r>
+        <w:t xml:space="preserve"> des </w:t>
+      </w:r>
+      <w:proofErr w:type="spellStart"/>
+      <w:proofErr w:type="gramStart"/>
+      <w:r>
+        <w:t>repères</w:t>
+      </w:r>
+      <w:proofErr w:type="spellEnd"/>
+      <w:r>
+        <w:t xml:space="preserve"> ;</w:t>
+      </w:r>
+      <w:proofErr w:type="gramEnd"/>
     </w:p>
     <w:p>
       <w:pPr>
@@ -1499,11 +2121,19 @@
           <w:lang w:val="fr-FR"/>
         </w:rPr>
       </w:pPr>
-      <w:r>
-        <w:rPr>
-          <w:lang w:val="fr-FR"/>
-        </w:rPr>
-        <w:t>la confrontation au réel par l’anamnèse, l’imagerie et les données médicales ou chirurgicales ;</w:t>
+      <w:proofErr w:type="gramStart"/>
+      <w:r>
+        <w:rPr>
+          <w:lang w:val="fr-FR"/>
+        </w:rPr>
+        <w:t>la</w:t>
+      </w:r>
+      <w:proofErr w:type="gramEnd"/>
+      <w:r>
+        <w:rPr>
+          <w:lang w:val="fr-FR"/>
+        </w:rPr>
+        <w:t xml:space="preserve"> confrontation au réel par l’anamnèse, l’imagerie et les données médicales ou chirurgicales ;</w:t>
       </w:r>
     </w:p>
     <w:p>
@@ -1514,11 +2144,19 @@
           <w:lang w:val="fr-FR"/>
         </w:rPr>
       </w:pPr>
-      <w:r>
-        <w:rPr>
-          <w:lang w:val="fr-FR"/>
-        </w:rPr>
-        <w:t>la documentation structurée de la pratique et de l’évolution du patient.</w:t>
+      <w:proofErr w:type="gramStart"/>
+      <w:r>
+        <w:rPr>
+          <w:lang w:val="fr-FR"/>
+        </w:rPr>
+        <w:t>la</w:t>
+      </w:r>
+      <w:proofErr w:type="gramEnd"/>
+      <w:r>
+        <w:rPr>
+          <w:lang w:val="fr-FR"/>
+        </w:rPr>
+        <w:t xml:space="preserve"> documentation structurée de la pratique et de l’évolution du patient.</w:t>
       </w:r>
     </w:p>
     <w:tbl>
@@ -1551,6 +2189,7 @@
                 <w:lang w:val="fr-FR"/>
               </w:rPr>
             </w:pPr>
+            <w:proofErr w:type="spellStart"/>
             <w:r>
               <w:rPr>
                 <w:b/>
@@ -1558,7 +2197,17 @@
                 <w:sz w:val="23"/>
                 <w:lang w:val="fr-FR"/>
               </w:rPr>
-              <w:t>SuiviPatient — De l’observation clinique à une communauté de données</w:t>
+              <w:t>SuiviPatient</w:t>
+            </w:r>
+            <w:proofErr w:type="spellEnd"/>
+            <w:r>
+              <w:rPr>
+                <w:b/>
+                <w:color w:val="C6922E"/>
+                <w:sz w:val="23"/>
+                <w:lang w:val="fr-FR"/>
+              </w:rPr>
+              <w:t xml:space="preserve"> — De l’observation clinique à une communauté de données</w:t>
             </w:r>
             <w:r>
               <w:rPr>
@@ -1573,7 +2222,21 @@
               <w:rPr>
                 <w:lang w:val="fr-FR"/>
               </w:rPr>
-              <w:t>Pour prolonger cette exigence au-delà du livre, nous mettons gratuitement à disposition des praticiens certifiés ROP l’application SuiviPatient. Cet outil permet de documenter de manière structurée le motif principal de consultation, les éléments de l’anamnèse, les niveaux et zones travaillés, le protocole réellement suivi, les réactions observées pendant et après la séance, ainsi que l’évolution de la douleur, du sommeil, de la fatigue, du transit, de la mobilité ou des capacités fonctionnelles.</w:t>
+              <w:t xml:space="preserve">Pour prolonger cette exigence au-delà du livre, nous mettons gratuitement à disposition des praticiens certifiés ROP l’application </w:t>
+            </w:r>
+            <w:proofErr w:type="spellStart"/>
+            <w:r>
+              <w:rPr>
+                <w:lang w:val="fr-FR"/>
+              </w:rPr>
+              <w:t>SuiviPatient</w:t>
+            </w:r>
+            <w:proofErr w:type="spellEnd"/>
+            <w:r>
+              <w:rPr>
+                <w:lang w:val="fr-FR"/>
+              </w:rPr>
+              <w:t>. Cet outil permet de documenter de manière structurée le motif principal de consultation, les éléments de l’anamnèse, les niveaux et zones travaillés, le protocole réellement suivi, les réactions observées pendant et après la séance, ainsi que l’évolution de la douleur, du sommeil, de la fatigue, du transit, de la mobilité ou des capacités fonctionnelles.</w:t>
             </w:r>
             <w:r>
               <w:rPr>
@@ -1586,7 +2249,21 @@
                 <w:lang w:val="fr-FR"/>
               </w:rPr>
               <w:br/>
-              <w:t>L’objectif n’est pas de transformer chaque séance en protocole expérimental ni de tirer des conclusions causales à partir de simples observations. Il est de rendre la pratique plus traçable, plus comparable et plus facilement réévaluable. Grâce à SuiviPatient, chaque praticien enrichit sa propre expérience et contribue à une dynamique collective : mieux identifier les protocoles pertinents, les adaptations nécessaires, les réponses immédiates ou différées, les facteurs associés à la récupération et les limites de la méthode.</w:t>
+              <w:t xml:space="preserve">L’objectif n’est pas de transformer chaque séance en protocole expérimental ni de tirer des conclusions causales à partir de simples observations. Il est de rendre la pratique plus traçable, plus comparable et plus facilement réévaluable. Grâce à </w:t>
+            </w:r>
+            <w:proofErr w:type="spellStart"/>
+            <w:r>
+              <w:rPr>
+                <w:lang w:val="fr-FR"/>
+              </w:rPr>
+              <w:t>SuiviPatient</w:t>
+            </w:r>
+            <w:proofErr w:type="spellEnd"/>
+            <w:r>
+              <w:rPr>
+                <w:lang w:val="fr-FR"/>
+              </w:rPr>
+              <w:t>, chaque praticien enrichit sa propre expérience et contribue à une dynamique collective : mieux identifier les protocoles pertinents, les adaptations nécessaires, les réponses immédiates ou différées, les facteurs associés à la récupération et les limites de la méthode.</w:t>
             </w:r>
             <w:r>
               <w:rPr>
@@ -1598,8 +2275,23 @@
               <w:rPr>
                 <w:lang w:val="fr-FR"/>
               </w:rPr>
+              <w:lastRenderedPageBreak/>
               <w:br/>
-              <w:t>Cette démarche respecte le consentement du patient, la confidentialité des informations et les règles applicables à la protection des données. Les lecteurs qui souhaitent se former, être certifiés ROP, rejoindre la communauté des praticiens ou utiliser gratuitement SuiviPatient dans leur pratique sont invités à nous contacter.</w:t>
+              <w:t xml:space="preserve">Cette démarche respecte le consentement du patient, la confidentialité des informations et les règles applicables à la protection des données. Les lecteurs qui souhaitent se former, être certifiés ROP, rejoindre la communauté des praticiens ou utiliser gratuitement </w:t>
+            </w:r>
+            <w:proofErr w:type="spellStart"/>
+            <w:r>
+              <w:rPr>
+                <w:lang w:val="fr-FR"/>
+              </w:rPr>
+              <w:t>SuiviPatient</w:t>
+            </w:r>
+            <w:proofErr w:type="spellEnd"/>
+            <w:r>
+              <w:rPr>
+                <w:lang w:val="fr-FR"/>
+              </w:rPr>
+              <w:t xml:space="preserve"> dans leur pratique sont invités à nous contacter.</w:t>
             </w:r>
             <w:r>
               <w:rPr>
@@ -1718,7 +2410,6 @@
         <w:rPr>
           <w:lang w:val="fr-FR"/>
         </w:rPr>
-        <w:lastRenderedPageBreak/>
         <w:t>2. Le péritoine</w:t>
       </w:r>
     </w:p>
@@ -1770,11 +2461,19 @@
           <w:lang w:val="fr-FR"/>
         </w:rPr>
       </w:pPr>
-      <w:r>
-        <w:rPr>
-          <w:lang w:val="fr-FR"/>
-        </w:rPr>
-        <w:t>dorsalement, à la place de « postérieurement » lorsque l’orientation corporelle le justifie ;</w:t>
+      <w:proofErr w:type="gramStart"/>
+      <w:r>
+        <w:rPr>
+          <w:lang w:val="fr-FR"/>
+        </w:rPr>
+        <w:t>dorsalement</w:t>
+      </w:r>
+      <w:proofErr w:type="gramEnd"/>
+      <w:r>
+        <w:rPr>
+          <w:lang w:val="fr-FR"/>
+        </w:rPr>
+        <w:t>, à la place de « postérieurement » lorsque l’orientation corporelle le justifie ;</w:t>
       </w:r>
     </w:p>
     <w:p>
@@ -1785,11 +2484,19 @@
           <w:lang w:val="fr-FR"/>
         </w:rPr>
       </w:pPr>
-      <w:r>
-        <w:rPr>
-          <w:lang w:val="fr-FR"/>
-        </w:rPr>
-        <w:t>ventralement, à la place de « antérieurement » ;</w:t>
+      <w:proofErr w:type="gramStart"/>
+      <w:r>
+        <w:rPr>
+          <w:lang w:val="fr-FR"/>
+        </w:rPr>
+        <w:t>ventralement</w:t>
+      </w:r>
+      <w:proofErr w:type="gramEnd"/>
+      <w:r>
+        <w:rPr>
+          <w:lang w:val="fr-FR"/>
+        </w:rPr>
+        <w:t>, à la place de « antérieurement » ;</w:t>
       </w:r>
     </w:p>
     <w:p>
@@ -1800,11 +2507,19 @@
           <w:lang w:val="fr-FR"/>
         </w:rPr>
       </w:pPr>
-      <w:r>
-        <w:rPr>
-          <w:lang w:val="fr-FR"/>
-        </w:rPr>
-        <w:t>latéralement, à la place de « extérieurement » ;</w:t>
+      <w:proofErr w:type="gramStart"/>
+      <w:r>
+        <w:rPr>
+          <w:lang w:val="fr-FR"/>
+        </w:rPr>
+        <w:t>latéralement</w:t>
+      </w:r>
+      <w:proofErr w:type="gramEnd"/>
+      <w:r>
+        <w:rPr>
+          <w:lang w:val="fr-FR"/>
+        </w:rPr>
+        <w:t>, à la place de « extérieurement » ;</w:t>
       </w:r>
     </w:p>
     <w:p>
@@ -1815,11 +2530,19 @@
           <w:lang w:val="fr-FR"/>
         </w:rPr>
       </w:pPr>
-      <w:r>
-        <w:rPr>
-          <w:lang w:val="fr-FR"/>
-        </w:rPr>
-        <w:t>médialement, à la place de « intérieurement » ;</w:t>
+      <w:proofErr w:type="gramStart"/>
+      <w:r>
+        <w:rPr>
+          <w:lang w:val="fr-FR"/>
+        </w:rPr>
+        <w:t>médialement</w:t>
+      </w:r>
+      <w:proofErr w:type="gramEnd"/>
+      <w:r>
+        <w:rPr>
+          <w:lang w:val="fr-FR"/>
+        </w:rPr>
+        <w:t>, à la place de « intérieurement » ;</w:t>
       </w:r>
     </w:p>
     <w:p>
@@ -1830,11 +2553,21 @@
           <w:lang w:val="fr-FR"/>
         </w:rPr>
       </w:pPr>
-      <w:r>
-        <w:rPr>
-          <w:lang w:val="fr-FR"/>
-        </w:rPr>
-        <w:t>céphaliquement, à la place de « vers le haut » ;</w:t>
+      <w:proofErr w:type="spellStart"/>
+      <w:proofErr w:type="gramStart"/>
+      <w:r>
+        <w:rPr>
+          <w:lang w:val="fr-FR"/>
+        </w:rPr>
+        <w:t>céphaliquement</w:t>
+      </w:r>
+      <w:proofErr w:type="spellEnd"/>
+      <w:proofErr w:type="gramEnd"/>
+      <w:r>
+        <w:rPr>
+          <w:lang w:val="fr-FR"/>
+        </w:rPr>
+        <w:t>, à la place de « vers le haut » ;</w:t>
       </w:r>
     </w:p>
     <w:p>
@@ -1845,11 +2578,19 @@
           <w:lang w:val="fr-FR"/>
         </w:rPr>
       </w:pPr>
-      <w:r>
-        <w:rPr>
-          <w:lang w:val="fr-FR"/>
-        </w:rPr>
-        <w:t>caudalement, à la place de « vers le bas » ;</w:t>
+      <w:proofErr w:type="gramStart"/>
+      <w:r>
+        <w:rPr>
+          <w:lang w:val="fr-FR"/>
+        </w:rPr>
+        <w:t>caudalement</w:t>
+      </w:r>
+      <w:proofErr w:type="gramEnd"/>
+      <w:r>
+        <w:rPr>
+          <w:lang w:val="fr-FR"/>
+        </w:rPr>
+        <w:t>, à la place de « vers le bas » ;</w:t>
       </w:r>
     </w:p>
     <w:p>
@@ -1860,11 +2601,19 @@
           <w:lang w:val="fr-FR"/>
         </w:rPr>
       </w:pPr>
-      <w:r>
-        <w:rPr>
-          <w:lang w:val="fr-FR"/>
-        </w:rPr>
-        <w:t>frontalement, pour décrire une orientation dans le plan frontal ;</w:t>
+      <w:proofErr w:type="gramStart"/>
+      <w:r>
+        <w:rPr>
+          <w:lang w:val="fr-FR"/>
+        </w:rPr>
+        <w:t>frontalement</w:t>
+      </w:r>
+      <w:proofErr w:type="gramEnd"/>
+      <w:r>
+        <w:rPr>
+          <w:lang w:val="fr-FR"/>
+        </w:rPr>
+        <w:t>, pour décrire une orientation dans le plan frontal ;</w:t>
       </w:r>
     </w:p>
     <w:p>
@@ -1875,11 +2624,19 @@
           <w:lang w:val="fr-FR"/>
         </w:rPr>
       </w:pPr>
-      <w:r>
-        <w:rPr>
-          <w:lang w:val="fr-FR"/>
-        </w:rPr>
-        <w:t>sagittalement, pour décrire une orientation dans le plan sagittal.</w:t>
+      <w:proofErr w:type="gramStart"/>
+      <w:r>
+        <w:rPr>
+          <w:lang w:val="fr-FR"/>
+        </w:rPr>
+        <w:t>sagittalement</w:t>
+      </w:r>
+      <w:proofErr w:type="gramEnd"/>
+      <w:r>
+        <w:rPr>
+          <w:lang w:val="fr-FR"/>
+        </w:rPr>
+        <w:t>, pour décrire une orientation dans le plan sagittal.</w:t>
       </w:r>
     </w:p>
     <w:p>
@@ -1893,6 +2650,7 @@
         <w:rPr>
           <w:lang w:val="fr-FR"/>
         </w:rPr>
+        <w:lastRenderedPageBreak/>
         <w:t>Plan-type des chapitres</w:t>
       </w:r>
     </w:p>
@@ -2123,115 +2881,143 @@
         <w:rPr>
           <w:lang w:val="fr-FR"/>
         </w:rPr>
+        <w:t>Zones réflexes podales</w:t>
+      </w:r>
+    </w:p>
+    <w:p>
+      <w:pPr>
+        <w:rPr>
+          <w:lang w:val="fr-FR"/>
+        </w:rPr>
+      </w:pPr>
+      <w:r>
+        <w:rPr>
+          <w:lang w:val="fr-FR"/>
+        </w:rPr>
+        <w:t>Relie autant que possible les repères de régulation générale, les voies neuro-végétatives, les interfaces loco-régionales et la cible viscérale spécifique.</w:t>
+      </w:r>
+    </w:p>
+    <w:p>
+      <w:pPr>
+        <w:pStyle w:val="Heading2"/>
+        <w:rPr>
+          <w:lang w:val="fr-FR"/>
+        </w:rPr>
+      </w:pPr>
+      <w:r>
+        <w:rPr>
+          <w:lang w:val="fr-FR"/>
+        </w:rPr>
+        <w:t xml:space="preserve">Relations </w:t>
+      </w:r>
+      <w:proofErr w:type="spellStart"/>
+      <w:r>
+        <w:rPr>
+          <w:lang w:val="fr-FR"/>
+        </w:rPr>
+        <w:t>viscéro</w:t>
+      </w:r>
+      <w:proofErr w:type="spellEnd"/>
+      <w:r>
+        <w:rPr>
+          <w:lang w:val="fr-FR"/>
+        </w:rPr>
+        <w:t>-somatiques</w:t>
+      </w:r>
+    </w:p>
+    <w:p>
+      <w:pPr>
+        <w:rPr>
+          <w:lang w:val="fr-FR"/>
+        </w:rPr>
+      </w:pPr>
+      <w:r>
+        <w:rPr>
+          <w:lang w:val="fr-FR"/>
+        </w:rPr>
+        <w:t>Décrit les liens possibles entre l’organe, les segments rachidiens, les muscles, les articulations et les territoires douloureux associés.</w:t>
+      </w:r>
+    </w:p>
+    <w:p>
+      <w:pPr>
+        <w:pStyle w:val="Heading2"/>
+        <w:rPr>
+          <w:lang w:val="fr-FR"/>
+        </w:rPr>
+      </w:pPr>
+      <w:r>
+        <w:rPr>
+          <w:lang w:val="fr-FR"/>
+        </w:rPr>
+        <w:t xml:space="preserve">Relations </w:t>
+      </w:r>
+      <w:proofErr w:type="spellStart"/>
+      <w:r>
+        <w:rPr>
+          <w:lang w:val="fr-FR"/>
+        </w:rPr>
+        <w:t>viscéro</w:t>
+      </w:r>
+      <w:proofErr w:type="spellEnd"/>
+      <w:r>
+        <w:rPr>
+          <w:lang w:val="fr-FR"/>
+        </w:rPr>
+        <w:t>-émotionnelles</w:t>
+      </w:r>
+    </w:p>
+    <w:p>
+      <w:pPr>
+        <w:rPr>
+          <w:lang w:val="fr-FR"/>
+        </w:rPr>
+      </w:pPr>
+      <w:r>
+        <w:rPr>
+          <w:lang w:val="fr-FR"/>
+        </w:rPr>
+        <w:t>Propose une lecture prudente des relations possibles entre les états émotionnels, la perception corporelle, la régulation autonome et les symptômes.</w:t>
+      </w:r>
+    </w:p>
+    <w:p>
+      <w:pPr>
+        <w:pStyle w:val="Heading2"/>
+        <w:rPr>
+          <w:lang w:val="fr-FR"/>
+        </w:rPr>
+      </w:pPr>
+      <w:r>
+        <w:rPr>
+          <w:lang w:val="fr-FR"/>
+        </w:rPr>
+        <w:t>Conseils</w:t>
+      </w:r>
+    </w:p>
+    <w:p>
+      <w:pPr>
+        <w:rPr>
+          <w:lang w:val="fr-FR"/>
+        </w:rPr>
+      </w:pPr>
+      <w:r>
+        <w:rPr>
+          <w:lang w:val="fr-FR"/>
+        </w:rPr>
+        <w:t>Complète la séance par des mesures simples et adaptées : repos relatif, hydratation, activité physique adaptée, alimentation, sommeil, suivi des symptômes et consultation médicale si nécessaire.</w:t>
+      </w:r>
+    </w:p>
+    <w:p>
+      <w:pPr>
+        <w:pStyle w:val="Heading1"/>
+        <w:rPr>
+          <w:lang w:val="fr-FR"/>
+        </w:rPr>
+      </w:pPr>
+      <w:r>
+        <w:rPr>
+          <w:lang w:val="fr-FR"/>
+        </w:rPr>
         <w:lastRenderedPageBreak/>
-        <w:t>Zones réflexes podales</w:t>
-      </w:r>
-    </w:p>
-    <w:p>
-      <w:pPr>
-        <w:rPr>
-          <w:lang w:val="fr-FR"/>
-        </w:rPr>
-      </w:pPr>
-      <w:r>
-        <w:rPr>
-          <w:lang w:val="fr-FR"/>
-        </w:rPr>
-        <w:t>Relie autant que possible les repères de régulation générale, les voies neuro-végétatives, les interfaces loco-régionales et la cible viscérale spécifique.</w:t>
-      </w:r>
-    </w:p>
-    <w:p>
-      <w:pPr>
-        <w:pStyle w:val="Heading2"/>
-        <w:rPr>
-          <w:lang w:val="fr-FR"/>
-        </w:rPr>
-      </w:pPr>
-      <w:r>
-        <w:rPr>
-          <w:lang w:val="fr-FR"/>
-        </w:rPr>
-        <w:t>Relations viscéro-somatiques</w:t>
-      </w:r>
-    </w:p>
-    <w:p>
-      <w:pPr>
-        <w:rPr>
-          <w:lang w:val="fr-FR"/>
-        </w:rPr>
-      </w:pPr>
-      <w:r>
-        <w:rPr>
-          <w:lang w:val="fr-FR"/>
-        </w:rPr>
-        <w:t>Décrit les liens possibles entre l’organe, les segments rachidiens, les muscles, les articulations et les territoires douloureux associés.</w:t>
-      </w:r>
-    </w:p>
-    <w:p>
-      <w:pPr>
-        <w:pStyle w:val="Heading2"/>
-        <w:rPr>
-          <w:lang w:val="fr-FR"/>
-        </w:rPr>
-      </w:pPr>
-      <w:r>
-        <w:rPr>
-          <w:lang w:val="fr-FR"/>
-        </w:rPr>
-        <w:t>Relations viscéro-émotionnelles</w:t>
-      </w:r>
-    </w:p>
-    <w:p>
-      <w:pPr>
-        <w:rPr>
-          <w:lang w:val="fr-FR"/>
-        </w:rPr>
-      </w:pPr>
-      <w:r>
-        <w:rPr>
-          <w:lang w:val="fr-FR"/>
-        </w:rPr>
-        <w:t>Propose une lecture prudente des relations possibles entre les états émotionnels, la perception corporelle, la régulation autonome et les symptômes.</w:t>
-      </w:r>
-    </w:p>
-    <w:p>
-      <w:pPr>
-        <w:pStyle w:val="Heading2"/>
-        <w:rPr>
-          <w:lang w:val="fr-FR"/>
-        </w:rPr>
-      </w:pPr>
-      <w:r>
-        <w:rPr>
-          <w:lang w:val="fr-FR"/>
-        </w:rPr>
-        <w:t>Conseils</w:t>
-      </w:r>
-    </w:p>
-    <w:p>
-      <w:pPr>
-        <w:rPr>
-          <w:lang w:val="fr-FR"/>
-        </w:rPr>
-      </w:pPr>
-      <w:r>
-        <w:rPr>
-          <w:lang w:val="fr-FR"/>
-        </w:rPr>
-        <w:t>Complète la séance par des mesures simples et adaptées : repos relatif, hydratation, activité physique adaptée, alimentation, sommeil, suivi des symptômes et consultation médicale si nécessaire.</w:t>
-      </w:r>
-    </w:p>
-    <w:p>
-      <w:pPr>
-        <w:pStyle w:val="Heading1"/>
-        <w:rPr>
-          <w:lang w:val="fr-FR"/>
-        </w:rPr>
-      </w:pPr>
-      <w:r>
-        <w:rPr>
-          <w:lang w:val="fr-FR"/>
-        </w:rPr>
         <w:t>Observer, mesurer et réévaluer</w:t>
       </w:r>
     </w:p>
@@ -2261,36 +3047,99 @@
         <w:pStyle w:val="ListBullet"/>
         <w:spacing w:after="40"/>
       </w:pPr>
-      <w:r>
-        <w:t>symptôme principal ;</w:t>
-      </w:r>
+      <w:proofErr w:type="spellStart"/>
+      <w:r>
+        <w:t>symptôme</w:t>
+      </w:r>
+      <w:proofErr w:type="spellEnd"/>
+      <w:r>
+        <w:t xml:space="preserve"> </w:t>
+      </w:r>
+      <w:proofErr w:type="gramStart"/>
+      <w:r>
+        <w:t>principal ;</w:t>
+      </w:r>
+      <w:proofErr w:type="gramEnd"/>
     </w:p>
     <w:p>
       <w:pPr>
         <w:pStyle w:val="ListBullet"/>
         <w:spacing w:after="40"/>
       </w:pPr>
-      <w:r>
-        <w:t>intensité et ancienneté ;</w:t>
-      </w:r>
+      <w:proofErr w:type="spellStart"/>
+      <w:r>
+        <w:t>intensité</w:t>
+      </w:r>
+      <w:proofErr w:type="spellEnd"/>
+      <w:r>
+        <w:t xml:space="preserve"> et </w:t>
+      </w:r>
+      <w:proofErr w:type="spellStart"/>
+      <w:proofErr w:type="gramStart"/>
+      <w:r>
+        <w:t>ancienneté</w:t>
+      </w:r>
+      <w:proofErr w:type="spellEnd"/>
+      <w:r>
+        <w:t xml:space="preserve"> ;</w:t>
+      </w:r>
+      <w:proofErr w:type="gramEnd"/>
     </w:p>
     <w:p>
       <w:pPr>
         <w:pStyle w:val="ListBullet"/>
         <w:spacing w:after="40"/>
       </w:pPr>
-      <w:r>
-        <w:t>retentissement fonctionnel ;</w:t>
-      </w:r>
+      <w:proofErr w:type="spellStart"/>
+      <w:r>
+        <w:t>retentissement</w:t>
+      </w:r>
+      <w:proofErr w:type="spellEnd"/>
+      <w:r>
+        <w:t xml:space="preserve"> </w:t>
+      </w:r>
+      <w:proofErr w:type="spellStart"/>
+      <w:proofErr w:type="gramStart"/>
+      <w:r>
+        <w:t>fonctionnel</w:t>
+      </w:r>
+      <w:proofErr w:type="spellEnd"/>
+      <w:r>
+        <w:t xml:space="preserve"> ;</w:t>
+      </w:r>
+      <w:proofErr w:type="gramEnd"/>
     </w:p>
     <w:p>
       <w:pPr>
         <w:pStyle w:val="ListBullet"/>
         <w:spacing w:after="40"/>
       </w:pPr>
-      <w:r>
-        <w:t>facteurs aggravants ou améliorants ;</w:t>
-      </w:r>
+      <w:proofErr w:type="spellStart"/>
+      <w:r>
+        <w:t>facteurs</w:t>
+      </w:r>
+      <w:proofErr w:type="spellEnd"/>
+      <w:r>
+        <w:t xml:space="preserve"> </w:t>
+      </w:r>
+      <w:proofErr w:type="spellStart"/>
+      <w:r>
+        <w:t>aggravants</w:t>
+      </w:r>
+      <w:proofErr w:type="spellEnd"/>
+      <w:r>
+        <w:t xml:space="preserve"> ou </w:t>
+      </w:r>
+      <w:proofErr w:type="spellStart"/>
+      <w:proofErr w:type="gramStart"/>
+      <w:r>
+        <w:t>améliorants</w:t>
+      </w:r>
+      <w:proofErr w:type="spellEnd"/>
+      <w:r>
+        <w:t xml:space="preserve"> ;</w:t>
+      </w:r>
+      <w:proofErr w:type="gramEnd"/>
     </w:p>
     <w:p>
       <w:pPr>
@@ -2300,11 +3149,19 @@
           <w:lang w:val="fr-FR"/>
         </w:rPr>
       </w:pPr>
-      <w:r>
-        <w:rPr>
-          <w:lang w:val="fr-FR"/>
-        </w:rPr>
-        <w:t>sommeil, transit, fatigue, mobilité, activité ou fonction viscérale.</w:t>
+      <w:proofErr w:type="gramStart"/>
+      <w:r>
+        <w:rPr>
+          <w:lang w:val="fr-FR"/>
+        </w:rPr>
+        <w:t>sommeil</w:t>
+      </w:r>
+      <w:proofErr w:type="gramEnd"/>
+      <w:r>
+        <w:rPr>
+          <w:lang w:val="fr-FR"/>
+        </w:rPr>
+        <w:t>, transit, fatigue, mobilité, activité ou fonction viscérale.</w:t>
       </w:r>
     </w:p>
     <w:p>
@@ -2320,9 +3177,19 @@
         <w:pStyle w:val="ListBullet"/>
         <w:spacing w:after="40"/>
       </w:pPr>
-      <w:r>
-        <w:t>tolérance au toucher ;</w:t>
-      </w:r>
+      <w:proofErr w:type="spellStart"/>
+      <w:r>
+        <w:t>tolérance</w:t>
+      </w:r>
+      <w:proofErr w:type="spellEnd"/>
+      <w:r>
+        <w:t xml:space="preserve"> au </w:t>
+      </w:r>
+      <w:proofErr w:type="gramStart"/>
+      <w:r>
+        <w:t>toucher ;</w:t>
+      </w:r>
+      <w:proofErr w:type="gramEnd"/>
     </w:p>
     <w:p>
       <w:pPr>
@@ -2330,43 +3197,88 @@
         <w:spacing w:after="40"/>
       </w:pPr>
       <w:r>
-        <w:t>modifications du tonus ;</w:t>
-      </w:r>
+        <w:t xml:space="preserve">modifications du </w:t>
+      </w:r>
+      <w:proofErr w:type="gramStart"/>
+      <w:r>
+        <w:t>tonus ;</w:t>
+      </w:r>
+      <w:proofErr w:type="gramEnd"/>
     </w:p>
     <w:p>
       <w:pPr>
         <w:pStyle w:val="ListBullet"/>
         <w:spacing w:after="40"/>
       </w:pPr>
+      <w:proofErr w:type="gramStart"/>
       <w:r>
         <w:t>respiration ;</w:t>
       </w:r>
+      <w:proofErr w:type="gramEnd"/>
     </w:p>
     <w:p>
       <w:pPr>
         <w:pStyle w:val="ListBullet"/>
         <w:spacing w:after="40"/>
       </w:pPr>
-      <w:r>
-        <w:t>réactions végétatives ;</w:t>
-      </w:r>
+      <w:proofErr w:type="spellStart"/>
+      <w:r>
+        <w:t>réactions</w:t>
+      </w:r>
+      <w:proofErr w:type="spellEnd"/>
+      <w:r>
+        <w:t xml:space="preserve"> </w:t>
+      </w:r>
+      <w:proofErr w:type="spellStart"/>
+      <w:proofErr w:type="gramStart"/>
+      <w:r>
+        <w:t>végétatives</w:t>
+      </w:r>
+      <w:proofErr w:type="spellEnd"/>
+      <w:r>
+        <w:t xml:space="preserve"> ;</w:t>
+      </w:r>
+      <w:proofErr w:type="gramEnd"/>
     </w:p>
     <w:p>
       <w:pPr>
         <w:pStyle w:val="ListBullet"/>
         <w:spacing w:after="40"/>
       </w:pPr>
-      <w:r>
-        <w:t>évolution des tests ;</w:t>
-      </w:r>
+      <w:proofErr w:type="spellStart"/>
+      <w:r>
+        <w:t>évolution</w:t>
+      </w:r>
+      <w:proofErr w:type="spellEnd"/>
+      <w:r>
+        <w:t xml:space="preserve"> des </w:t>
+      </w:r>
+      <w:proofErr w:type="gramStart"/>
+      <w:r>
+        <w:t>tests ;</w:t>
+      </w:r>
+      <w:proofErr w:type="gramEnd"/>
     </w:p>
     <w:p>
       <w:pPr>
         <w:pStyle w:val="ListBullet"/>
         <w:spacing w:after="40"/>
       </w:pPr>
-      <w:r>
-        <w:t>signes inhabituels.</w:t>
+      <w:proofErr w:type="spellStart"/>
+      <w:r>
+        <w:t>signes</w:t>
+      </w:r>
+      <w:proofErr w:type="spellEnd"/>
+      <w:r>
+        <w:t xml:space="preserve"> </w:t>
+      </w:r>
+      <w:proofErr w:type="spellStart"/>
+      <w:r>
+        <w:t>inhabituels</w:t>
+      </w:r>
+      <w:proofErr w:type="spellEnd"/>
+      <w:r>
+        <w:t>.</w:t>
       </w:r>
     </w:p>
     <w:p>
@@ -2388,36 +3300,75 @@
         <w:pStyle w:val="ListBullet"/>
         <w:spacing w:after="40"/>
       </w:pPr>
-      <w:r>
-        <w:t>symptôme principal ;</w:t>
-      </w:r>
+      <w:proofErr w:type="spellStart"/>
+      <w:r>
+        <w:t>symptôme</w:t>
+      </w:r>
+      <w:proofErr w:type="spellEnd"/>
+      <w:r>
+        <w:t xml:space="preserve"> </w:t>
+      </w:r>
+      <w:proofErr w:type="gramStart"/>
+      <w:r>
+        <w:t>principal ;</w:t>
+      </w:r>
+      <w:proofErr w:type="gramEnd"/>
     </w:p>
     <w:p>
       <w:pPr>
         <w:pStyle w:val="ListBullet"/>
         <w:spacing w:after="40"/>
       </w:pPr>
-      <w:r>
-        <w:t>douleur ou gêne ;</w:t>
-      </w:r>
+      <w:proofErr w:type="spellStart"/>
+      <w:r>
+        <w:t>douleur</w:t>
+      </w:r>
+      <w:proofErr w:type="spellEnd"/>
+      <w:r>
+        <w:t xml:space="preserve"> ou </w:t>
+      </w:r>
+      <w:proofErr w:type="spellStart"/>
+      <w:proofErr w:type="gramStart"/>
+      <w:r>
+        <w:t>gêne</w:t>
+      </w:r>
+      <w:proofErr w:type="spellEnd"/>
+      <w:r>
+        <w:t xml:space="preserve"> ;</w:t>
+      </w:r>
+      <w:proofErr w:type="gramEnd"/>
     </w:p>
     <w:p>
       <w:pPr>
         <w:pStyle w:val="ListBullet"/>
         <w:spacing w:after="40"/>
       </w:pPr>
-      <w:r>
-        <w:t>mobilité ;</w:t>
-      </w:r>
+      <w:proofErr w:type="spellStart"/>
+      <w:proofErr w:type="gramStart"/>
+      <w:r>
+        <w:t>mobilité</w:t>
+      </w:r>
+      <w:proofErr w:type="spellEnd"/>
+      <w:r>
+        <w:t xml:space="preserve"> ;</w:t>
+      </w:r>
+      <w:proofErr w:type="gramEnd"/>
     </w:p>
     <w:p>
       <w:pPr>
         <w:pStyle w:val="ListBullet"/>
         <w:spacing w:after="40"/>
       </w:pPr>
-      <w:r>
-        <w:t>sommeil ;</w:t>
-      </w:r>
+      <w:proofErr w:type="spellStart"/>
+      <w:proofErr w:type="gramStart"/>
+      <w:r>
+        <w:t>sommeil</w:t>
+      </w:r>
+      <w:proofErr w:type="spellEnd"/>
+      <w:r>
+        <w:t xml:space="preserve"> ;</w:t>
+      </w:r>
+      <w:proofErr w:type="gramEnd"/>
     </w:p>
     <w:p>
       <w:pPr>
@@ -2425,26 +3376,53 @@
         <w:spacing w:after="40"/>
       </w:pPr>
       <w:r>
-        <w:t>transit et diurèse ;</w:t>
-      </w:r>
+        <w:t xml:space="preserve">transit et </w:t>
+      </w:r>
+      <w:proofErr w:type="spellStart"/>
+      <w:proofErr w:type="gramStart"/>
+      <w:r>
+        <w:t>diurèse</w:t>
+      </w:r>
+      <w:proofErr w:type="spellEnd"/>
+      <w:r>
+        <w:t xml:space="preserve"> ;</w:t>
+      </w:r>
+      <w:proofErr w:type="gramEnd"/>
     </w:p>
     <w:p>
       <w:pPr>
         <w:pStyle w:val="ListBullet"/>
         <w:spacing w:after="40"/>
       </w:pPr>
+      <w:proofErr w:type="gramStart"/>
       <w:r>
         <w:t>fatigue ;</w:t>
       </w:r>
+      <w:proofErr w:type="gramEnd"/>
     </w:p>
     <w:p>
       <w:pPr>
         <w:pStyle w:val="ListBullet"/>
         <w:spacing w:after="40"/>
       </w:pPr>
-      <w:r>
-        <w:t>capacités fonctionnelles ;</w:t>
-      </w:r>
+      <w:proofErr w:type="spellStart"/>
+      <w:r>
+        <w:t>capacités</w:t>
+      </w:r>
+      <w:proofErr w:type="spellEnd"/>
+      <w:r>
+        <w:t xml:space="preserve"> </w:t>
+      </w:r>
+      <w:proofErr w:type="spellStart"/>
+      <w:proofErr w:type="gramStart"/>
+      <w:r>
+        <w:t>fonctionnelles</w:t>
+      </w:r>
+      <w:proofErr w:type="spellEnd"/>
+      <w:r>
+        <w:t xml:space="preserve"> ;</w:t>
+      </w:r>
+      <w:proofErr w:type="gramEnd"/>
     </w:p>
     <w:p>
       <w:pPr>
@@ -2454,11 +3432,19 @@
           <w:lang w:val="fr-FR"/>
         </w:rPr>
       </w:pPr>
-      <w:r>
-        <w:rPr>
-          <w:lang w:val="fr-FR"/>
-        </w:rPr>
-        <w:t>durée et cinétique de la récupération.</w:t>
+      <w:proofErr w:type="gramStart"/>
+      <w:r>
+        <w:rPr>
+          <w:lang w:val="fr-FR"/>
+        </w:rPr>
+        <w:t>durée</w:t>
+      </w:r>
+      <w:proofErr w:type="gramEnd"/>
+      <w:r>
+        <w:rPr>
+          <w:lang w:val="fr-FR"/>
+        </w:rPr>
+        <w:t xml:space="preserve"> et cinétique de la récupération.</w:t>
       </w:r>
     </w:p>
     <w:p>
@@ -2485,7 +3471,6 @@
         <w:rPr>
           <w:lang w:val="fr-FR"/>
         </w:rPr>
-        <w:lastRenderedPageBreak/>
         <w:t>À retenir</w:t>
       </w:r>
     </w:p>
@@ -2497,8 +3482,50 @@
         <w:t xml:space="preserve">Ce troisième volume ne présente pas seulement une nouvelle série de cartographies viscérales. </w:t>
       </w:r>
       <w:r>
-        <w:t>Il propose une lecture clinique organisée selon quatre niveaux :</w:t>
-      </w:r>
+        <w:t xml:space="preserve">Il propose </w:t>
+      </w:r>
+      <w:proofErr w:type="spellStart"/>
+      <w:r>
+        <w:t>une</w:t>
+      </w:r>
+      <w:proofErr w:type="spellEnd"/>
+      <w:r>
+        <w:t xml:space="preserve"> lecture </w:t>
+      </w:r>
+      <w:proofErr w:type="spellStart"/>
+      <w:r>
+        <w:t>clinique</w:t>
+      </w:r>
+      <w:proofErr w:type="spellEnd"/>
+      <w:r>
+        <w:t xml:space="preserve"> </w:t>
+      </w:r>
+      <w:proofErr w:type="spellStart"/>
+      <w:r>
+        <w:t>organisée</w:t>
+      </w:r>
+      <w:proofErr w:type="spellEnd"/>
+      <w:r>
+        <w:t xml:space="preserve"> </w:t>
+      </w:r>
+      <w:proofErr w:type="spellStart"/>
+      <w:r>
+        <w:t>selon</w:t>
+      </w:r>
+      <w:proofErr w:type="spellEnd"/>
+      <w:r>
+        <w:t xml:space="preserve"> quatre </w:t>
+      </w:r>
+      <w:proofErr w:type="spellStart"/>
+      <w:proofErr w:type="gramStart"/>
+      <w:r>
+        <w:t>niveaux</w:t>
+      </w:r>
+      <w:proofErr w:type="spellEnd"/>
+      <w:r>
+        <w:t xml:space="preserve"> :</w:t>
+      </w:r>
+      <w:proofErr w:type="gramEnd"/>
     </w:p>
     <w:p>
       <w:pPr>
@@ -2508,11 +3535,19 @@
           <w:lang w:val="fr-FR"/>
         </w:rPr>
       </w:pPr>
-      <w:r>
-        <w:rPr>
-          <w:lang w:val="fr-FR"/>
-        </w:rPr>
-        <w:t>le système nerveux central, premier niveau de régulation ;</w:t>
+      <w:proofErr w:type="gramStart"/>
+      <w:r>
+        <w:rPr>
+          <w:lang w:val="fr-FR"/>
+        </w:rPr>
+        <w:t>le</w:t>
+      </w:r>
+      <w:proofErr w:type="gramEnd"/>
+      <w:r>
+        <w:rPr>
+          <w:lang w:val="fr-FR"/>
+        </w:rPr>
+        <w:t xml:space="preserve"> système nerveux central, premier niveau de régulation ;</w:t>
       </w:r>
     </w:p>
     <w:p>
@@ -2523,11 +3558,19 @@
           <w:lang w:val="fr-FR"/>
         </w:rPr>
       </w:pPr>
-      <w:r>
-        <w:rPr>
-          <w:lang w:val="fr-FR"/>
-        </w:rPr>
-        <w:t>le système nerveux autonome, deuxième niveau de transmission et de modulation ;</w:t>
+      <w:proofErr w:type="gramStart"/>
+      <w:r>
+        <w:rPr>
+          <w:lang w:val="fr-FR"/>
+        </w:rPr>
+        <w:t>le</w:t>
+      </w:r>
+      <w:proofErr w:type="gramEnd"/>
+      <w:r>
+        <w:rPr>
+          <w:lang w:val="fr-FR"/>
+        </w:rPr>
+        <w:t xml:space="preserve"> système nerveux autonome, deuxième niveau de transmission et de modulation ;</w:t>
       </w:r>
     </w:p>
     <w:p>
@@ -2538,11 +3581,19 @@
           <w:lang w:val="fr-FR"/>
         </w:rPr>
       </w:pPr>
-      <w:r>
-        <w:rPr>
-          <w:lang w:val="fr-FR"/>
-        </w:rPr>
-        <w:t>les cavités et interfaces loco-régionales, troisième niveau ;</w:t>
+      <w:proofErr w:type="gramStart"/>
+      <w:r>
+        <w:rPr>
+          <w:lang w:val="fr-FR"/>
+        </w:rPr>
+        <w:t>les</w:t>
+      </w:r>
+      <w:proofErr w:type="gramEnd"/>
+      <w:r>
+        <w:rPr>
+          <w:lang w:val="fr-FR"/>
+        </w:rPr>
+        <w:t xml:space="preserve"> cavités et interfaces loco-régionales, troisième niveau ;</w:t>
       </w:r>
     </w:p>
     <w:p>
@@ -2553,11 +3604,19 @@
           <w:lang w:val="fr-FR"/>
         </w:rPr>
       </w:pPr>
-      <w:r>
-        <w:rPr>
-          <w:lang w:val="fr-FR"/>
-        </w:rPr>
-        <w:t>l’organe ou la fonction ciblés, quatrième niveau.</w:t>
+      <w:proofErr w:type="gramStart"/>
+      <w:r>
+        <w:rPr>
+          <w:lang w:val="fr-FR"/>
+        </w:rPr>
+        <w:t>l’organe</w:t>
+      </w:r>
+      <w:proofErr w:type="gramEnd"/>
+      <w:r>
+        <w:rPr>
+          <w:lang w:val="fr-FR"/>
+        </w:rPr>
+        <w:t xml:space="preserve"> ou la fonction ciblés, quatrième niveau.</w:t>
       </w:r>
     </w:p>
     <w:p>
@@ -2635,11 +3694,12 @@
         <w:rPr>
           <w:lang w:val="fr-FR"/>
         </w:rPr>
+        <w:lastRenderedPageBreak/>
         <w:t>C’est cette continuité qui donne à l’ensemble du troisième ouvrage sa cohérence clinique et pédagogique.</w:t>
       </w:r>
     </w:p>
     <w:sectPr>
-      <w:footerReference w:type="default" r:id="rId9"/>
+      <w:footerReference w:type="default" r:id="rId10"/>
       <w:pgSz w:w="12240" w:h="15840"/>
       <w:pgMar w:top="964" w:right="1134" w:bottom="964" w:left="1134" w:header="720" w:footer="720" w:gutter="0"/>
       <w:cols w:space="720"/>
@@ -2681,12 +3741,21 @@
       <w:pStyle w:val="Footer"/>
       <w:jc w:val="center"/>
     </w:pPr>
+    <w:proofErr w:type="spellStart"/>
     <w:r>
       <w:rPr>
         <w:color w:val="6F8F89"/>
         <w:sz w:val="16"/>
       </w:rPr>
-      <w:t>Chapitre 0 — Introduction | Réflexothérapie occipito-podale</w:t>
+      <w:t>Chapitre</w:t>
+    </w:r>
+    <w:proofErr w:type="spellEnd"/>
+    <w:r>
+      <w:rPr>
+        <w:color w:val="6F8F89"/>
+        <w:sz w:val="16"/>
+      </w:rPr>
+      <w:t xml:space="preserve"> 0 — Introduction | Réflexothérapie occipito-podale</w:t>
     </w:r>
   </w:p>
 </w:ftr>

</xml_diff>

<commit_message>
Update Chapter 18 slides and introduction figure
</commit_message>
<xml_diff>
--- a/public/chapter-0/Chapter0_Introduction_ROP_pret_a_publier.docx
+++ b/public/chapter-0/Chapter0_Introduction_ROP_pret_a_publier.docx
@@ -2641,6 +2641,144 @@
     </w:p>
     <w:p>
       <w:pPr>
+        <w:pStyle w:val="ListBullet"/>
+        <w:numPr>
+          <w:ilvl w:val="0"/>
+          <w:numId w:val="0"/>
+        </w:numPr>
+        <w:spacing w:after="40"/>
+        <w:ind w:left="360" w:hanging="360"/>
+        <w:rPr>
+          <w:lang w:val="fr-FR"/>
+        </w:rPr>
+      </w:pPr>
+    </w:p>
+    <w:p>
+      <w:pPr>
+        <w:pStyle w:val="ListBullet"/>
+        <w:numPr>
+          <w:ilvl w:val="0"/>
+          <w:numId w:val="0"/>
+        </w:numPr>
+        <w:spacing w:after="40"/>
+        <w:ind w:left="360" w:hanging="360"/>
+        <w:rPr>
+          <w:lang w:val="fr-FR"/>
+        </w:rPr>
+      </w:pPr>
+    </w:p>
+    <w:p>
+      <w:pPr>
+        <w:pStyle w:val="ListBullet"/>
+        <w:numPr>
+          <w:ilvl w:val="0"/>
+          <w:numId w:val="0"/>
+        </w:numPr>
+        <w:spacing w:after="40"/>
+        <w:ind w:left="360" w:hanging="360"/>
+        <w:rPr>
+          <w:lang w:val="fr-FR"/>
+        </w:rPr>
+      </w:pPr>
+    </w:p>
+    <w:p>
+      <w:pPr>
+        <w:pStyle w:val="ListBullet"/>
+        <w:numPr>
+          <w:ilvl w:val="0"/>
+          <w:numId w:val="0"/>
+        </w:numPr>
+        <w:spacing w:after="40"/>
+        <w:ind w:left="360" w:hanging="360"/>
+        <w:rPr>
+          <w:lang w:val="fr-FR"/>
+        </w:rPr>
+      </w:pPr>
+    </w:p>
+    <w:p>
+      <w:pPr>
+        <w:pStyle w:val="ListBullet"/>
+        <w:numPr>
+          <w:ilvl w:val="0"/>
+          <w:numId w:val="0"/>
+        </w:numPr>
+        <w:spacing w:after="40"/>
+        <w:ind w:left="360" w:hanging="360"/>
+      </w:pPr>
+      <w:r>
+        <w:drawing>
+          <wp:inline distT="0" distB="0" distL="0" distR="0" wp14:anchorId="6F94D435" wp14:editId="15554DA9">
+            <wp:extent cx="6332220" cy="3563620"/>
+            <wp:effectExtent l="0" t="0" r="0" b="0"/>
+            <wp:docPr id="3" name="Picture 2">
+              <a:extLst xmlns:a="http://schemas.openxmlformats.org/drawingml/2006/main">
+                <a:ext uri="{FF2B5EF4-FFF2-40B4-BE49-F238E27FC236}">
+                  <a16:creationId xmlns:a16="http://schemas.microsoft.com/office/drawing/2014/main" id="{3D380C1A-C1E5-BA60-9F5A-810824C7376F}"/>
+                </a:ext>
+              </a:extLst>
+            </wp:docPr>
+            <wp:cNvGraphicFramePr>
+              <a:graphicFrameLocks xmlns:a="http://schemas.openxmlformats.org/drawingml/2006/main" noChangeAspect="1"/>
+            </wp:cNvGraphicFramePr>
+            <a:graphic xmlns:a="http://schemas.openxmlformats.org/drawingml/2006/main">
+              <a:graphicData uri="http://schemas.openxmlformats.org/drawingml/2006/picture">
+                <pic:pic xmlns:pic="http://schemas.openxmlformats.org/drawingml/2006/picture">
+                  <pic:nvPicPr>
+                    <pic:cNvPr id="3" name="Picture 2">
+                      <a:extLst>
+                        <a:ext uri="{FF2B5EF4-FFF2-40B4-BE49-F238E27FC236}">
+                          <a16:creationId xmlns:a16="http://schemas.microsoft.com/office/drawing/2014/main" id="{3D380C1A-C1E5-BA60-9F5A-810824C7376F}"/>
+                        </a:ext>
+                      </a:extLst>
+                    </pic:cNvPr>
+                    <pic:cNvPicPr>
+                      <a:picLocks noChangeAspect="1"/>
+                    </pic:cNvPicPr>
+                  </pic:nvPicPr>
+                  <pic:blipFill>
+                    <a:blip r:embed="rId10">
+                      <a:extLst>
+                        <a:ext uri="{28A0092B-C50C-407E-A947-70E740481C1C}">
+                          <a14:useLocalDpi xmlns:a14="http://schemas.microsoft.com/office/drawing/2010/main" val="0"/>
+                        </a:ext>
+                      </a:extLst>
+                    </a:blip>
+                    <a:stretch>
+                      <a:fillRect/>
+                    </a:stretch>
+                  </pic:blipFill>
+                  <pic:spPr>
+                    <a:xfrm>
+                      <a:off x="0" y="0"/>
+                      <a:ext cx="6332220" cy="3563620"/>
+                    </a:xfrm>
+                    <a:prstGeom prst="rect">
+                      <a:avLst/>
+                    </a:prstGeom>
+                  </pic:spPr>
+                </pic:pic>
+              </a:graphicData>
+            </a:graphic>
+          </wp:inline>
+        </w:drawing>
+      </w:r>
+    </w:p>
+    <w:p>
+      <w:pPr>
+        <w:pStyle w:val="ListBullet"/>
+        <w:numPr>
+          <w:ilvl w:val="0"/>
+          <w:numId w:val="0"/>
+        </w:numPr>
+        <w:spacing w:after="40"/>
+        <w:ind w:left="360" w:hanging="360"/>
+        <w:rPr>
+          <w:lang w:val="fr-FR"/>
+        </w:rPr>
+      </w:pPr>
+    </w:p>
+    <w:p>
+      <w:pPr>
         <w:pStyle w:val="Heading1"/>
         <w:rPr>
           <w:lang w:val="fr-FR"/>
@@ -2650,8 +2788,224 @@
         <w:rPr>
           <w:lang w:val="fr-FR"/>
         </w:rPr>
+        <w:t>Plan-type des chapitres</w:t>
+      </w:r>
+    </w:p>
+    <w:p>
+      <w:pPr>
+        <w:pStyle w:val="Heading2"/>
+        <w:rPr>
+          <w:lang w:val="fr-FR"/>
+        </w:rPr>
+      </w:pPr>
+      <w:r>
+        <w:rPr>
+          <w:lang w:val="fr-FR"/>
+        </w:rPr>
+        <w:t>Présentation</w:t>
+      </w:r>
+    </w:p>
+    <w:p>
+      <w:pPr>
+        <w:rPr>
+          <w:lang w:val="fr-FR"/>
+        </w:rPr>
+      </w:pPr>
+      <w:r>
+        <w:rPr>
+          <w:lang w:val="fr-FR"/>
+        </w:rPr>
+        <w:t>Situe l’organe dans le raisonnement général du livre et précise son intérêt clinique.</w:t>
+      </w:r>
+    </w:p>
+    <w:p>
+      <w:pPr>
+        <w:pStyle w:val="Heading2"/>
+        <w:rPr>
+          <w:lang w:val="fr-FR"/>
+        </w:rPr>
+      </w:pPr>
+      <w:r>
+        <w:rPr>
+          <w:lang w:val="fr-FR"/>
+        </w:rPr>
+        <w:t>Situation</w:t>
+      </w:r>
+    </w:p>
+    <w:p>
+      <w:pPr>
+        <w:rPr>
+          <w:lang w:val="fr-FR"/>
+        </w:rPr>
+      </w:pPr>
+      <w:r>
+        <w:rPr>
+          <w:lang w:val="fr-FR"/>
+        </w:rPr>
+        <w:t>Localise l’organe dans la cavité concernée et définit ses principaux repères.</w:t>
+      </w:r>
+    </w:p>
+    <w:p>
+      <w:pPr>
+        <w:pStyle w:val="Heading2"/>
+        <w:rPr>
+          <w:lang w:val="fr-FR"/>
+        </w:rPr>
+      </w:pPr>
+      <w:r>
+        <w:rPr>
+          <w:lang w:val="fr-FR"/>
+        </w:rPr>
+        <w:t>Anatomie</w:t>
+      </w:r>
+    </w:p>
+    <w:p>
+      <w:pPr>
+        <w:rPr>
+          <w:lang w:val="fr-FR"/>
+        </w:rPr>
+      </w:pPr>
+      <w:r>
+        <w:rPr>
+          <w:lang w:val="fr-FR"/>
+        </w:rPr>
+        <w:t>Décrit sa forme, ses parties constitutives et ses caractéristiques essentielles.</w:t>
+      </w:r>
+    </w:p>
+    <w:p>
+      <w:pPr>
+        <w:pStyle w:val="Heading2"/>
+        <w:rPr>
+          <w:lang w:val="fr-FR"/>
+        </w:rPr>
+      </w:pPr>
+      <w:r>
+        <w:rPr>
+          <w:lang w:val="fr-FR"/>
+        </w:rPr>
+        <w:t>Rapports</w:t>
+      </w:r>
+    </w:p>
+    <w:p>
+      <w:pPr>
+        <w:rPr>
+          <w:lang w:val="fr-FR"/>
+        </w:rPr>
+      </w:pPr>
+      <w:r>
+        <w:rPr>
+          <w:lang w:val="fr-FR"/>
+        </w:rPr>
+        <w:t>Présente les relations avec les organes voisins, les parois, les fascias, les muscles, les ligaments et les structures vasculo-nerveuses.</w:t>
+      </w:r>
+    </w:p>
+    <w:p>
+      <w:pPr>
+        <w:pStyle w:val="Heading2"/>
+        <w:rPr>
+          <w:lang w:val="fr-FR"/>
+        </w:rPr>
+      </w:pPr>
+      <w:r>
+        <w:rPr>
+          <w:lang w:val="fr-FR"/>
+        </w:rPr>
+        <w:t>Vascularisation</w:t>
+      </w:r>
+    </w:p>
+    <w:p>
+      <w:pPr>
+        <w:rPr>
+          <w:lang w:val="fr-FR"/>
+        </w:rPr>
+      </w:pPr>
+      <w:r>
+        <w:rPr>
+          <w:lang w:val="fr-FR"/>
+        </w:rPr>
+        <w:t>Décrit les principaux axes artériels, veineux et, lorsque cela est pertinent, lymphatiques.</w:t>
+      </w:r>
+    </w:p>
+    <w:p>
+      <w:pPr>
+        <w:pStyle w:val="Heading2"/>
+        <w:rPr>
+          <w:lang w:val="fr-FR"/>
+        </w:rPr>
+      </w:pPr>
+      <w:r>
+        <w:rPr>
+          <w:lang w:val="fr-FR"/>
+        </w:rPr>
+        <w:t>Innervation</w:t>
+      </w:r>
+    </w:p>
+    <w:p>
+      <w:pPr>
+        <w:rPr>
+          <w:lang w:val="fr-FR"/>
+        </w:rPr>
+      </w:pPr>
+      <w:r>
+        <w:rPr>
+          <w:lang w:val="fr-FR"/>
+        </w:rPr>
+        <w:t>Présente les voies sympathiques et parasympathiques, les plexus, les afférences viscérales et les niveaux médullaires associés.</w:t>
+      </w:r>
+    </w:p>
+    <w:p>
+      <w:pPr>
+        <w:pStyle w:val="Heading2"/>
+        <w:rPr>
+          <w:lang w:val="fr-FR"/>
+        </w:rPr>
+      </w:pPr>
+      <w:r>
+        <w:rPr>
+          <w:lang w:val="fr-FR"/>
+        </w:rPr>
+        <w:t>Physiologie</w:t>
+      </w:r>
+    </w:p>
+    <w:p>
+      <w:pPr>
+        <w:rPr>
+          <w:lang w:val="fr-FR"/>
+        </w:rPr>
+      </w:pPr>
+      <w:r>
+        <w:rPr>
+          <w:lang w:val="fr-FR"/>
+        </w:rPr>
+        <w:t>Rappelle les fonctions principales de l’organe et leur régulation.</w:t>
+      </w:r>
+    </w:p>
+    <w:p>
+      <w:pPr>
+        <w:pStyle w:val="Heading2"/>
+        <w:rPr>
+          <w:lang w:val="fr-FR"/>
+        </w:rPr>
+      </w:pPr>
+      <w:r>
+        <w:rPr>
+          <w:lang w:val="fr-FR"/>
+        </w:rPr>
         <w:lastRenderedPageBreak/>
-        <w:t>Plan-type des chapitres</w:t>
+        <w:t>Pathologies courantes</w:t>
+      </w:r>
+    </w:p>
+    <w:p>
+      <w:pPr>
+        <w:rPr>
+          <w:lang w:val="fr-FR"/>
+        </w:rPr>
+      </w:pPr>
+      <w:r>
+        <w:rPr>
+          <w:lang w:val="fr-FR"/>
+        </w:rPr>
+        <w:t>Fournit des repères de compréhension et de prudence. La ROP ne se substitue pas au diagnostic médical.</w:t>
       </w:r>
     </w:p>
     <w:p>
@@ -2665,20 +3019,20 @@
         <w:rPr>
           <w:lang w:val="fr-FR"/>
         </w:rPr>
-        <w:t>Présentation</w:t>
-      </w:r>
-    </w:p>
-    <w:p>
-      <w:pPr>
-        <w:rPr>
-          <w:lang w:val="fr-FR"/>
-        </w:rPr>
-      </w:pPr>
-      <w:r>
-        <w:rPr>
-          <w:lang w:val="fr-FR"/>
-        </w:rPr>
-        <w:t>Situe l’organe dans le raisonnement général du livre et précise son intérêt clinique.</w:t>
+        <w:t>Zones réflexes podales</w:t>
+      </w:r>
+    </w:p>
+    <w:p>
+      <w:pPr>
+        <w:rPr>
+          <w:lang w:val="fr-FR"/>
+        </w:rPr>
+      </w:pPr>
+      <w:r>
+        <w:rPr>
+          <w:lang w:val="fr-FR"/>
+        </w:rPr>
+        <w:t>Relie autant que possible les repères de régulation générale, les voies neuro-végétatives, les interfaces loco-régionales et la cible viscérale spécifique.</w:t>
       </w:r>
     </w:p>
     <w:p>
@@ -2692,20 +3046,34 @@
         <w:rPr>
           <w:lang w:val="fr-FR"/>
         </w:rPr>
-        <w:t>Situation</w:t>
-      </w:r>
-    </w:p>
-    <w:p>
-      <w:pPr>
-        <w:rPr>
-          <w:lang w:val="fr-FR"/>
-        </w:rPr>
-      </w:pPr>
-      <w:r>
-        <w:rPr>
-          <w:lang w:val="fr-FR"/>
-        </w:rPr>
-        <w:t>Localise l’organe dans la cavité concernée et définit ses principaux repères.</w:t>
+        <w:t xml:space="preserve">Relations </w:t>
+      </w:r>
+      <w:proofErr w:type="spellStart"/>
+      <w:r>
+        <w:rPr>
+          <w:lang w:val="fr-FR"/>
+        </w:rPr>
+        <w:t>viscéro</w:t>
+      </w:r>
+      <w:proofErr w:type="spellEnd"/>
+      <w:r>
+        <w:rPr>
+          <w:lang w:val="fr-FR"/>
+        </w:rPr>
+        <w:t>-somatiques</w:t>
+      </w:r>
+    </w:p>
+    <w:p>
+      <w:pPr>
+        <w:rPr>
+          <w:lang w:val="fr-FR"/>
+        </w:rPr>
+      </w:pPr>
+      <w:r>
+        <w:rPr>
+          <w:lang w:val="fr-FR"/>
+        </w:rPr>
+        <w:t>Décrit les liens possibles entre l’organe, les segments rachidiens, les muscles, les articulations et les territoires douloureux associés.</w:t>
       </w:r>
     </w:p>
     <w:p>
@@ -2719,20 +3087,34 @@
         <w:rPr>
           <w:lang w:val="fr-FR"/>
         </w:rPr>
-        <w:t>Anatomie</w:t>
-      </w:r>
-    </w:p>
-    <w:p>
-      <w:pPr>
-        <w:rPr>
-          <w:lang w:val="fr-FR"/>
-        </w:rPr>
-      </w:pPr>
-      <w:r>
-        <w:rPr>
-          <w:lang w:val="fr-FR"/>
-        </w:rPr>
-        <w:t>Décrit sa forme, ses parties constitutives et ses caractéristiques essentielles.</w:t>
+        <w:t xml:space="preserve">Relations </w:t>
+      </w:r>
+      <w:proofErr w:type="spellStart"/>
+      <w:r>
+        <w:rPr>
+          <w:lang w:val="fr-FR"/>
+        </w:rPr>
+        <w:t>viscéro</w:t>
+      </w:r>
+      <w:proofErr w:type="spellEnd"/>
+      <w:r>
+        <w:rPr>
+          <w:lang w:val="fr-FR"/>
+        </w:rPr>
+        <w:t>-émotionnelles</w:t>
+      </w:r>
+    </w:p>
+    <w:p>
+      <w:pPr>
+        <w:rPr>
+          <w:lang w:val="fr-FR"/>
+        </w:rPr>
+      </w:pPr>
+      <w:r>
+        <w:rPr>
+          <w:lang w:val="fr-FR"/>
+        </w:rPr>
+        <w:t>Propose une lecture prudente des relations possibles entre les états émotionnels, la perception corporelle, la régulation autonome et les symptômes.</w:t>
       </w:r>
     </w:p>
     <w:p>
@@ -2746,250 +3128,6 @@
         <w:rPr>
           <w:lang w:val="fr-FR"/>
         </w:rPr>
-        <w:t>Rapports</w:t>
-      </w:r>
-    </w:p>
-    <w:p>
-      <w:pPr>
-        <w:rPr>
-          <w:lang w:val="fr-FR"/>
-        </w:rPr>
-      </w:pPr>
-      <w:r>
-        <w:rPr>
-          <w:lang w:val="fr-FR"/>
-        </w:rPr>
-        <w:t>Présente les relations avec les organes voisins, les parois, les fascias, les muscles, les ligaments et les structures vasculo-nerveuses.</w:t>
-      </w:r>
-    </w:p>
-    <w:p>
-      <w:pPr>
-        <w:pStyle w:val="Heading2"/>
-        <w:rPr>
-          <w:lang w:val="fr-FR"/>
-        </w:rPr>
-      </w:pPr>
-      <w:r>
-        <w:rPr>
-          <w:lang w:val="fr-FR"/>
-        </w:rPr>
-        <w:t>Vascularisation</w:t>
-      </w:r>
-    </w:p>
-    <w:p>
-      <w:pPr>
-        <w:rPr>
-          <w:lang w:val="fr-FR"/>
-        </w:rPr>
-      </w:pPr>
-      <w:r>
-        <w:rPr>
-          <w:lang w:val="fr-FR"/>
-        </w:rPr>
-        <w:t>Décrit les principaux axes artériels, veineux et, lorsque cela est pertinent, lymphatiques.</w:t>
-      </w:r>
-    </w:p>
-    <w:p>
-      <w:pPr>
-        <w:pStyle w:val="Heading2"/>
-        <w:rPr>
-          <w:lang w:val="fr-FR"/>
-        </w:rPr>
-      </w:pPr>
-      <w:r>
-        <w:rPr>
-          <w:lang w:val="fr-FR"/>
-        </w:rPr>
-        <w:t>Innervation</w:t>
-      </w:r>
-    </w:p>
-    <w:p>
-      <w:pPr>
-        <w:rPr>
-          <w:lang w:val="fr-FR"/>
-        </w:rPr>
-      </w:pPr>
-      <w:r>
-        <w:rPr>
-          <w:lang w:val="fr-FR"/>
-        </w:rPr>
-        <w:t>Présente les voies sympathiques et parasympathiques, les plexus, les afférences viscérales et les niveaux médullaires associés.</w:t>
-      </w:r>
-    </w:p>
-    <w:p>
-      <w:pPr>
-        <w:pStyle w:val="Heading2"/>
-        <w:rPr>
-          <w:lang w:val="fr-FR"/>
-        </w:rPr>
-      </w:pPr>
-      <w:r>
-        <w:rPr>
-          <w:lang w:val="fr-FR"/>
-        </w:rPr>
-        <w:t>Physiologie</w:t>
-      </w:r>
-    </w:p>
-    <w:p>
-      <w:pPr>
-        <w:rPr>
-          <w:lang w:val="fr-FR"/>
-        </w:rPr>
-      </w:pPr>
-      <w:r>
-        <w:rPr>
-          <w:lang w:val="fr-FR"/>
-        </w:rPr>
-        <w:t>Rappelle les fonctions principales de l’organe et leur régulation.</w:t>
-      </w:r>
-    </w:p>
-    <w:p>
-      <w:pPr>
-        <w:pStyle w:val="Heading2"/>
-        <w:rPr>
-          <w:lang w:val="fr-FR"/>
-        </w:rPr>
-      </w:pPr>
-      <w:r>
-        <w:rPr>
-          <w:lang w:val="fr-FR"/>
-        </w:rPr>
-        <w:t>Pathologies courantes</w:t>
-      </w:r>
-    </w:p>
-    <w:p>
-      <w:pPr>
-        <w:rPr>
-          <w:lang w:val="fr-FR"/>
-        </w:rPr>
-      </w:pPr>
-      <w:r>
-        <w:rPr>
-          <w:lang w:val="fr-FR"/>
-        </w:rPr>
-        <w:t>Fournit des repères de compréhension et de prudence. La ROP ne se substitue pas au diagnostic médical.</w:t>
-      </w:r>
-    </w:p>
-    <w:p>
-      <w:pPr>
-        <w:pStyle w:val="Heading2"/>
-        <w:rPr>
-          <w:lang w:val="fr-FR"/>
-        </w:rPr>
-      </w:pPr>
-      <w:r>
-        <w:rPr>
-          <w:lang w:val="fr-FR"/>
-        </w:rPr>
-        <w:t>Zones réflexes podales</w:t>
-      </w:r>
-    </w:p>
-    <w:p>
-      <w:pPr>
-        <w:rPr>
-          <w:lang w:val="fr-FR"/>
-        </w:rPr>
-      </w:pPr>
-      <w:r>
-        <w:rPr>
-          <w:lang w:val="fr-FR"/>
-        </w:rPr>
-        <w:t>Relie autant que possible les repères de régulation générale, les voies neuro-végétatives, les interfaces loco-régionales et la cible viscérale spécifique.</w:t>
-      </w:r>
-    </w:p>
-    <w:p>
-      <w:pPr>
-        <w:pStyle w:val="Heading2"/>
-        <w:rPr>
-          <w:lang w:val="fr-FR"/>
-        </w:rPr>
-      </w:pPr>
-      <w:r>
-        <w:rPr>
-          <w:lang w:val="fr-FR"/>
-        </w:rPr>
-        <w:t xml:space="preserve">Relations </w:t>
-      </w:r>
-      <w:proofErr w:type="spellStart"/>
-      <w:r>
-        <w:rPr>
-          <w:lang w:val="fr-FR"/>
-        </w:rPr>
-        <w:t>viscéro</w:t>
-      </w:r>
-      <w:proofErr w:type="spellEnd"/>
-      <w:r>
-        <w:rPr>
-          <w:lang w:val="fr-FR"/>
-        </w:rPr>
-        <w:t>-somatiques</w:t>
-      </w:r>
-    </w:p>
-    <w:p>
-      <w:pPr>
-        <w:rPr>
-          <w:lang w:val="fr-FR"/>
-        </w:rPr>
-      </w:pPr>
-      <w:r>
-        <w:rPr>
-          <w:lang w:val="fr-FR"/>
-        </w:rPr>
-        <w:t>Décrit les liens possibles entre l’organe, les segments rachidiens, les muscles, les articulations et les territoires douloureux associés.</w:t>
-      </w:r>
-    </w:p>
-    <w:p>
-      <w:pPr>
-        <w:pStyle w:val="Heading2"/>
-        <w:rPr>
-          <w:lang w:val="fr-FR"/>
-        </w:rPr>
-      </w:pPr>
-      <w:r>
-        <w:rPr>
-          <w:lang w:val="fr-FR"/>
-        </w:rPr>
-        <w:t xml:space="preserve">Relations </w:t>
-      </w:r>
-      <w:proofErr w:type="spellStart"/>
-      <w:r>
-        <w:rPr>
-          <w:lang w:val="fr-FR"/>
-        </w:rPr>
-        <w:t>viscéro</w:t>
-      </w:r>
-      <w:proofErr w:type="spellEnd"/>
-      <w:r>
-        <w:rPr>
-          <w:lang w:val="fr-FR"/>
-        </w:rPr>
-        <w:t>-émotionnelles</w:t>
-      </w:r>
-    </w:p>
-    <w:p>
-      <w:pPr>
-        <w:rPr>
-          <w:lang w:val="fr-FR"/>
-        </w:rPr>
-      </w:pPr>
-      <w:r>
-        <w:rPr>
-          <w:lang w:val="fr-FR"/>
-        </w:rPr>
-        <w:t>Propose une lecture prudente des relations possibles entre les états émotionnels, la perception corporelle, la régulation autonome et les symptômes.</w:t>
-      </w:r>
-    </w:p>
-    <w:p>
-      <w:pPr>
-        <w:pStyle w:val="Heading2"/>
-        <w:rPr>
-          <w:lang w:val="fr-FR"/>
-        </w:rPr>
-      </w:pPr>
-      <w:r>
-        <w:rPr>
-          <w:lang w:val="fr-FR"/>
-        </w:rPr>
         <w:t>Conseils</w:t>
       </w:r>
     </w:p>
@@ -3017,7 +3155,6 @@
         <w:rPr>
           <w:lang w:val="fr-FR"/>
         </w:rPr>
-        <w:lastRenderedPageBreak/>
         <w:t>Observer, mesurer et réévaluer</w:t>
       </w:r>
     </w:p>
@@ -3437,6 +3574,7 @@
         <w:rPr>
           <w:lang w:val="fr-FR"/>
         </w:rPr>
+        <w:lastRenderedPageBreak/>
         <w:t>durée</w:t>
       </w:r>
       <w:proofErr w:type="gramEnd"/>
@@ -3694,12 +3832,11 @@
         <w:rPr>
           <w:lang w:val="fr-FR"/>
         </w:rPr>
-        <w:lastRenderedPageBreak/>
         <w:t>C’est cette continuité qui donne à l’ensemble du troisième ouvrage sa cohérence clinique et pédagogique.</w:t>
       </w:r>
     </w:p>
     <w:sectPr>
-      <w:footerReference w:type="default" r:id="rId10"/>
+      <w:footerReference w:type="default" r:id="rId11"/>
       <w:pgSz w:w="12240" w:h="15840"/>
       <w:pgMar w:top="964" w:right="1134" w:bottom="964" w:left="1134" w:header="720" w:footer="720" w:gutter="0"/>
       <w:cols w:space="720"/>
@@ -4600,7 +4737,6 @@
   <w:style w:type="character" w:default="1" w:styleId="DefaultParagraphFont">
     <w:name w:val="Default Paragraph Font"/>
     <w:uiPriority w:val="1"/>
-    <w:semiHidden/>
     <w:unhideWhenUsed/>
   </w:style>
   <w:style w:type="table" w:default="1" w:styleId="TableNormal">

</xml_diff>

<commit_message>
Update Chapter 0 terminology figure
</commit_message>
<xml_diff>
--- a/public/chapter-0/Chapter0_Introduction_ROP_pret_a_publier.docx
+++ b/public/chapter-0/Chapter0_Introduction_ROP_pret_a_publier.docx
@@ -108,21 +108,7 @@
         <w:rPr>
           <w:lang w:val="fr-FR"/>
         </w:rPr>
-        <w:t xml:space="preserve">Une lecture simple des relations </w:t>
-      </w:r>
-      <w:proofErr w:type="spellStart"/>
-      <w:r>
-        <w:rPr>
-          <w:lang w:val="fr-FR"/>
-        </w:rPr>
-        <w:t>viscéro</w:t>
-      </w:r>
-      <w:proofErr w:type="spellEnd"/>
-      <w:r>
-        <w:rPr>
-          <w:lang w:val="fr-FR"/>
-        </w:rPr>
-        <w:t>-somatiques : comment un viscère peut influencer le système locomoteur et, inversement, comment une contrainte somatique peut retentir sur la fonction viscérale.</w:t>
+        <w:t>Une lecture simple des relations viscéro-somatiques : comment un viscère peut influencer le système locomoteur et, inversement, comment une contrainte somatique peut retentir sur la fonction viscérale.</w:t>
       </w:r>
     </w:p>
     <w:p>
@@ -398,21 +384,7 @@
         <w:rPr>
           <w:lang w:val="fr-FR"/>
         </w:rPr>
-        <w:t xml:space="preserve">Le premier niveau concerne le système nerveux central. Il rassemble les structures qui participent à l’intégration des informations sensorielles et viscérales, à l’organisation des réponses adaptatives, à la modulation de la douleur, aux réponses émotionnelles, aux fonctions </w:t>
-      </w:r>
-      <w:proofErr w:type="spellStart"/>
-      <w:r>
-        <w:rPr>
-          <w:lang w:val="fr-FR"/>
-        </w:rPr>
-        <w:t>neuro-endocrines</w:t>
-      </w:r>
-      <w:proofErr w:type="spellEnd"/>
-      <w:r>
-        <w:rPr>
-          <w:lang w:val="fr-FR"/>
-        </w:rPr>
-        <w:t>, à la vigilance, au sommeil, à la récupération et à la coordination des réponses autonomes.</w:t>
+        <w:t>Le premier niveau concerne le système nerveux central. Il rassemble les structures qui participent à l’intégration des informations sensorielles et viscérales, à l’organisation des réponses adaptatives, à la modulation de la douleur, aux réponses émotionnelles, aux fonctions neuro-endocrines, à la vigilance, au sommeil, à la récupération et à la coordination des réponses autonomes.</w:t>
       </w:r>
     </w:p>
     <w:p>
@@ -421,35 +393,26 @@
         <w:spacing w:after="40"/>
       </w:pPr>
       <w:r>
-        <w:t xml:space="preserve">Tronc </w:t>
-      </w:r>
-      <w:proofErr w:type="spellStart"/>
-      <w:r>
-        <w:t>cérébral</w:t>
-      </w:r>
-      <w:proofErr w:type="spellEnd"/>
+        <w:t>Tronc cérébral</w:t>
+      </w:r>
     </w:p>
     <w:p>
       <w:pPr>
         <w:pStyle w:val="ListBullet"/>
         <w:spacing w:after="40"/>
       </w:pPr>
-      <w:proofErr w:type="spellStart"/>
       <w:r>
         <w:t>Cervelet</w:t>
       </w:r>
-      <w:proofErr w:type="spellEnd"/>
     </w:p>
     <w:p>
       <w:pPr>
         <w:pStyle w:val="ListBullet"/>
         <w:spacing w:after="40"/>
       </w:pPr>
-      <w:proofErr w:type="spellStart"/>
       <w:r>
         <w:t>Diencéphale</w:t>
       </w:r>
-      <w:proofErr w:type="spellEnd"/>
     </w:p>
     <w:p>
       <w:pPr>
@@ -457,32 +420,17 @@
         <w:spacing w:after="40"/>
       </w:pPr>
       <w:r>
-        <w:t xml:space="preserve">Système </w:t>
-      </w:r>
-      <w:proofErr w:type="spellStart"/>
-      <w:r>
-        <w:t>limbique</w:t>
-      </w:r>
-      <w:proofErr w:type="spellEnd"/>
+        <w:t>Système limbique</w:t>
+      </w:r>
     </w:p>
     <w:p>
       <w:pPr>
         <w:pStyle w:val="ListBullet"/>
         <w:spacing w:after="40"/>
       </w:pPr>
-      <w:proofErr w:type="spellStart"/>
-      <w:r>
-        <w:t>Noyaux</w:t>
-      </w:r>
-      <w:proofErr w:type="spellEnd"/>
-      <w:r>
-        <w:t xml:space="preserve"> gris </w:t>
-      </w:r>
-      <w:proofErr w:type="spellStart"/>
-      <w:r>
-        <w:t>centraux</w:t>
-      </w:r>
-      <w:proofErr w:type="spellEnd"/>
+      <w:r>
+        <w:t>Noyaux gris centraux</w:t>
+      </w:r>
     </w:p>
     <w:p>
       <w:pPr>
@@ -490,13 +438,8 @@
         <w:spacing w:after="40"/>
       </w:pPr>
       <w:r>
-        <w:t xml:space="preserve">Membranes </w:t>
-      </w:r>
-      <w:proofErr w:type="spellStart"/>
-      <w:r>
-        <w:t>intracrâniennes</w:t>
-      </w:r>
-      <w:proofErr w:type="spellEnd"/>
+        <w:t>Membranes intracrâniennes</w:t>
+      </w:r>
     </w:p>
     <w:p>
       <w:pPr>
@@ -504,13 +447,8 @@
         <w:spacing w:after="40"/>
       </w:pPr>
       <w:r>
-        <w:t xml:space="preserve">Environnement neuro-méningé et </w:t>
-      </w:r>
-      <w:proofErr w:type="spellStart"/>
-      <w:r>
-        <w:t>neurovasculaire</w:t>
-      </w:r>
-      <w:proofErr w:type="spellEnd"/>
+        <w:t>Environnement neuro-méningé et neurovasculaire</w:t>
+      </w:r>
     </w:p>
     <w:p>
       <w:pPr>
@@ -557,38 +495,18 @@
         <w:pStyle w:val="ListBullet"/>
         <w:spacing w:after="40"/>
       </w:pPr>
-      <w:proofErr w:type="spellStart"/>
-      <w:r>
-        <w:t>Voies</w:t>
-      </w:r>
-      <w:proofErr w:type="spellEnd"/>
-      <w:r>
-        <w:t xml:space="preserve"> </w:t>
-      </w:r>
-      <w:proofErr w:type="spellStart"/>
-      <w:r>
-        <w:t>sympathiques</w:t>
-      </w:r>
-      <w:proofErr w:type="spellEnd"/>
+      <w:r>
+        <w:t>Voies sympathiques</w:t>
+      </w:r>
     </w:p>
     <w:p>
       <w:pPr>
         <w:pStyle w:val="ListBullet"/>
         <w:spacing w:after="40"/>
       </w:pPr>
-      <w:proofErr w:type="spellStart"/>
-      <w:r>
-        <w:t>Voies</w:t>
-      </w:r>
-      <w:proofErr w:type="spellEnd"/>
-      <w:r>
-        <w:t xml:space="preserve"> </w:t>
-      </w:r>
-      <w:proofErr w:type="spellStart"/>
-      <w:r>
-        <w:t>parasympathiques</w:t>
-      </w:r>
-      <w:proofErr w:type="spellEnd"/>
+      <w:r>
+        <w:t>Voies parasympathiques</w:t>
+      </w:r>
     </w:p>
     <w:p>
       <w:pPr>
@@ -605,13 +523,8 @@
         <w:pStyle w:val="ListBullet"/>
         <w:spacing w:after="40"/>
       </w:pPr>
-      <w:proofErr w:type="spellStart"/>
-      <w:r>
-        <w:t>Parasympathique</w:t>
-      </w:r>
-      <w:proofErr w:type="spellEnd"/>
-      <w:r>
-        <w:t xml:space="preserve"> sacré</w:t>
+      <w:r>
+        <w:t>Parasympathique sacré</w:t>
       </w:r>
     </w:p>
     <w:p>
@@ -619,19 +532,9 @@
         <w:pStyle w:val="ListBullet"/>
         <w:spacing w:after="40"/>
       </w:pPr>
-      <w:proofErr w:type="spellStart"/>
-      <w:r>
-        <w:t>Chaînes</w:t>
-      </w:r>
-      <w:proofErr w:type="spellEnd"/>
-      <w:r>
-        <w:t xml:space="preserve"> </w:t>
-      </w:r>
-      <w:proofErr w:type="spellStart"/>
-      <w:r>
-        <w:t>ganglionnaires</w:t>
-      </w:r>
-      <w:proofErr w:type="spellEnd"/>
+      <w:r>
+        <w:t>Chaînes ganglionnaires</w:t>
+      </w:r>
     </w:p>
     <w:p>
       <w:pPr>
@@ -639,13 +542,8 @@
         <w:spacing w:after="40"/>
       </w:pPr>
       <w:r>
-        <w:t xml:space="preserve">Nerfs </w:t>
-      </w:r>
-      <w:proofErr w:type="spellStart"/>
-      <w:r>
-        <w:t>splanchniques</w:t>
-      </w:r>
-      <w:proofErr w:type="spellEnd"/>
+        <w:t>Nerfs splanchniques</w:t>
+      </w:r>
     </w:p>
     <w:p>
       <w:pPr>
@@ -653,15 +551,7 @@
         <w:spacing w:after="40"/>
       </w:pPr>
       <w:r>
-        <w:t xml:space="preserve">Plexus </w:t>
-      </w:r>
-      <w:proofErr w:type="spellStart"/>
-      <w:r>
-        <w:t>prévertébraux</w:t>
-      </w:r>
-      <w:proofErr w:type="spellEnd"/>
-      <w:r>
-        <w:t xml:space="preserve"> et préviscéraux</w:t>
+        <w:t>Plexus prévertébraux et préviscéraux</w:t>
       </w:r>
     </w:p>
     <w:p>
@@ -670,13 +560,8 @@
         <w:spacing w:after="40"/>
       </w:pPr>
       <w:r>
-        <w:t xml:space="preserve">Plexus </w:t>
-      </w:r>
-      <w:proofErr w:type="spellStart"/>
-      <w:r>
-        <w:t>pelviens</w:t>
-      </w:r>
-      <w:proofErr w:type="spellEnd"/>
+        <w:t>Plexus pelviens</w:t>
+      </w:r>
     </w:p>
     <w:p>
       <w:pPr>
@@ -684,21 +569,8 @@
         <w:spacing w:after="40"/>
       </w:pPr>
       <w:r>
-        <w:t xml:space="preserve">Système </w:t>
-      </w:r>
-      <w:proofErr w:type="spellStart"/>
-      <w:r>
-        <w:t>nerveux</w:t>
-      </w:r>
-      <w:proofErr w:type="spellEnd"/>
-      <w:r>
-        <w:t xml:space="preserve"> </w:t>
-      </w:r>
-      <w:proofErr w:type="spellStart"/>
-      <w:r>
-        <w:t>entérique</w:t>
-      </w:r>
-      <w:proofErr w:type="spellEnd"/>
+        <w:t>Système nerveux entérique</w:t>
+      </w:r>
     </w:p>
     <w:p>
       <w:pPr>
@@ -745,49 +617,27 @@
         <w:pStyle w:val="ListBullet"/>
         <w:spacing w:after="40"/>
       </w:pPr>
-      <w:proofErr w:type="spellStart"/>
-      <w:r>
-        <w:t>Cavités</w:t>
-      </w:r>
-      <w:proofErr w:type="spellEnd"/>
-      <w:r>
-        <w:t xml:space="preserve"> </w:t>
-      </w:r>
-      <w:proofErr w:type="spellStart"/>
-      <w:r>
-        <w:t>abdominale</w:t>
-      </w:r>
-      <w:proofErr w:type="spellEnd"/>
-      <w:r>
-        <w:t xml:space="preserve"> et </w:t>
-      </w:r>
-      <w:proofErr w:type="spellStart"/>
-      <w:r>
-        <w:t>pelvienne</w:t>
-      </w:r>
-      <w:proofErr w:type="spellEnd"/>
+      <w:r>
+        <w:t>Cavités abdominale et pelvienne</w:t>
+      </w:r>
     </w:p>
     <w:p>
       <w:pPr>
         <w:pStyle w:val="ListBullet"/>
         <w:spacing w:after="40"/>
       </w:pPr>
-      <w:proofErr w:type="spellStart"/>
       <w:r>
         <w:t>Diaphragme</w:t>
       </w:r>
-      <w:proofErr w:type="spellEnd"/>
     </w:p>
     <w:p>
       <w:pPr>
         <w:pStyle w:val="ListBullet"/>
         <w:spacing w:after="40"/>
       </w:pPr>
-      <w:proofErr w:type="spellStart"/>
       <w:r>
         <w:t>Péritoine</w:t>
       </w:r>
-      <w:proofErr w:type="spellEnd"/>
     </w:p>
     <w:p>
       <w:pPr>
@@ -803,19 +653,9 @@
         <w:pStyle w:val="ListBullet"/>
         <w:spacing w:after="40"/>
       </w:pPr>
-      <w:proofErr w:type="spellStart"/>
-      <w:r>
-        <w:t>Mésos</w:t>
-      </w:r>
-      <w:proofErr w:type="spellEnd"/>
-      <w:r>
-        <w:t xml:space="preserve"> et ligaments </w:t>
-      </w:r>
-      <w:proofErr w:type="spellStart"/>
-      <w:r>
-        <w:t>viscéraux</w:t>
-      </w:r>
-      <w:proofErr w:type="spellEnd"/>
+      <w:r>
+        <w:t>Mésos et ligaments viscéraux</w:t>
+      </w:r>
     </w:p>
     <w:p>
       <w:pPr>
@@ -823,21 +663,8 @@
         <w:spacing w:after="40"/>
       </w:pPr>
       <w:r>
-        <w:t xml:space="preserve">Muscles et </w:t>
-      </w:r>
-      <w:proofErr w:type="spellStart"/>
-      <w:r>
-        <w:t>charnières</w:t>
-      </w:r>
-      <w:proofErr w:type="spellEnd"/>
-      <w:r>
-        <w:t xml:space="preserve"> </w:t>
-      </w:r>
-      <w:proofErr w:type="spellStart"/>
-      <w:r>
-        <w:t>vertébrales</w:t>
-      </w:r>
-      <w:proofErr w:type="spellEnd"/>
+        <w:t>Muscles et charnières vertébrales</w:t>
+      </w:r>
     </w:p>
     <w:p>
       <w:pPr>
@@ -845,13 +672,8 @@
         <w:spacing w:after="40"/>
       </w:pPr>
       <w:r>
-        <w:t xml:space="preserve">Passages </w:t>
-      </w:r>
-      <w:proofErr w:type="spellStart"/>
-      <w:r>
-        <w:t>neurovasculaires</w:t>
-      </w:r>
-      <w:proofErr w:type="spellEnd"/>
+        <w:t>Passages neurovasculaires</w:t>
+      </w:r>
     </w:p>
     <w:p>
       <w:pPr>
@@ -859,13 +681,8 @@
         <w:spacing w:after="40"/>
       </w:pPr>
       <w:r>
-        <w:t xml:space="preserve">Plexus </w:t>
-      </w:r>
-      <w:proofErr w:type="spellStart"/>
-      <w:r>
-        <w:t>régionaux</w:t>
-      </w:r>
-      <w:proofErr w:type="spellEnd"/>
+        <w:t>Plexus régionaux</w:t>
+      </w:r>
     </w:p>
     <w:p>
       <w:pPr>
@@ -912,19 +729,9 @@
         <w:pStyle w:val="ListBullet"/>
         <w:spacing w:after="40"/>
       </w:pPr>
-      <w:proofErr w:type="spellStart"/>
-      <w:r>
-        <w:t>Estomac</w:t>
-      </w:r>
-      <w:proofErr w:type="spellEnd"/>
-      <w:r>
-        <w:t xml:space="preserve"> et </w:t>
-      </w:r>
-      <w:proofErr w:type="spellStart"/>
-      <w:r>
-        <w:t>duodénum</w:t>
-      </w:r>
-      <w:proofErr w:type="spellEnd"/>
+      <w:r>
+        <w:t>Estomac et duodénum</w:t>
+      </w:r>
     </w:p>
     <w:p>
       <w:pPr>
@@ -932,34 +739,16 @@
         <w:spacing w:after="40"/>
       </w:pPr>
       <w:r>
-        <w:t xml:space="preserve">Foie et </w:t>
-      </w:r>
-      <w:proofErr w:type="spellStart"/>
-      <w:r>
-        <w:t>voies</w:t>
-      </w:r>
-      <w:proofErr w:type="spellEnd"/>
-      <w:r>
-        <w:t xml:space="preserve"> </w:t>
-      </w:r>
-      <w:proofErr w:type="spellStart"/>
-      <w:r>
-        <w:t>biliaires</w:t>
-      </w:r>
-      <w:proofErr w:type="spellEnd"/>
+        <w:t>Foie et voies biliaires</w:t>
+      </w:r>
     </w:p>
     <w:p>
       <w:pPr>
         <w:pStyle w:val="ListBullet"/>
         <w:spacing w:after="40"/>
       </w:pPr>
-      <w:proofErr w:type="spellStart"/>
-      <w:r>
-        <w:t>Pancréas</w:t>
-      </w:r>
-      <w:proofErr w:type="spellEnd"/>
-      <w:r>
-        <w:t xml:space="preserve"> et rate</w:t>
+      <w:r>
+        <w:t>Pancréas et rate</w:t>
       </w:r>
     </w:p>
     <w:p>
@@ -967,29 +756,8 @@
         <w:pStyle w:val="ListBullet"/>
         <w:spacing w:after="40"/>
       </w:pPr>
-      <w:proofErr w:type="spellStart"/>
-      <w:r>
-        <w:t>Intestin</w:t>
-      </w:r>
-      <w:proofErr w:type="spellEnd"/>
-      <w:r>
-        <w:t xml:space="preserve"> </w:t>
-      </w:r>
-      <w:proofErr w:type="spellStart"/>
-      <w:r>
-        <w:t>grêle</w:t>
-      </w:r>
-      <w:proofErr w:type="spellEnd"/>
-      <w:r>
-        <w:t xml:space="preserve">, </w:t>
-      </w:r>
-      <w:proofErr w:type="spellStart"/>
-      <w:r>
-        <w:t>côlon</w:t>
-      </w:r>
-      <w:proofErr w:type="spellEnd"/>
-      <w:r>
-        <w:t xml:space="preserve"> et rectum</w:t>
+      <w:r>
+        <w:t>Intestin grêle, côlon et rectum</w:t>
       </w:r>
     </w:p>
     <w:p>
@@ -998,32 +766,17 @@
         <w:spacing w:after="40"/>
       </w:pPr>
       <w:r>
-        <w:t xml:space="preserve">Reins et </w:t>
-      </w:r>
-      <w:proofErr w:type="spellStart"/>
-      <w:r>
-        <w:t>vessie</w:t>
-      </w:r>
-      <w:proofErr w:type="spellEnd"/>
+        <w:t>Reins et vessie</w:t>
+      </w:r>
     </w:p>
     <w:p>
       <w:pPr>
         <w:pStyle w:val="ListBullet"/>
         <w:spacing w:after="40"/>
       </w:pPr>
-      <w:proofErr w:type="spellStart"/>
-      <w:r>
-        <w:t>Organes</w:t>
-      </w:r>
-      <w:proofErr w:type="spellEnd"/>
-      <w:r>
-        <w:t xml:space="preserve"> </w:t>
-      </w:r>
-      <w:proofErr w:type="spellStart"/>
-      <w:r>
-        <w:t>génitaux</w:t>
-      </w:r>
-      <w:proofErr w:type="spellEnd"/>
+      <w:r>
+        <w:t>Organes génitaux</w:t>
+      </w:r>
     </w:p>
     <w:p>
       <w:pPr>
@@ -1031,13 +784,8 @@
         <w:spacing w:after="40"/>
       </w:pPr>
       <w:r>
-        <w:t xml:space="preserve">Système </w:t>
-      </w:r>
-      <w:proofErr w:type="spellStart"/>
-      <w:r>
-        <w:t>érectile</w:t>
-      </w:r>
-      <w:proofErr w:type="spellEnd"/>
+        <w:t>Système érectile</w:t>
+      </w:r>
     </w:p>
     <w:p>
       <w:pPr>
@@ -1235,53 +983,17 @@
         </w:rPr>
         <w:t xml:space="preserve">Les quatre niveaux ne constituent pas quatre étapes obligatoires à appliquer de manière identique à tous les patients. </w:t>
       </w:r>
-      <w:proofErr w:type="spellStart"/>
-      <w:r>
-        <w:t>Ils</w:t>
-      </w:r>
-      <w:proofErr w:type="spellEnd"/>
-      <w:r>
-        <w:t xml:space="preserve"> </w:t>
-      </w:r>
-      <w:proofErr w:type="spellStart"/>
-      <w:r>
-        <w:t>organisent</w:t>
-      </w:r>
-      <w:proofErr w:type="spellEnd"/>
-      <w:r>
-        <w:t xml:space="preserve"> le </w:t>
-      </w:r>
-      <w:proofErr w:type="spellStart"/>
-      <w:r>
-        <w:t>raisonnement</w:t>
-      </w:r>
-      <w:proofErr w:type="spellEnd"/>
-      <w:r>
-        <w:t xml:space="preserve"> </w:t>
-      </w:r>
-      <w:proofErr w:type="spellStart"/>
-      <w:proofErr w:type="gramStart"/>
-      <w:r>
-        <w:t>clinique</w:t>
-      </w:r>
-      <w:proofErr w:type="spellEnd"/>
-      <w:r>
-        <w:t xml:space="preserve"> :</w:t>
-      </w:r>
-      <w:proofErr w:type="gramEnd"/>
+      <w:r>
+        <w:t>Ils organisent le raisonnement clinique :</w:t>
+      </w:r>
     </w:p>
     <w:p>
       <w:pPr>
         <w:pStyle w:val="ListNumber"/>
         <w:spacing w:after="40"/>
       </w:pPr>
-      <w:proofErr w:type="spellStart"/>
-      <w:r>
-        <w:t>Régulation</w:t>
-      </w:r>
-      <w:proofErr w:type="spellEnd"/>
-      <w:r>
-        <w:t xml:space="preserve"> centrale.</w:t>
+      <w:r>
+        <w:t>Régulation centrale.</w:t>
       </w:r>
     </w:p>
     <w:p>
@@ -1289,21 +1001,8 @@
         <w:pStyle w:val="ListNumber"/>
         <w:spacing w:after="40"/>
       </w:pPr>
-      <w:proofErr w:type="spellStart"/>
-      <w:r>
-        <w:t>Régulation</w:t>
-      </w:r>
-      <w:proofErr w:type="spellEnd"/>
-      <w:r>
-        <w:t xml:space="preserve"> neuro-</w:t>
-      </w:r>
-      <w:proofErr w:type="spellStart"/>
-      <w:r>
-        <w:t>végétative</w:t>
-      </w:r>
-      <w:proofErr w:type="spellEnd"/>
-      <w:r>
-        <w:t>.</w:t>
+      <w:r>
+        <w:t>Régulation neuro-végétative.</w:t>
       </w:r>
     </w:p>
     <w:p>
@@ -1312,15 +1011,7 @@
         <w:spacing w:after="40"/>
       </w:pPr>
       <w:r>
-        <w:t>Interfaces loco-</w:t>
-      </w:r>
-      <w:proofErr w:type="spellStart"/>
-      <w:r>
-        <w:t>régionales</w:t>
-      </w:r>
-      <w:proofErr w:type="spellEnd"/>
-      <w:r>
-        <w:t>.</w:t>
+        <w:t>Interfaces loco-régionales.</w:t>
       </w:r>
     </w:p>
     <w:p>
@@ -1328,29 +1019,8 @@
         <w:pStyle w:val="ListNumber"/>
         <w:spacing w:after="40"/>
       </w:pPr>
-      <w:proofErr w:type="spellStart"/>
-      <w:r>
-        <w:t>Cible</w:t>
-      </w:r>
-      <w:proofErr w:type="spellEnd"/>
-      <w:r>
-        <w:t xml:space="preserve"> </w:t>
-      </w:r>
-      <w:proofErr w:type="spellStart"/>
-      <w:r>
-        <w:t>viscérale</w:t>
-      </w:r>
-      <w:proofErr w:type="spellEnd"/>
-      <w:r>
-        <w:t xml:space="preserve"> </w:t>
-      </w:r>
-      <w:proofErr w:type="spellStart"/>
-      <w:r>
-        <w:t>spécifique</w:t>
-      </w:r>
-      <w:proofErr w:type="spellEnd"/>
-      <w:r>
-        <w:t>.</w:t>
+      <w:r>
+        <w:t>Cible viscérale spécifique.</w:t>
       </w:r>
     </w:p>
     <w:p>
@@ -1417,21 +1087,7 @@
         <w:rPr>
           <w:lang w:val="fr-FR"/>
         </w:rPr>
-        <w:t xml:space="preserve">Les chapitres consacrés au mécanisme du stress et à la théorie </w:t>
-      </w:r>
-      <w:proofErr w:type="spellStart"/>
-      <w:r>
-        <w:rPr>
-          <w:lang w:val="fr-FR"/>
-        </w:rPr>
-        <w:t>polyvagale</w:t>
-      </w:r>
-      <w:proofErr w:type="spellEnd"/>
-      <w:r>
-        <w:rPr>
-          <w:lang w:val="fr-FR"/>
-        </w:rPr>
-        <w:t xml:space="preserve"> ne constituent pas un cinquième niveau clinique. Ils expliquent comment les quatre niveaux interagissent dans le temps.</w:t>
+        <w:t>Les chapitres consacrés au mécanisme du stress et à la théorie polyvagale ne constituent pas un cinquième niveau clinique. Ils expliquent comment les quatre niveaux interagissent dans le temps.</w:t>
       </w:r>
     </w:p>
     <w:p>
@@ -1452,16 +1108,9 @@
         <w:pStyle w:val="ListBullet"/>
         <w:spacing w:after="40"/>
       </w:pPr>
-      <w:proofErr w:type="spellStart"/>
-      <w:proofErr w:type="gramStart"/>
-      <w:r>
-        <w:t>persiste</w:t>
-      </w:r>
-      <w:proofErr w:type="spellEnd"/>
-      <w:r>
-        <w:t xml:space="preserve"> ;</w:t>
-      </w:r>
-      <w:proofErr w:type="gramEnd"/>
+      <w:r>
+        <w:t>persiste ;</w:t>
+      </w:r>
     </w:p>
     <w:p>
       <w:pPr>
@@ -1469,18 +1118,8 @@
         <w:spacing w:after="40"/>
       </w:pPr>
       <w:r>
-        <w:t xml:space="preserve">se </w:t>
-      </w:r>
-      <w:proofErr w:type="spellStart"/>
-      <w:proofErr w:type="gramStart"/>
-      <w:r>
-        <w:t>répète</w:t>
-      </w:r>
-      <w:proofErr w:type="spellEnd"/>
-      <w:r>
-        <w:t xml:space="preserve"> ;</w:t>
-      </w:r>
-      <w:proofErr w:type="gramEnd"/>
+        <w:t>se répète ;</w:t>
+      </w:r>
     </w:p>
     <w:p>
       <w:pPr>
@@ -1488,18 +1127,8 @@
         <w:spacing w:after="40"/>
       </w:pPr>
       <w:r>
-        <w:t xml:space="preserve">reste </w:t>
-      </w:r>
-      <w:proofErr w:type="spellStart"/>
-      <w:proofErr w:type="gramStart"/>
-      <w:r>
-        <w:t>disproportionnée</w:t>
-      </w:r>
-      <w:proofErr w:type="spellEnd"/>
-      <w:r>
-        <w:t xml:space="preserve"> ;</w:t>
-      </w:r>
-      <w:proofErr w:type="gramEnd"/>
+        <w:t>reste disproportionnée ;</w:t>
+      </w:r>
     </w:p>
     <w:p>
       <w:pPr>
@@ -1507,21 +1136,8 @@
         <w:spacing w:after="40"/>
       </w:pPr>
       <w:r>
-        <w:t xml:space="preserve">ne se </w:t>
-      </w:r>
-      <w:proofErr w:type="spellStart"/>
-      <w:r>
-        <w:t>clôt</w:t>
-      </w:r>
-      <w:proofErr w:type="spellEnd"/>
-      <w:r>
-        <w:t xml:space="preserve"> </w:t>
-      </w:r>
-      <w:proofErr w:type="gramStart"/>
-      <w:r>
-        <w:t>pas ;</w:t>
-      </w:r>
-      <w:proofErr w:type="gramEnd"/>
+        <w:t>ne se clôt pas ;</w:t>
+      </w:r>
     </w:p>
     <w:p>
       <w:pPr>
@@ -1531,19 +1147,11 @@
           <w:lang w:val="fr-FR"/>
         </w:rPr>
       </w:pPr>
-      <w:proofErr w:type="gramStart"/>
-      <w:r>
-        <w:rPr>
-          <w:lang w:val="fr-FR"/>
-        </w:rPr>
-        <w:t>dépasse</w:t>
-      </w:r>
-      <w:proofErr w:type="gramEnd"/>
-      <w:r>
-        <w:rPr>
-          <w:lang w:val="fr-FR"/>
-        </w:rPr>
-        <w:t xml:space="preserve"> les capacités de récupération du patient.</w:t>
+      <w:r>
+        <w:rPr>
+          <w:lang w:val="fr-FR"/>
+        </w:rPr>
+        <w:t>dépasse les capacités de récupération du patient.</w:t>
       </w:r>
     </w:p>
     <w:p>
@@ -1569,21 +1177,7 @@
         <w:rPr>
           <w:lang w:val="fr-FR"/>
         </w:rPr>
-        <w:t xml:space="preserve">Le chapitre consacré à la théorie </w:t>
-      </w:r>
-      <w:proofErr w:type="spellStart"/>
-      <w:r>
-        <w:rPr>
-          <w:lang w:val="fr-FR"/>
-        </w:rPr>
-        <w:t>polyvagale</w:t>
-      </w:r>
-      <w:proofErr w:type="spellEnd"/>
-      <w:r>
-        <w:rPr>
-          <w:lang w:val="fr-FR"/>
-        </w:rPr>
-        <w:t xml:space="preserve"> propose une lecture complémentaire des états autonomes et des réponses de mobilisation, de protection ou d’engagement relationnel. Ces chapitres décrivent donc la dynamique qui relie les centres de régulation, les voies autonomes, les tensions régionales et les manifestations viscérales.</w:t>
+        <w:t>Le chapitre consacré à la théorie polyvagale propose une lecture complémentaire des états autonomes et des réponses de mobilisation, de protection ou d’engagement relationnel. Ces chapitres décrivent donc la dynamique qui relie les centres de régulation, les voies autonomes, les tensions régionales et les manifestations viscérales.</w:t>
       </w:r>
     </w:p>
     <w:tbl>
@@ -1730,21 +1324,7 @@
         <w:rPr>
           <w:lang w:val="fr-FR"/>
         </w:rPr>
-        <w:t xml:space="preserve">Les chapitres sur le stress et la théorie </w:t>
-      </w:r>
-      <w:proofErr w:type="spellStart"/>
-      <w:r>
-        <w:rPr>
-          <w:lang w:val="fr-FR"/>
-        </w:rPr>
-        <w:t>polyvagale</w:t>
-      </w:r>
-      <w:proofErr w:type="spellEnd"/>
-      <w:r>
-        <w:rPr>
-          <w:lang w:val="fr-FR"/>
-        </w:rPr>
-        <w:t xml:space="preserve"> expliquent les mécanismes dynamiques qui relient les quatre niveaux.</w:t>
+        <w:t>Les chapitres sur le stress et la théorie polyvagale expliquent les mécanismes dynamiques qui relient les quatre niveaux.</w:t>
       </w:r>
     </w:p>
     <w:p>
@@ -1903,45 +1483,8 @@
         <w:t xml:space="preserve">L’observation clinique ne possède pas, à elle seule, la rigueur d’un protocole expérimental. </w:t>
       </w:r>
       <w:r>
-        <w:t xml:space="preserve">Elle conserve </w:t>
-      </w:r>
-      <w:proofErr w:type="spellStart"/>
-      <w:r>
-        <w:t>néanmoins</w:t>
-      </w:r>
-      <w:proofErr w:type="spellEnd"/>
-      <w:r>
-        <w:t xml:space="preserve"> </w:t>
-      </w:r>
-      <w:proofErr w:type="spellStart"/>
-      <w:r>
-        <w:t>une</w:t>
-      </w:r>
-      <w:proofErr w:type="spellEnd"/>
-      <w:r>
-        <w:t xml:space="preserve"> </w:t>
-      </w:r>
-      <w:proofErr w:type="spellStart"/>
-      <w:r>
-        <w:t>valeur</w:t>
-      </w:r>
-      <w:proofErr w:type="spellEnd"/>
-      <w:r>
-        <w:t xml:space="preserve"> </w:t>
-      </w:r>
-      <w:proofErr w:type="spellStart"/>
-      <w:r>
-        <w:t>lorsqu’elle</w:t>
-      </w:r>
-      <w:proofErr w:type="spellEnd"/>
-      <w:r>
-        <w:t xml:space="preserve"> </w:t>
-      </w:r>
-      <w:proofErr w:type="gramStart"/>
-      <w:r>
-        <w:t>est :</w:t>
-      </w:r>
-      <w:proofErr w:type="gramEnd"/>
+        <w:t>Elle conserve néanmoins une valeur lorsqu’elle est :</w:t>
+      </w:r>
     </w:p>
     <w:p>
       <w:pPr>
@@ -1949,42 +1492,17 @@
         <w:spacing w:after="40"/>
       </w:pPr>
       <w:r>
-        <w:t xml:space="preserve">conduite avec </w:t>
-      </w:r>
-      <w:proofErr w:type="spellStart"/>
-      <w:proofErr w:type="gramStart"/>
-      <w:r>
-        <w:t>méthode</w:t>
-      </w:r>
-      <w:proofErr w:type="spellEnd"/>
-      <w:r>
-        <w:t xml:space="preserve"> ;</w:t>
-      </w:r>
-      <w:proofErr w:type="gramEnd"/>
+        <w:t>conduite avec méthode ;</w:t>
+      </w:r>
     </w:p>
     <w:p>
       <w:pPr>
         <w:pStyle w:val="ListBullet"/>
         <w:spacing w:after="40"/>
       </w:pPr>
-      <w:proofErr w:type="spellStart"/>
-      <w:r>
-        <w:t>décrite</w:t>
-      </w:r>
-      <w:proofErr w:type="spellEnd"/>
-      <w:r>
-        <w:t xml:space="preserve"> avec </w:t>
-      </w:r>
-      <w:proofErr w:type="spellStart"/>
-      <w:proofErr w:type="gramStart"/>
-      <w:r>
-        <w:t>précision</w:t>
-      </w:r>
-      <w:proofErr w:type="spellEnd"/>
-      <w:r>
-        <w:t xml:space="preserve"> ;</w:t>
-      </w:r>
-      <w:proofErr w:type="gramEnd"/>
+      <w:r>
+        <w:t>décrite avec précision ;</w:t>
+      </w:r>
     </w:p>
     <w:p>
       <w:pPr>
@@ -1994,19 +1512,11 @@
           <w:lang w:val="fr-FR"/>
         </w:rPr>
       </w:pPr>
-      <w:proofErr w:type="gramStart"/>
-      <w:r>
-        <w:rPr>
-          <w:lang w:val="fr-FR"/>
-        </w:rPr>
-        <w:t>confrontée</w:t>
-      </w:r>
-      <w:proofErr w:type="gramEnd"/>
-      <w:r>
-        <w:rPr>
-          <w:lang w:val="fr-FR"/>
-        </w:rPr>
-        <w:t xml:space="preserve"> à l’évolution réelle du patient ;</w:t>
+      <w:r>
+        <w:rPr>
+          <w:lang w:val="fr-FR"/>
+        </w:rPr>
+        <w:t>confrontée à l’évolution réelle du patient ;</w:t>
       </w:r>
     </w:p>
     <w:p>
@@ -2017,19 +1527,11 @@
           <w:lang w:val="fr-FR"/>
         </w:rPr>
       </w:pPr>
-      <w:proofErr w:type="gramStart"/>
-      <w:r>
-        <w:rPr>
-          <w:lang w:val="fr-FR"/>
-        </w:rPr>
-        <w:t>mise</w:t>
-      </w:r>
-      <w:proofErr w:type="gramEnd"/>
-      <w:r>
-        <w:rPr>
-          <w:lang w:val="fr-FR"/>
-        </w:rPr>
-        <w:t xml:space="preserve"> en relation avec les données médicales disponibles ;</w:t>
+      <w:r>
+        <w:rPr>
+          <w:lang w:val="fr-FR"/>
+        </w:rPr>
+        <w:t>mise en relation avec les données médicales disponibles ;</w:t>
       </w:r>
     </w:p>
     <w:p>
@@ -2037,13 +1539,8 @@
         <w:pStyle w:val="ListBullet"/>
         <w:spacing w:after="40"/>
       </w:pPr>
-      <w:proofErr w:type="spellStart"/>
-      <w:r>
-        <w:t>réévaluée</w:t>
-      </w:r>
-      <w:proofErr w:type="spellEnd"/>
-      <w:r>
-        <w:t xml:space="preserve"> dans le temps.</w:t>
+      <w:r>
+        <w:t>réévaluée dans le temps.</w:t>
       </w:r>
     </w:p>
     <w:p>
@@ -2065,26 +1562,8 @@
         <w:spacing w:after="40"/>
       </w:pPr>
       <w:r>
-        <w:t xml:space="preserve">la </w:t>
-      </w:r>
-      <w:proofErr w:type="spellStart"/>
-      <w:r>
-        <w:t>cohérence</w:t>
-      </w:r>
-      <w:proofErr w:type="spellEnd"/>
-      <w:r>
-        <w:t xml:space="preserve"> </w:t>
-      </w:r>
-      <w:proofErr w:type="spellStart"/>
-      <w:proofErr w:type="gramStart"/>
-      <w:r>
-        <w:t>anatomique</w:t>
-      </w:r>
-      <w:proofErr w:type="spellEnd"/>
-      <w:r>
-        <w:t xml:space="preserve"> ;</w:t>
-      </w:r>
-      <w:proofErr w:type="gramEnd"/>
+        <w:t>la cohérence anatomique ;</w:t>
+      </w:r>
     </w:p>
     <w:p>
       <w:pPr>
@@ -2092,26 +1571,8 @@
         <w:spacing w:after="40"/>
       </w:pPr>
       <w:r>
-        <w:t xml:space="preserve">la </w:t>
-      </w:r>
-      <w:proofErr w:type="spellStart"/>
-      <w:r>
-        <w:t>reproductibilité</w:t>
-      </w:r>
-      <w:proofErr w:type="spellEnd"/>
-      <w:r>
-        <w:t xml:space="preserve"> des </w:t>
-      </w:r>
-      <w:proofErr w:type="spellStart"/>
-      <w:proofErr w:type="gramStart"/>
-      <w:r>
-        <w:t>repères</w:t>
-      </w:r>
-      <w:proofErr w:type="spellEnd"/>
-      <w:r>
-        <w:t xml:space="preserve"> ;</w:t>
-      </w:r>
-      <w:proofErr w:type="gramEnd"/>
+        <w:t>la reproductibilité des repères ;</w:t>
+      </w:r>
     </w:p>
     <w:p>
       <w:pPr>
@@ -2121,19 +1582,11 @@
           <w:lang w:val="fr-FR"/>
         </w:rPr>
       </w:pPr>
-      <w:proofErr w:type="gramStart"/>
-      <w:r>
-        <w:rPr>
-          <w:lang w:val="fr-FR"/>
-        </w:rPr>
-        <w:t>la</w:t>
-      </w:r>
-      <w:proofErr w:type="gramEnd"/>
-      <w:r>
-        <w:rPr>
-          <w:lang w:val="fr-FR"/>
-        </w:rPr>
-        <w:t xml:space="preserve"> confrontation au réel par l’anamnèse, l’imagerie et les données médicales ou chirurgicales ;</w:t>
+      <w:r>
+        <w:rPr>
+          <w:lang w:val="fr-FR"/>
+        </w:rPr>
+        <w:t>la confrontation au réel par l’anamnèse, l’imagerie et les données médicales ou chirurgicales ;</w:t>
       </w:r>
     </w:p>
     <w:p>
@@ -2144,19 +1597,11 @@
           <w:lang w:val="fr-FR"/>
         </w:rPr>
       </w:pPr>
-      <w:proofErr w:type="gramStart"/>
-      <w:r>
-        <w:rPr>
-          <w:lang w:val="fr-FR"/>
-        </w:rPr>
-        <w:t>la</w:t>
-      </w:r>
-      <w:proofErr w:type="gramEnd"/>
-      <w:r>
-        <w:rPr>
-          <w:lang w:val="fr-FR"/>
-        </w:rPr>
-        <w:t xml:space="preserve"> documentation structurée de la pratique et de l’évolution du patient.</w:t>
+      <w:r>
+        <w:rPr>
+          <w:lang w:val="fr-FR"/>
+        </w:rPr>
+        <w:t>la documentation structurée de la pratique et de l’évolution du patient.</w:t>
       </w:r>
     </w:p>
     <w:tbl>
@@ -2189,7 +1634,6 @@
                 <w:lang w:val="fr-FR"/>
               </w:rPr>
             </w:pPr>
-            <w:proofErr w:type="spellStart"/>
             <w:r>
               <w:rPr>
                 <w:b/>
@@ -2197,17 +1641,7 @@
                 <w:sz w:val="23"/>
                 <w:lang w:val="fr-FR"/>
               </w:rPr>
-              <w:t>SuiviPatient</w:t>
-            </w:r>
-            <w:proofErr w:type="spellEnd"/>
-            <w:r>
-              <w:rPr>
-                <w:b/>
-                <w:color w:val="C6922E"/>
-                <w:sz w:val="23"/>
-                <w:lang w:val="fr-FR"/>
-              </w:rPr>
-              <w:t xml:space="preserve"> — De l’observation clinique à une communauté de données</w:t>
+              <w:t>SuiviPatient — De l’observation clinique à une communauté de données</w:t>
             </w:r>
             <w:r>
               <w:rPr>
@@ -2222,21 +1656,7 @@
               <w:rPr>
                 <w:lang w:val="fr-FR"/>
               </w:rPr>
-              <w:t xml:space="preserve">Pour prolonger cette exigence au-delà du livre, nous mettons gratuitement à disposition des praticiens certifiés ROP l’application </w:t>
-            </w:r>
-            <w:proofErr w:type="spellStart"/>
-            <w:r>
-              <w:rPr>
-                <w:lang w:val="fr-FR"/>
-              </w:rPr>
-              <w:t>SuiviPatient</w:t>
-            </w:r>
-            <w:proofErr w:type="spellEnd"/>
-            <w:r>
-              <w:rPr>
-                <w:lang w:val="fr-FR"/>
-              </w:rPr>
-              <w:t>. Cet outil permet de documenter de manière structurée le motif principal de consultation, les éléments de l’anamnèse, les niveaux et zones travaillés, le protocole réellement suivi, les réactions observées pendant et après la séance, ainsi que l’évolution de la douleur, du sommeil, de la fatigue, du transit, de la mobilité ou des capacités fonctionnelles.</w:t>
+              <w:t>Pour prolonger cette exigence au-delà du livre, nous mettons gratuitement à disposition des praticiens certifiés ROP l’application SuiviPatient. Cet outil permet de documenter de manière structurée le motif principal de consultation, les éléments de l’anamnèse, les niveaux et zones travaillés, le protocole réellement suivi, les réactions observées pendant et après la séance, ainsi que l’évolution de la douleur, du sommeil, de la fatigue, du transit, de la mobilité ou des capacités fonctionnelles.</w:t>
             </w:r>
             <w:r>
               <w:rPr>
@@ -2249,21 +1669,7 @@
                 <w:lang w:val="fr-FR"/>
               </w:rPr>
               <w:br/>
-              <w:t xml:space="preserve">L’objectif n’est pas de transformer chaque séance en protocole expérimental ni de tirer des conclusions causales à partir de simples observations. Il est de rendre la pratique plus traçable, plus comparable et plus facilement réévaluable. Grâce à </w:t>
-            </w:r>
-            <w:proofErr w:type="spellStart"/>
-            <w:r>
-              <w:rPr>
-                <w:lang w:val="fr-FR"/>
-              </w:rPr>
-              <w:t>SuiviPatient</w:t>
-            </w:r>
-            <w:proofErr w:type="spellEnd"/>
-            <w:r>
-              <w:rPr>
-                <w:lang w:val="fr-FR"/>
-              </w:rPr>
-              <w:t>, chaque praticien enrichit sa propre expérience et contribue à une dynamique collective : mieux identifier les protocoles pertinents, les adaptations nécessaires, les réponses immédiates ou différées, les facteurs associés à la récupération et les limites de la méthode.</w:t>
+              <w:t>L’objectif n’est pas de transformer chaque séance en protocole expérimental ni de tirer des conclusions causales à partir de simples observations. Il est de rendre la pratique plus traçable, plus comparable et plus facilement réévaluable. Grâce à SuiviPatient, chaque praticien enrichit sa propre expérience et contribue à une dynamique collective : mieux identifier les protocoles pertinents, les adaptations nécessaires, les réponses immédiates ou différées, les facteurs associés à la récupération et les limites de la méthode.</w:t>
             </w:r>
             <w:r>
               <w:rPr>
@@ -2277,21 +1683,7 @@
               </w:rPr>
               <w:lastRenderedPageBreak/>
               <w:br/>
-              <w:t xml:space="preserve">Cette démarche respecte le consentement du patient, la confidentialité des informations et les règles applicables à la protection des données. Les lecteurs qui souhaitent se former, être certifiés ROP, rejoindre la communauté des praticiens ou utiliser gratuitement </w:t>
-            </w:r>
-            <w:proofErr w:type="spellStart"/>
-            <w:r>
-              <w:rPr>
-                <w:lang w:val="fr-FR"/>
-              </w:rPr>
-              <w:t>SuiviPatient</w:t>
-            </w:r>
-            <w:proofErr w:type="spellEnd"/>
-            <w:r>
-              <w:rPr>
-                <w:lang w:val="fr-FR"/>
-              </w:rPr>
-              <w:t xml:space="preserve"> dans leur pratique sont invités à nous contacter.</w:t>
+              <w:t>Cette démarche respecte le consentement du patient, la confidentialité des informations et les règles applicables à la protection des données. Les lecteurs qui souhaitent se former, être certifiés ROP, rejoindre la communauté des praticiens ou utiliser gratuitement SuiviPatient dans leur pratique sont invités à nous contacter.</w:t>
             </w:r>
             <w:r>
               <w:rPr>
@@ -2461,19 +1853,11 @@
           <w:lang w:val="fr-FR"/>
         </w:rPr>
       </w:pPr>
-      <w:proofErr w:type="gramStart"/>
-      <w:r>
-        <w:rPr>
-          <w:lang w:val="fr-FR"/>
-        </w:rPr>
-        <w:t>dorsalement</w:t>
-      </w:r>
-      <w:proofErr w:type="gramEnd"/>
-      <w:r>
-        <w:rPr>
-          <w:lang w:val="fr-FR"/>
-        </w:rPr>
-        <w:t>, à la place de « postérieurement » lorsque l’orientation corporelle le justifie ;</w:t>
+      <w:r>
+        <w:rPr>
+          <w:lang w:val="fr-FR"/>
+        </w:rPr>
+        <w:t>dorsalement, à la place de « postérieurement » lorsque l’orientation corporelle le justifie ;</w:t>
       </w:r>
     </w:p>
     <w:p>
@@ -2484,19 +1868,11 @@
           <w:lang w:val="fr-FR"/>
         </w:rPr>
       </w:pPr>
-      <w:proofErr w:type="gramStart"/>
-      <w:r>
-        <w:rPr>
-          <w:lang w:val="fr-FR"/>
-        </w:rPr>
-        <w:t>ventralement</w:t>
-      </w:r>
-      <w:proofErr w:type="gramEnd"/>
-      <w:r>
-        <w:rPr>
-          <w:lang w:val="fr-FR"/>
-        </w:rPr>
-        <w:t>, à la place de « antérieurement » ;</w:t>
+      <w:r>
+        <w:rPr>
+          <w:lang w:val="fr-FR"/>
+        </w:rPr>
+        <w:t>ventralement, à la place de « antérieurement » ;</w:t>
       </w:r>
     </w:p>
     <w:p>
@@ -2507,19 +1883,11 @@
           <w:lang w:val="fr-FR"/>
         </w:rPr>
       </w:pPr>
-      <w:proofErr w:type="gramStart"/>
-      <w:r>
-        <w:rPr>
-          <w:lang w:val="fr-FR"/>
-        </w:rPr>
-        <w:t>latéralement</w:t>
-      </w:r>
-      <w:proofErr w:type="gramEnd"/>
-      <w:r>
-        <w:rPr>
-          <w:lang w:val="fr-FR"/>
-        </w:rPr>
-        <w:t>, à la place de « extérieurement » ;</w:t>
+      <w:r>
+        <w:rPr>
+          <w:lang w:val="fr-FR"/>
+        </w:rPr>
+        <w:t>latéralement, à la place de « extérieurement » ;</w:t>
       </w:r>
     </w:p>
     <w:p>
@@ -2530,19 +1898,11 @@
           <w:lang w:val="fr-FR"/>
         </w:rPr>
       </w:pPr>
-      <w:proofErr w:type="gramStart"/>
-      <w:r>
-        <w:rPr>
-          <w:lang w:val="fr-FR"/>
-        </w:rPr>
-        <w:t>médialement</w:t>
-      </w:r>
-      <w:proofErr w:type="gramEnd"/>
-      <w:r>
-        <w:rPr>
-          <w:lang w:val="fr-FR"/>
-        </w:rPr>
-        <w:t>, à la place de « intérieurement » ;</w:t>
+      <w:r>
+        <w:rPr>
+          <w:lang w:val="fr-FR"/>
+        </w:rPr>
+        <w:t>médialement, à la place de « intérieurement » ;</w:t>
       </w:r>
     </w:p>
     <w:p>
@@ -2553,21 +1913,11 @@
           <w:lang w:val="fr-FR"/>
         </w:rPr>
       </w:pPr>
-      <w:proofErr w:type="spellStart"/>
-      <w:proofErr w:type="gramStart"/>
-      <w:r>
-        <w:rPr>
-          <w:lang w:val="fr-FR"/>
-        </w:rPr>
-        <w:t>céphaliquement</w:t>
-      </w:r>
-      <w:proofErr w:type="spellEnd"/>
-      <w:proofErr w:type="gramEnd"/>
-      <w:r>
-        <w:rPr>
-          <w:lang w:val="fr-FR"/>
-        </w:rPr>
-        <w:t>, à la place de « vers le haut » ;</w:t>
+      <w:r>
+        <w:rPr>
+          <w:lang w:val="fr-FR"/>
+        </w:rPr>
+        <w:t>céphaliquement, à la place de « vers le haut » ;</w:t>
       </w:r>
     </w:p>
     <w:p>
@@ -2578,19 +1928,11 @@
           <w:lang w:val="fr-FR"/>
         </w:rPr>
       </w:pPr>
-      <w:proofErr w:type="gramStart"/>
-      <w:r>
-        <w:rPr>
-          <w:lang w:val="fr-FR"/>
-        </w:rPr>
-        <w:t>caudalement</w:t>
-      </w:r>
-      <w:proofErr w:type="gramEnd"/>
-      <w:r>
-        <w:rPr>
-          <w:lang w:val="fr-FR"/>
-        </w:rPr>
-        <w:t>, à la place de « vers le bas » ;</w:t>
+      <w:r>
+        <w:rPr>
+          <w:lang w:val="fr-FR"/>
+        </w:rPr>
+        <w:t>caudalement, à la place de « vers le bas » ;</w:t>
       </w:r>
     </w:p>
     <w:p>
@@ -2601,19 +1943,11 @@
           <w:lang w:val="fr-FR"/>
         </w:rPr>
       </w:pPr>
-      <w:proofErr w:type="gramStart"/>
-      <w:r>
-        <w:rPr>
-          <w:lang w:val="fr-FR"/>
-        </w:rPr>
-        <w:t>frontalement</w:t>
-      </w:r>
-      <w:proofErr w:type="gramEnd"/>
-      <w:r>
-        <w:rPr>
-          <w:lang w:val="fr-FR"/>
-        </w:rPr>
-        <w:t>, pour décrire une orientation dans le plan frontal ;</w:t>
+      <w:r>
+        <w:rPr>
+          <w:lang w:val="fr-FR"/>
+        </w:rPr>
+        <w:t>frontalement, pour décrire une orientation dans le plan frontal ;</w:t>
       </w:r>
     </w:p>
     <w:p>
@@ -2624,19 +1958,11 @@
           <w:lang w:val="fr-FR"/>
         </w:rPr>
       </w:pPr>
-      <w:proofErr w:type="gramStart"/>
-      <w:r>
-        <w:rPr>
-          <w:lang w:val="fr-FR"/>
-        </w:rPr>
-        <w:t>sagittalement</w:t>
-      </w:r>
-      <w:proofErr w:type="gramEnd"/>
-      <w:r>
-        <w:rPr>
-          <w:lang w:val="fr-FR"/>
-        </w:rPr>
-        <w:t>, pour décrire une orientation dans le plan sagittal.</w:t>
+      <w:r>
+        <w:rPr>
+          <w:lang w:val="fr-FR"/>
+        </w:rPr>
+        <w:t>sagittalement, pour décrire une orientation dans le plan sagittal.</w:t>
       </w:r>
     </w:p>
     <w:p>
@@ -2706,17 +2032,14 @@
         <w:ind w:left="360" w:hanging="360"/>
       </w:pPr>
       <w:r>
+        <w:rPr>
+          <w:noProof/>
+        </w:rPr>
         <w:drawing>
-          <wp:inline distT="0" distB="0" distL="0" distR="0" wp14:anchorId="6F94D435" wp14:editId="15554DA9">
-            <wp:extent cx="6332220" cy="3563620"/>
+          <wp:inline distT="0" distB="0" distL="0" distR="0" wp14:anchorId="4F48CDA2" wp14:editId="66813749">
+            <wp:extent cx="6332220" cy="3562985"/>
             <wp:effectExtent l="0" t="0" r="0" b="0"/>
-            <wp:docPr id="3" name="Picture 2">
-              <a:extLst xmlns:a="http://schemas.openxmlformats.org/drawingml/2006/main">
-                <a:ext uri="{FF2B5EF4-FFF2-40B4-BE49-F238E27FC236}">
-                  <a16:creationId xmlns:a16="http://schemas.microsoft.com/office/drawing/2014/main" id="{3D380C1A-C1E5-BA60-9F5A-810824C7376F}"/>
-                </a:ext>
-              </a:extLst>
-            </wp:docPr>
+            <wp:docPr id="1491151627" name="Picture 1"/>
             <wp:cNvGraphicFramePr>
               <a:graphicFrameLocks xmlns:a="http://schemas.openxmlformats.org/drawingml/2006/main" noChangeAspect="1"/>
             </wp:cNvGraphicFramePr>
@@ -2724,15 +2047,9 @@
               <a:graphicData uri="http://schemas.openxmlformats.org/drawingml/2006/picture">
                 <pic:pic xmlns:pic="http://schemas.openxmlformats.org/drawingml/2006/picture">
                   <pic:nvPicPr>
-                    <pic:cNvPr id="3" name="Picture 2">
-                      <a:extLst>
-                        <a:ext uri="{FF2B5EF4-FFF2-40B4-BE49-F238E27FC236}">
-                          <a16:creationId xmlns:a16="http://schemas.microsoft.com/office/drawing/2014/main" id="{3D380C1A-C1E5-BA60-9F5A-810824C7376F}"/>
-                        </a:ext>
-                      </a:extLst>
-                    </pic:cNvPr>
+                    <pic:cNvPr id="0" name="Picture 1"/>
                     <pic:cNvPicPr>
-                      <a:picLocks noChangeAspect="1"/>
+                      <a:picLocks noChangeAspect="1" noChangeArrowheads="1"/>
                     </pic:cNvPicPr>
                   </pic:nvPicPr>
                   <pic:blipFill>
@@ -2743,18 +2060,23 @@
                         </a:ext>
                       </a:extLst>
                     </a:blip>
+                    <a:srcRect/>
                     <a:stretch>
                       <a:fillRect/>
                     </a:stretch>
                   </pic:blipFill>
-                  <pic:spPr>
+                  <pic:spPr bwMode="auto">
                     <a:xfrm>
                       <a:off x="0" y="0"/>
-                      <a:ext cx="6332220" cy="3563620"/>
+                      <a:ext cx="6332220" cy="3562985"/>
                     </a:xfrm>
                     <a:prstGeom prst="rect">
                       <a:avLst/>
                     </a:prstGeom>
+                    <a:noFill/>
+                    <a:ln>
+                      <a:noFill/>
+                    </a:ln>
                   </pic:spPr>
                 </pic:pic>
               </a:graphicData>
@@ -3046,21 +2368,7 @@
         <w:rPr>
           <w:lang w:val="fr-FR"/>
         </w:rPr>
-        <w:t xml:space="preserve">Relations </w:t>
-      </w:r>
-      <w:proofErr w:type="spellStart"/>
-      <w:r>
-        <w:rPr>
-          <w:lang w:val="fr-FR"/>
-        </w:rPr>
-        <w:t>viscéro</w:t>
-      </w:r>
-      <w:proofErr w:type="spellEnd"/>
-      <w:r>
-        <w:rPr>
-          <w:lang w:val="fr-FR"/>
-        </w:rPr>
-        <w:t>-somatiques</w:t>
+        <w:t>Relations viscéro-somatiques</w:t>
       </w:r>
     </w:p>
     <w:p>
@@ -3087,21 +2395,7 @@
         <w:rPr>
           <w:lang w:val="fr-FR"/>
         </w:rPr>
-        <w:t xml:space="preserve">Relations </w:t>
-      </w:r>
-      <w:proofErr w:type="spellStart"/>
-      <w:r>
-        <w:rPr>
-          <w:lang w:val="fr-FR"/>
-        </w:rPr>
-        <w:t>viscéro</w:t>
-      </w:r>
-      <w:proofErr w:type="spellEnd"/>
-      <w:r>
-        <w:rPr>
-          <w:lang w:val="fr-FR"/>
-        </w:rPr>
-        <w:t>-émotionnelles</w:t>
+        <w:t>Relations viscéro-émotionnelles</w:t>
       </w:r>
     </w:p>
     <w:p>
@@ -3184,99 +2478,36 @@
         <w:pStyle w:val="ListBullet"/>
         <w:spacing w:after="40"/>
       </w:pPr>
-      <w:proofErr w:type="spellStart"/>
-      <w:r>
-        <w:t>symptôme</w:t>
-      </w:r>
-      <w:proofErr w:type="spellEnd"/>
-      <w:r>
-        <w:t xml:space="preserve"> </w:t>
-      </w:r>
-      <w:proofErr w:type="gramStart"/>
-      <w:r>
-        <w:t>principal ;</w:t>
-      </w:r>
-      <w:proofErr w:type="gramEnd"/>
+      <w:r>
+        <w:t>symptôme principal ;</w:t>
+      </w:r>
     </w:p>
     <w:p>
       <w:pPr>
         <w:pStyle w:val="ListBullet"/>
         <w:spacing w:after="40"/>
       </w:pPr>
-      <w:proofErr w:type="spellStart"/>
-      <w:r>
-        <w:t>intensité</w:t>
-      </w:r>
-      <w:proofErr w:type="spellEnd"/>
-      <w:r>
-        <w:t xml:space="preserve"> et </w:t>
-      </w:r>
-      <w:proofErr w:type="spellStart"/>
-      <w:proofErr w:type="gramStart"/>
-      <w:r>
-        <w:t>ancienneté</w:t>
-      </w:r>
-      <w:proofErr w:type="spellEnd"/>
-      <w:r>
-        <w:t xml:space="preserve"> ;</w:t>
-      </w:r>
-      <w:proofErr w:type="gramEnd"/>
+      <w:r>
+        <w:t>intensité et ancienneté ;</w:t>
+      </w:r>
     </w:p>
     <w:p>
       <w:pPr>
         <w:pStyle w:val="ListBullet"/>
         <w:spacing w:after="40"/>
       </w:pPr>
-      <w:proofErr w:type="spellStart"/>
-      <w:r>
-        <w:t>retentissement</w:t>
-      </w:r>
-      <w:proofErr w:type="spellEnd"/>
-      <w:r>
-        <w:t xml:space="preserve"> </w:t>
-      </w:r>
-      <w:proofErr w:type="spellStart"/>
-      <w:proofErr w:type="gramStart"/>
-      <w:r>
-        <w:t>fonctionnel</w:t>
-      </w:r>
-      <w:proofErr w:type="spellEnd"/>
-      <w:r>
-        <w:t xml:space="preserve"> ;</w:t>
-      </w:r>
-      <w:proofErr w:type="gramEnd"/>
+      <w:r>
+        <w:t>retentissement fonctionnel ;</w:t>
+      </w:r>
     </w:p>
     <w:p>
       <w:pPr>
         <w:pStyle w:val="ListBullet"/>
         <w:spacing w:after="40"/>
       </w:pPr>
-      <w:proofErr w:type="spellStart"/>
-      <w:r>
-        <w:t>facteurs</w:t>
-      </w:r>
-      <w:proofErr w:type="spellEnd"/>
-      <w:r>
-        <w:t xml:space="preserve"> </w:t>
-      </w:r>
-      <w:proofErr w:type="spellStart"/>
-      <w:r>
-        <w:t>aggravants</w:t>
-      </w:r>
-      <w:proofErr w:type="spellEnd"/>
-      <w:r>
-        <w:t xml:space="preserve"> ou </w:t>
-      </w:r>
-      <w:proofErr w:type="spellStart"/>
-      <w:proofErr w:type="gramStart"/>
-      <w:r>
-        <w:t>améliorants</w:t>
-      </w:r>
-      <w:proofErr w:type="spellEnd"/>
-      <w:r>
-        <w:t xml:space="preserve"> ;</w:t>
-      </w:r>
-      <w:proofErr w:type="gramEnd"/>
+      <w:r>
+        <w:t>facteurs aggravants ou améliorants ;</w:t>
+      </w:r>
     </w:p>
     <w:p>
       <w:pPr>
@@ -3286,19 +2517,11 @@
           <w:lang w:val="fr-FR"/>
         </w:rPr>
       </w:pPr>
-      <w:proofErr w:type="gramStart"/>
-      <w:r>
-        <w:rPr>
-          <w:lang w:val="fr-FR"/>
-        </w:rPr>
-        <w:t>sommeil</w:t>
-      </w:r>
-      <w:proofErr w:type="gramEnd"/>
-      <w:r>
-        <w:rPr>
-          <w:lang w:val="fr-FR"/>
-        </w:rPr>
-        <w:t>, transit, fatigue, mobilité, activité ou fonction viscérale.</w:t>
+      <w:r>
+        <w:rPr>
+          <w:lang w:val="fr-FR"/>
+        </w:rPr>
+        <w:t>sommeil, transit, fatigue, mobilité, activité ou fonction viscérale.</w:t>
       </w:r>
     </w:p>
     <w:p>
@@ -3314,19 +2537,9 @@
         <w:pStyle w:val="ListBullet"/>
         <w:spacing w:after="40"/>
       </w:pPr>
-      <w:proofErr w:type="spellStart"/>
-      <w:r>
-        <w:t>tolérance</w:t>
-      </w:r>
-      <w:proofErr w:type="spellEnd"/>
-      <w:r>
-        <w:t xml:space="preserve"> au </w:t>
-      </w:r>
-      <w:proofErr w:type="gramStart"/>
-      <w:r>
-        <w:t>toucher ;</w:t>
-      </w:r>
-      <w:proofErr w:type="gramEnd"/>
+      <w:r>
+        <w:t>tolérance au toucher ;</w:t>
+      </w:r>
     </w:p>
     <w:p>
       <w:pPr>
@@ -3334,88 +2547,43 @@
         <w:spacing w:after="40"/>
       </w:pPr>
       <w:r>
-        <w:t xml:space="preserve">modifications du </w:t>
-      </w:r>
-      <w:proofErr w:type="gramStart"/>
-      <w:r>
-        <w:t>tonus ;</w:t>
-      </w:r>
-      <w:proofErr w:type="gramEnd"/>
+        <w:t>modifications du tonus ;</w:t>
+      </w:r>
     </w:p>
     <w:p>
       <w:pPr>
         <w:pStyle w:val="ListBullet"/>
         <w:spacing w:after="40"/>
       </w:pPr>
-      <w:proofErr w:type="gramStart"/>
       <w:r>
         <w:t>respiration ;</w:t>
       </w:r>
-      <w:proofErr w:type="gramEnd"/>
     </w:p>
     <w:p>
       <w:pPr>
         <w:pStyle w:val="ListBullet"/>
         <w:spacing w:after="40"/>
       </w:pPr>
-      <w:proofErr w:type="spellStart"/>
-      <w:r>
-        <w:t>réactions</w:t>
-      </w:r>
-      <w:proofErr w:type="spellEnd"/>
-      <w:r>
-        <w:t xml:space="preserve"> </w:t>
-      </w:r>
-      <w:proofErr w:type="spellStart"/>
-      <w:proofErr w:type="gramStart"/>
-      <w:r>
-        <w:t>végétatives</w:t>
-      </w:r>
-      <w:proofErr w:type="spellEnd"/>
-      <w:r>
-        <w:t xml:space="preserve"> ;</w:t>
-      </w:r>
-      <w:proofErr w:type="gramEnd"/>
+      <w:r>
+        <w:t>réactions végétatives ;</w:t>
+      </w:r>
     </w:p>
     <w:p>
       <w:pPr>
         <w:pStyle w:val="ListBullet"/>
         <w:spacing w:after="40"/>
       </w:pPr>
-      <w:proofErr w:type="spellStart"/>
-      <w:r>
-        <w:t>évolution</w:t>
-      </w:r>
-      <w:proofErr w:type="spellEnd"/>
-      <w:r>
-        <w:t xml:space="preserve"> des </w:t>
-      </w:r>
-      <w:proofErr w:type="gramStart"/>
-      <w:r>
-        <w:t>tests ;</w:t>
-      </w:r>
-      <w:proofErr w:type="gramEnd"/>
+      <w:r>
+        <w:t>évolution des tests ;</w:t>
+      </w:r>
     </w:p>
     <w:p>
       <w:pPr>
         <w:pStyle w:val="ListBullet"/>
         <w:spacing w:after="40"/>
       </w:pPr>
-      <w:proofErr w:type="spellStart"/>
-      <w:r>
-        <w:t>signes</w:t>
-      </w:r>
-      <w:proofErr w:type="spellEnd"/>
-      <w:r>
-        <w:t xml:space="preserve"> </w:t>
-      </w:r>
-      <w:proofErr w:type="spellStart"/>
-      <w:r>
-        <w:t>inhabituels</w:t>
-      </w:r>
-      <w:proofErr w:type="spellEnd"/>
-      <w:r>
-        <w:t>.</w:t>
+      <w:r>
+        <w:t>signes inhabituels.</w:t>
       </w:r>
     </w:p>
     <w:p>
@@ -3437,75 +2605,36 @@
         <w:pStyle w:val="ListBullet"/>
         <w:spacing w:after="40"/>
       </w:pPr>
-      <w:proofErr w:type="spellStart"/>
-      <w:r>
-        <w:t>symptôme</w:t>
-      </w:r>
-      <w:proofErr w:type="spellEnd"/>
-      <w:r>
-        <w:t xml:space="preserve"> </w:t>
-      </w:r>
-      <w:proofErr w:type="gramStart"/>
-      <w:r>
-        <w:t>principal ;</w:t>
-      </w:r>
-      <w:proofErr w:type="gramEnd"/>
+      <w:r>
+        <w:t>symptôme principal ;</w:t>
+      </w:r>
     </w:p>
     <w:p>
       <w:pPr>
         <w:pStyle w:val="ListBullet"/>
         <w:spacing w:after="40"/>
       </w:pPr>
-      <w:proofErr w:type="spellStart"/>
-      <w:r>
-        <w:t>douleur</w:t>
-      </w:r>
-      <w:proofErr w:type="spellEnd"/>
-      <w:r>
-        <w:t xml:space="preserve"> ou </w:t>
-      </w:r>
-      <w:proofErr w:type="spellStart"/>
-      <w:proofErr w:type="gramStart"/>
-      <w:r>
-        <w:t>gêne</w:t>
-      </w:r>
-      <w:proofErr w:type="spellEnd"/>
-      <w:r>
-        <w:t xml:space="preserve"> ;</w:t>
-      </w:r>
-      <w:proofErr w:type="gramEnd"/>
+      <w:r>
+        <w:t>douleur ou gêne ;</w:t>
+      </w:r>
     </w:p>
     <w:p>
       <w:pPr>
         <w:pStyle w:val="ListBullet"/>
         <w:spacing w:after="40"/>
       </w:pPr>
-      <w:proofErr w:type="spellStart"/>
-      <w:proofErr w:type="gramStart"/>
-      <w:r>
-        <w:t>mobilité</w:t>
-      </w:r>
-      <w:proofErr w:type="spellEnd"/>
-      <w:r>
-        <w:t xml:space="preserve"> ;</w:t>
-      </w:r>
-      <w:proofErr w:type="gramEnd"/>
+      <w:r>
+        <w:t>mobilité ;</w:t>
+      </w:r>
     </w:p>
     <w:p>
       <w:pPr>
         <w:pStyle w:val="ListBullet"/>
         <w:spacing w:after="40"/>
       </w:pPr>
-      <w:proofErr w:type="spellStart"/>
-      <w:proofErr w:type="gramStart"/>
-      <w:r>
-        <w:t>sommeil</w:t>
-      </w:r>
-      <w:proofErr w:type="spellEnd"/>
-      <w:r>
-        <w:t xml:space="preserve"> ;</w:t>
-      </w:r>
-      <w:proofErr w:type="gramEnd"/>
+      <w:r>
+        <w:t>sommeil ;</w:t>
+      </w:r>
     </w:p>
     <w:p>
       <w:pPr>
@@ -3513,53 +2642,26 @@
         <w:spacing w:after="40"/>
       </w:pPr>
       <w:r>
-        <w:t xml:space="preserve">transit et </w:t>
-      </w:r>
-      <w:proofErr w:type="spellStart"/>
-      <w:proofErr w:type="gramStart"/>
-      <w:r>
-        <w:t>diurèse</w:t>
-      </w:r>
-      <w:proofErr w:type="spellEnd"/>
-      <w:r>
-        <w:t xml:space="preserve"> ;</w:t>
-      </w:r>
-      <w:proofErr w:type="gramEnd"/>
+        <w:t>transit et diurèse ;</w:t>
+      </w:r>
     </w:p>
     <w:p>
       <w:pPr>
         <w:pStyle w:val="ListBullet"/>
         <w:spacing w:after="40"/>
       </w:pPr>
-      <w:proofErr w:type="gramStart"/>
       <w:r>
         <w:t>fatigue ;</w:t>
       </w:r>
-      <w:proofErr w:type="gramEnd"/>
     </w:p>
     <w:p>
       <w:pPr>
         <w:pStyle w:val="ListBullet"/>
         <w:spacing w:after="40"/>
       </w:pPr>
-      <w:proofErr w:type="spellStart"/>
-      <w:r>
-        <w:t>capacités</w:t>
-      </w:r>
-      <w:proofErr w:type="spellEnd"/>
-      <w:r>
-        <w:t xml:space="preserve"> </w:t>
-      </w:r>
-      <w:proofErr w:type="spellStart"/>
-      <w:proofErr w:type="gramStart"/>
-      <w:r>
-        <w:t>fonctionnelles</w:t>
-      </w:r>
-      <w:proofErr w:type="spellEnd"/>
-      <w:r>
-        <w:t xml:space="preserve"> ;</w:t>
-      </w:r>
-      <w:proofErr w:type="gramEnd"/>
+      <w:r>
+        <w:t>capacités fonctionnelles ;</w:t>
+      </w:r>
     </w:p>
     <w:p>
       <w:pPr>
@@ -3569,20 +2671,12 @@
           <w:lang w:val="fr-FR"/>
         </w:rPr>
       </w:pPr>
-      <w:proofErr w:type="gramStart"/>
       <w:r>
         <w:rPr>
           <w:lang w:val="fr-FR"/>
         </w:rPr>
         <w:lastRenderedPageBreak/>
-        <w:t>durée</w:t>
-      </w:r>
-      <w:proofErr w:type="gramEnd"/>
-      <w:r>
-        <w:rPr>
-          <w:lang w:val="fr-FR"/>
-        </w:rPr>
-        <w:t xml:space="preserve"> et cinétique de la récupération.</w:t>
+        <w:t>durée et cinétique de la récupération.</w:t>
       </w:r>
     </w:p>
     <w:p>
@@ -3620,50 +2714,8 @@
         <w:t xml:space="preserve">Ce troisième volume ne présente pas seulement une nouvelle série de cartographies viscérales. </w:t>
       </w:r>
       <w:r>
-        <w:t xml:space="preserve">Il propose </w:t>
-      </w:r>
-      <w:proofErr w:type="spellStart"/>
-      <w:r>
-        <w:t>une</w:t>
-      </w:r>
-      <w:proofErr w:type="spellEnd"/>
-      <w:r>
-        <w:t xml:space="preserve"> lecture </w:t>
-      </w:r>
-      <w:proofErr w:type="spellStart"/>
-      <w:r>
-        <w:t>clinique</w:t>
-      </w:r>
-      <w:proofErr w:type="spellEnd"/>
-      <w:r>
-        <w:t xml:space="preserve"> </w:t>
-      </w:r>
-      <w:proofErr w:type="spellStart"/>
-      <w:r>
-        <w:t>organisée</w:t>
-      </w:r>
-      <w:proofErr w:type="spellEnd"/>
-      <w:r>
-        <w:t xml:space="preserve"> </w:t>
-      </w:r>
-      <w:proofErr w:type="spellStart"/>
-      <w:r>
-        <w:t>selon</w:t>
-      </w:r>
-      <w:proofErr w:type="spellEnd"/>
-      <w:r>
-        <w:t xml:space="preserve"> quatre </w:t>
-      </w:r>
-      <w:proofErr w:type="spellStart"/>
-      <w:proofErr w:type="gramStart"/>
-      <w:r>
-        <w:t>niveaux</w:t>
-      </w:r>
-      <w:proofErr w:type="spellEnd"/>
-      <w:r>
-        <w:t xml:space="preserve"> :</w:t>
-      </w:r>
-      <w:proofErr w:type="gramEnd"/>
+        <w:t>Il propose une lecture clinique organisée selon quatre niveaux :</w:t>
+      </w:r>
     </w:p>
     <w:p>
       <w:pPr>
@@ -3673,19 +2725,11 @@
           <w:lang w:val="fr-FR"/>
         </w:rPr>
       </w:pPr>
-      <w:proofErr w:type="gramStart"/>
-      <w:r>
-        <w:rPr>
-          <w:lang w:val="fr-FR"/>
-        </w:rPr>
-        <w:t>le</w:t>
-      </w:r>
-      <w:proofErr w:type="gramEnd"/>
-      <w:r>
-        <w:rPr>
-          <w:lang w:val="fr-FR"/>
-        </w:rPr>
-        <w:t xml:space="preserve"> système nerveux central, premier niveau de régulation ;</w:t>
+      <w:r>
+        <w:rPr>
+          <w:lang w:val="fr-FR"/>
+        </w:rPr>
+        <w:t>le système nerveux central, premier niveau de régulation ;</w:t>
       </w:r>
     </w:p>
     <w:p>
@@ -3696,19 +2740,11 @@
           <w:lang w:val="fr-FR"/>
         </w:rPr>
       </w:pPr>
-      <w:proofErr w:type="gramStart"/>
-      <w:r>
-        <w:rPr>
-          <w:lang w:val="fr-FR"/>
-        </w:rPr>
-        <w:t>le</w:t>
-      </w:r>
-      <w:proofErr w:type="gramEnd"/>
-      <w:r>
-        <w:rPr>
-          <w:lang w:val="fr-FR"/>
-        </w:rPr>
-        <w:t xml:space="preserve"> système nerveux autonome, deuxième niveau de transmission et de modulation ;</w:t>
+      <w:r>
+        <w:rPr>
+          <w:lang w:val="fr-FR"/>
+        </w:rPr>
+        <w:t>le système nerveux autonome, deuxième niveau de transmission et de modulation ;</w:t>
       </w:r>
     </w:p>
     <w:p>
@@ -3719,19 +2755,11 @@
           <w:lang w:val="fr-FR"/>
         </w:rPr>
       </w:pPr>
-      <w:proofErr w:type="gramStart"/>
-      <w:r>
-        <w:rPr>
-          <w:lang w:val="fr-FR"/>
-        </w:rPr>
-        <w:t>les</w:t>
-      </w:r>
-      <w:proofErr w:type="gramEnd"/>
-      <w:r>
-        <w:rPr>
-          <w:lang w:val="fr-FR"/>
-        </w:rPr>
-        <w:t xml:space="preserve"> cavités et interfaces loco-régionales, troisième niveau ;</w:t>
+      <w:r>
+        <w:rPr>
+          <w:lang w:val="fr-FR"/>
+        </w:rPr>
+        <w:t>les cavités et interfaces loco-régionales, troisième niveau ;</w:t>
       </w:r>
     </w:p>
     <w:p>
@@ -3742,19 +2770,11 @@
           <w:lang w:val="fr-FR"/>
         </w:rPr>
       </w:pPr>
-      <w:proofErr w:type="gramStart"/>
-      <w:r>
-        <w:rPr>
-          <w:lang w:val="fr-FR"/>
-        </w:rPr>
-        <w:t>l’organe</w:t>
-      </w:r>
-      <w:proofErr w:type="gramEnd"/>
-      <w:r>
-        <w:rPr>
-          <w:lang w:val="fr-FR"/>
-        </w:rPr>
-        <w:t xml:space="preserve"> ou la fonction ciblés, quatrième niveau.</w:t>
+      <w:r>
+        <w:rPr>
+          <w:lang w:val="fr-FR"/>
+        </w:rPr>
+        <w:t>l’organe ou la fonction ciblés, quatrième niveau.</w:t>
       </w:r>
     </w:p>
     <w:p>
@@ -3878,21 +2898,12 @@
       <w:pStyle w:val="Footer"/>
       <w:jc w:val="center"/>
     </w:pPr>
-    <w:proofErr w:type="spellStart"/>
     <w:r>
       <w:rPr>
         <w:color w:val="6F8F89"/>
         <w:sz w:val="16"/>
       </w:rPr>
-      <w:t>Chapitre</w:t>
-    </w:r>
-    <w:proofErr w:type="spellEnd"/>
-    <w:r>
-      <w:rPr>
-        <w:color w:val="6F8F89"/>
-        <w:sz w:val="16"/>
-      </w:rPr>
-      <w:t xml:space="preserve"> 0 — Introduction | Réflexothérapie occipito-podale</w:t>
+      <w:t>Chapitre 0 — Introduction | Réflexothérapie occipito-podale</w:t>
     </w:r>
   </w:p>
 </w:ftr>
@@ -4737,6 +3748,7 @@
   <w:style w:type="character" w:default="1" w:styleId="DefaultParagraphFont">
     <w:name w:val="Default Paragraph Font"/>
     <w:uiPriority w:val="1"/>
+    <w:semiHidden/>
     <w:unhideWhenUsed/>
   </w:style>
   <w:style w:type="table" w:default="1" w:styleId="TableNormal">

</xml_diff>